<commit_message>
refactor document templates for improved formatting and consistency
</commit_message>
<xml_diff>
--- a/Approche de gestion.docx
+++ b/Approche de gestion.docx
@@ -10,1801 +10,6 @@
           <w:sz w:val="56"/>
         </w:rPr>
       </w:pPr>
-      <w:r>
-        <w:rPr>
-          <w:rFonts w:ascii="Times New Roman"/>
-          <w:noProof/>
-          <w:sz w:val="56"/>
-        </w:rPr>
-        <mc:AlternateContent>
-          <mc:Choice Requires="wpg">
-            <w:drawing>
-              <wp:anchor distT="0" distB="0" distL="0" distR="0" simplePos="0" relativeHeight="251656704" behindDoc="1" locked="0" layoutInCell="1" allowOverlap="1" wp14:anchorId="2FF66A64" wp14:editId="228872AC">
-                <wp:simplePos x="0" y="0"/>
-                <wp:positionH relativeFrom="page">
-                  <wp:posOffset>82397</wp:posOffset>
-                </wp:positionH>
-                <wp:positionV relativeFrom="page">
-                  <wp:posOffset>3810</wp:posOffset>
-                </wp:positionV>
-                <wp:extent cx="7573645" cy="5399405"/>
-                <wp:effectExtent l="0" t="0" r="0" b="0"/>
-                <wp:wrapNone/>
-                <wp:docPr id="2" name="Group 2"/>
-                <wp:cNvGraphicFramePr>
-                  <a:graphicFrameLocks xmlns:a="http://schemas.openxmlformats.org/drawingml/2006/main"/>
-                </wp:cNvGraphicFramePr>
-                <a:graphic xmlns:a="http://schemas.openxmlformats.org/drawingml/2006/main">
-                  <a:graphicData uri="http://schemas.microsoft.com/office/word/2010/wordprocessingGroup">
-                    <wpg:wgp>
-                      <wpg:cNvGrpSpPr>
-                        <a:grpSpLocks/>
-                      </wpg:cNvGrpSpPr>
-                      <wpg:grpSpPr>
-                        <a:xfrm>
-                          <a:off x="0" y="0"/>
-                          <a:ext cx="7573645" cy="5399405"/>
-                          <a:chOff x="0" y="0"/>
-                          <a:chExt cx="7573645" cy="5399405"/>
-                        </a:xfrm>
-                      </wpg:grpSpPr>
-                      <wps:wsp>
-                        <wps:cNvPr id="3" name="Graphic 3"/>
-                        <wps:cNvSpPr/>
-                        <wps:spPr>
-                          <a:xfrm>
-                            <a:off x="6344" y="19046"/>
-                            <a:ext cx="6115050" cy="3800475"/>
-                          </a:xfrm>
-                          <a:custGeom>
-                            <a:avLst/>
-                            <a:gdLst/>
-                            <a:ahLst/>
-                            <a:cxnLst/>
-                            <a:rect l="l" t="t" r="r" b="b"/>
-                            <a:pathLst>
-                              <a:path w="6115050" h="3800475">
-                                <a:moveTo>
-                                  <a:pt x="6114643" y="0"/>
-                                </a:moveTo>
-                                <a:lnTo>
-                                  <a:pt x="4796218" y="0"/>
-                                </a:lnTo>
-                                <a:lnTo>
-                                  <a:pt x="0" y="2980944"/>
-                                </a:lnTo>
-                                <a:lnTo>
-                                  <a:pt x="0" y="3800386"/>
-                                </a:lnTo>
-                                <a:lnTo>
-                                  <a:pt x="6114643" y="0"/>
-                                </a:lnTo>
-                                <a:close/>
-                              </a:path>
-                            </a:pathLst>
-                          </a:custGeom>
-                          <a:solidFill>
-                            <a:srgbClr val="FF0000"/>
-                          </a:solidFill>
-                        </wps:spPr>
-                        <wps:bodyPr wrap="square" lIns="0" tIns="0" rIns="0" bIns="0" rtlCol="0">
-                          <a:prstTxWarp prst="textNoShape">
-                            <a:avLst/>
-                          </a:prstTxWarp>
-                          <a:noAutofit/>
-                        </wps:bodyPr>
-                      </wps:wsp>
-                      <wps:wsp>
-                        <wps:cNvPr id="4" name="Graphic 4"/>
-                        <wps:cNvSpPr/>
-                        <wps:spPr>
-                          <a:xfrm>
-                            <a:off x="6344" y="19046"/>
-                            <a:ext cx="7350125" cy="4568190"/>
-                          </a:xfrm>
-                          <a:custGeom>
-                            <a:avLst/>
-                            <a:gdLst/>
-                            <a:ahLst/>
-                            <a:cxnLst/>
-                            <a:rect l="l" t="t" r="r" b="b"/>
-                            <a:pathLst>
-                              <a:path w="7350125" h="4568190">
-                                <a:moveTo>
-                                  <a:pt x="7349845" y="0"/>
-                                </a:moveTo>
-                                <a:lnTo>
-                                  <a:pt x="6031420" y="0"/>
-                                </a:lnTo>
-                                <a:lnTo>
-                                  <a:pt x="0" y="3748659"/>
-                                </a:lnTo>
-                                <a:lnTo>
-                                  <a:pt x="0" y="4568088"/>
-                                </a:lnTo>
-                                <a:lnTo>
-                                  <a:pt x="7349845" y="0"/>
-                                </a:lnTo>
-                                <a:close/>
-                              </a:path>
-                            </a:pathLst>
-                          </a:custGeom>
-                          <a:solidFill>
-                            <a:srgbClr val="F8CAAC"/>
-                          </a:solidFill>
-                        </wps:spPr>
-                        <wps:bodyPr wrap="square" lIns="0" tIns="0" rIns="0" bIns="0" rtlCol="0">
-                          <a:prstTxWarp prst="textNoShape">
-                            <a:avLst/>
-                          </a:prstTxWarp>
-                          <a:noAutofit/>
-                        </wps:bodyPr>
-                      </wps:wsp>
-                      <wps:wsp>
-                        <wps:cNvPr id="5" name="Graphic 5"/>
-                        <wps:cNvSpPr/>
-                        <wps:spPr>
-                          <a:xfrm>
-                            <a:off x="6347" y="19046"/>
-                            <a:ext cx="7560945" cy="5374005"/>
-                          </a:xfrm>
-                          <a:custGeom>
-                            <a:avLst/>
-                            <a:gdLst/>
-                            <a:ahLst/>
-                            <a:cxnLst/>
-                            <a:rect l="l" t="t" r="r" b="b"/>
-                            <a:pathLst>
-                              <a:path w="7560945" h="5374005">
-                                <a:moveTo>
-                                  <a:pt x="7560576" y="0"/>
-                                </a:moveTo>
-                                <a:lnTo>
-                                  <a:pt x="7327938" y="0"/>
-                                </a:lnTo>
-                                <a:lnTo>
-                                  <a:pt x="0" y="4554474"/>
-                                </a:lnTo>
-                                <a:lnTo>
-                                  <a:pt x="0" y="5373903"/>
-                                </a:lnTo>
-                                <a:lnTo>
-                                  <a:pt x="7560576" y="674839"/>
-                                </a:lnTo>
-                                <a:lnTo>
-                                  <a:pt x="7560576" y="0"/>
-                                </a:lnTo>
-                                <a:close/>
-                              </a:path>
-                            </a:pathLst>
-                          </a:custGeom>
-                          <a:solidFill>
-                            <a:srgbClr val="F8CAAC">
-                              <a:alpha val="32156"/>
-                            </a:srgbClr>
-                          </a:solidFill>
-                        </wps:spPr>
-                        <wps:bodyPr wrap="square" lIns="0" tIns="0" rIns="0" bIns="0" rtlCol="0">
-                          <a:prstTxWarp prst="textNoShape">
-                            <a:avLst/>
-                          </a:prstTxWarp>
-                          <a:noAutofit/>
-                        </wps:bodyPr>
-                      </wps:wsp>
-                      <wps:wsp>
-                        <wps:cNvPr id="6" name="Graphic 6"/>
-                        <wps:cNvSpPr/>
-                        <wps:spPr>
-                          <a:xfrm>
-                            <a:off x="6350" y="19050"/>
-                            <a:ext cx="7560945" cy="5374005"/>
-                          </a:xfrm>
-                          <a:custGeom>
-                            <a:avLst/>
-                            <a:gdLst/>
-                            <a:ahLst/>
-                            <a:cxnLst/>
-                            <a:rect l="l" t="t" r="r" b="b"/>
-                            <a:pathLst>
-                              <a:path w="7560945" h="5374005">
-                                <a:moveTo>
-                                  <a:pt x="0" y="4554468"/>
-                                </a:moveTo>
-                                <a:lnTo>
-                                  <a:pt x="7327933" y="0"/>
-                                </a:lnTo>
-                              </a:path>
-                              <a:path w="7560945" h="5374005">
-                                <a:moveTo>
-                                  <a:pt x="7560564" y="674841"/>
-                                </a:moveTo>
-                                <a:lnTo>
-                                  <a:pt x="0" y="5373894"/>
-                                </a:lnTo>
-                              </a:path>
-                            </a:pathLst>
-                          </a:custGeom>
-                          <a:ln w="12700">
-                            <a:solidFill>
-                              <a:srgbClr val="FF0000"/>
-                            </a:solidFill>
-                            <a:prstDash val="solid"/>
-                          </a:ln>
-                        </wps:spPr>
-                        <wps:bodyPr wrap="square" lIns="0" tIns="0" rIns="0" bIns="0" rtlCol="0">
-                          <a:prstTxWarp prst="textNoShape">
-                            <a:avLst/>
-                          </a:prstTxWarp>
-                          <a:noAutofit/>
-                        </wps:bodyPr>
-                      </wps:wsp>
-                      <wps:wsp>
-                        <wps:cNvPr id="7" name="Graphic 7"/>
-                        <wps:cNvSpPr/>
-                        <wps:spPr>
-                          <a:xfrm>
-                            <a:off x="2515871" y="19050"/>
-                            <a:ext cx="5051425" cy="3192145"/>
-                          </a:xfrm>
-                          <a:custGeom>
-                            <a:avLst/>
-                            <a:gdLst/>
-                            <a:ahLst/>
-                            <a:cxnLst/>
-                            <a:rect l="l" t="t" r="r" b="b"/>
-                            <a:pathLst>
-                              <a:path w="5051425" h="3192145">
-                                <a:moveTo>
-                                  <a:pt x="4997868" y="0"/>
-                                </a:moveTo>
-                                <a:lnTo>
-                                  <a:pt x="101181" y="0"/>
-                                </a:lnTo>
-                                <a:lnTo>
-                                  <a:pt x="99534" y="5399"/>
-                                </a:lnTo>
-                                <a:lnTo>
-                                  <a:pt x="86974" y="49536"/>
-                                </a:lnTo>
-                                <a:lnTo>
-                                  <a:pt x="75226" y="93998"/>
-                                </a:lnTo>
-                                <a:lnTo>
-                                  <a:pt x="64296" y="138776"/>
-                                </a:lnTo>
-                                <a:lnTo>
-                                  <a:pt x="54192" y="183862"/>
-                                </a:lnTo>
-                                <a:lnTo>
-                                  <a:pt x="44925" y="229250"/>
-                                </a:lnTo>
-                                <a:lnTo>
-                                  <a:pt x="36500" y="274929"/>
-                                </a:lnTo>
-                                <a:lnTo>
-                                  <a:pt x="28928" y="320893"/>
-                                </a:lnTo>
-                                <a:lnTo>
-                                  <a:pt x="22215" y="367133"/>
-                                </a:lnTo>
-                                <a:lnTo>
-                                  <a:pt x="16371" y="413641"/>
-                                </a:lnTo>
-                                <a:lnTo>
-                                  <a:pt x="11403" y="460409"/>
-                                </a:lnTo>
-                                <a:lnTo>
-                                  <a:pt x="7320" y="507429"/>
-                                </a:lnTo>
-                                <a:lnTo>
-                                  <a:pt x="4129" y="554692"/>
-                                </a:lnTo>
-                                <a:lnTo>
-                                  <a:pt x="1841" y="602192"/>
-                                </a:lnTo>
-                                <a:lnTo>
-                                  <a:pt x="461" y="649920"/>
-                                </a:lnTo>
-                                <a:lnTo>
-                                  <a:pt x="0" y="697867"/>
-                                </a:lnTo>
-                                <a:lnTo>
-                                  <a:pt x="461" y="745814"/>
-                                </a:lnTo>
-                                <a:lnTo>
-                                  <a:pt x="1841" y="793541"/>
-                                </a:lnTo>
-                                <a:lnTo>
-                                  <a:pt x="4129" y="841041"/>
-                                </a:lnTo>
-                                <a:lnTo>
-                                  <a:pt x="7320" y="888305"/>
-                                </a:lnTo>
-                                <a:lnTo>
-                                  <a:pt x="11403" y="935325"/>
-                                </a:lnTo>
-                                <a:lnTo>
-                                  <a:pt x="16371" y="982093"/>
-                                </a:lnTo>
-                                <a:lnTo>
-                                  <a:pt x="22215" y="1028601"/>
-                                </a:lnTo>
-                                <a:lnTo>
-                                  <a:pt x="28928" y="1074841"/>
-                                </a:lnTo>
-                                <a:lnTo>
-                                  <a:pt x="36500" y="1120805"/>
-                                </a:lnTo>
-                                <a:lnTo>
-                                  <a:pt x="44925" y="1166484"/>
-                                </a:lnTo>
-                                <a:lnTo>
-                                  <a:pt x="54192" y="1211871"/>
-                                </a:lnTo>
-                                <a:lnTo>
-                                  <a:pt x="64296" y="1256958"/>
-                                </a:lnTo>
-                                <a:lnTo>
-                                  <a:pt x="75226" y="1301736"/>
-                                </a:lnTo>
-                                <a:lnTo>
-                                  <a:pt x="86974" y="1346198"/>
-                                </a:lnTo>
-                                <a:lnTo>
-                                  <a:pt x="99534" y="1390335"/>
-                                </a:lnTo>
-                                <a:lnTo>
-                                  <a:pt x="112895" y="1434139"/>
-                                </a:lnTo>
-                                <a:lnTo>
-                                  <a:pt x="127051" y="1477602"/>
-                                </a:lnTo>
-                                <a:lnTo>
-                                  <a:pt x="141992" y="1520717"/>
-                                </a:lnTo>
-                                <a:lnTo>
-                                  <a:pt x="157710" y="1563475"/>
-                                </a:lnTo>
-                                <a:lnTo>
-                                  <a:pt x="174198" y="1605868"/>
-                                </a:lnTo>
-                                <a:lnTo>
-                                  <a:pt x="191447" y="1647887"/>
-                                </a:lnTo>
-                                <a:lnTo>
-                                  <a:pt x="209448" y="1689526"/>
-                                </a:lnTo>
-                                <a:lnTo>
-                                  <a:pt x="228194" y="1730775"/>
-                                </a:lnTo>
-                                <a:lnTo>
-                                  <a:pt x="247677" y="1771627"/>
-                                </a:lnTo>
-                                <a:lnTo>
-                                  <a:pt x="267887" y="1812074"/>
-                                </a:lnTo>
-                                <a:lnTo>
-                                  <a:pt x="288816" y="1852107"/>
-                                </a:lnTo>
-                                <a:lnTo>
-                                  <a:pt x="310458" y="1891718"/>
-                                </a:lnTo>
-                                <a:lnTo>
-                                  <a:pt x="332802" y="1930901"/>
-                                </a:lnTo>
-                                <a:lnTo>
-                                  <a:pt x="355841" y="1969645"/>
-                                </a:lnTo>
-                                <a:lnTo>
-                                  <a:pt x="379567" y="2007944"/>
-                                </a:lnTo>
-                                <a:lnTo>
-                                  <a:pt x="403972" y="2045788"/>
-                                </a:lnTo>
-                                <a:lnTo>
-                                  <a:pt x="429046" y="2083171"/>
-                                </a:lnTo>
-                                <a:lnTo>
-                                  <a:pt x="454783" y="2120084"/>
-                                </a:lnTo>
-                                <a:lnTo>
-                                  <a:pt x="481173" y="2156519"/>
-                                </a:lnTo>
-                                <a:lnTo>
-                                  <a:pt x="508209" y="2192468"/>
-                                </a:lnTo>
-                                <a:lnTo>
-                                  <a:pt x="535882" y="2227923"/>
-                                </a:lnTo>
-                                <a:lnTo>
-                                  <a:pt x="564183" y="2262875"/>
-                                </a:lnTo>
-                                <a:lnTo>
-                                  <a:pt x="593106" y="2297317"/>
-                                </a:lnTo>
-                                <a:lnTo>
-                                  <a:pt x="622641" y="2331241"/>
-                                </a:lnTo>
-                                <a:lnTo>
-                                  <a:pt x="652780" y="2364638"/>
-                                </a:lnTo>
-                                <a:lnTo>
-                                  <a:pt x="683514" y="2397501"/>
-                                </a:lnTo>
-                                <a:lnTo>
-                                  <a:pt x="714837" y="2429821"/>
-                                </a:lnTo>
-                                <a:lnTo>
-                                  <a:pt x="746739" y="2461590"/>
-                                </a:lnTo>
-                                <a:lnTo>
-                                  <a:pt x="779212" y="2492801"/>
-                                </a:lnTo>
-                                <a:lnTo>
-                                  <a:pt x="812248" y="2523445"/>
-                                </a:lnTo>
-                                <a:lnTo>
-                                  <a:pt x="845838" y="2553514"/>
-                                </a:lnTo>
-                                <a:lnTo>
-                                  <a:pt x="879975" y="2582999"/>
-                                </a:lnTo>
-                                <a:lnTo>
-                                  <a:pt x="914650" y="2611894"/>
-                                </a:lnTo>
-                                <a:lnTo>
-                                  <a:pt x="949855" y="2640190"/>
-                                </a:lnTo>
-                                <a:lnTo>
-                                  <a:pt x="985582" y="2667878"/>
-                                </a:lnTo>
-                                <a:lnTo>
-                                  <a:pt x="1021822" y="2694951"/>
-                                </a:lnTo>
-                                <a:lnTo>
-                                  <a:pt x="1058567" y="2721401"/>
-                                </a:lnTo>
-                                <a:lnTo>
-                                  <a:pt x="1095809" y="2747219"/>
-                                </a:lnTo>
-                                <a:lnTo>
-                                  <a:pt x="1133540" y="2772398"/>
-                                </a:lnTo>
-                                <a:lnTo>
-                                  <a:pt x="1171751" y="2796929"/>
-                                </a:lnTo>
-                                <a:lnTo>
-                                  <a:pt x="1210434" y="2820805"/>
-                                </a:lnTo>
-                                <a:lnTo>
-                                  <a:pt x="1249581" y="2844017"/>
-                                </a:lnTo>
-                                <a:lnTo>
-                                  <a:pt x="1289183" y="2866557"/>
-                                </a:lnTo>
-                                <a:lnTo>
-                                  <a:pt x="1329233" y="2888417"/>
-                                </a:lnTo>
-                                <a:lnTo>
-                                  <a:pt x="1369722" y="2909589"/>
-                                </a:lnTo>
-                                <a:lnTo>
-                                  <a:pt x="1410642" y="2930065"/>
-                                </a:lnTo>
-                                <a:lnTo>
-                                  <a:pt x="1451984" y="2949838"/>
-                                </a:lnTo>
-                                <a:lnTo>
-                                  <a:pt x="1493741" y="2968898"/>
-                                </a:lnTo>
-                                <a:lnTo>
-                                  <a:pt x="1535904" y="2987237"/>
-                                </a:lnTo>
-                                <a:lnTo>
-                                  <a:pt x="1578465" y="3004849"/>
-                                </a:lnTo>
-                                <a:lnTo>
-                                  <a:pt x="1621415" y="3021724"/>
-                                </a:lnTo>
-                                <a:lnTo>
-                                  <a:pt x="1664747" y="3037854"/>
-                                </a:lnTo>
-                                <a:lnTo>
-                                  <a:pt x="1708451" y="3053232"/>
-                                </a:lnTo>
-                                <a:lnTo>
-                                  <a:pt x="1752521" y="3067849"/>
-                                </a:lnTo>
-                                <a:lnTo>
-                                  <a:pt x="1796947" y="3081698"/>
-                                </a:lnTo>
-                                <a:lnTo>
-                                  <a:pt x="1841721" y="3094770"/>
-                                </a:lnTo>
-                                <a:lnTo>
-                                  <a:pt x="1886836" y="3107057"/>
-                                </a:lnTo>
-                                <a:lnTo>
-                                  <a:pt x="1932282" y="3118551"/>
-                                </a:lnTo>
-                                <a:lnTo>
-                                  <a:pt x="1978052" y="3129244"/>
-                                </a:lnTo>
-                                <a:lnTo>
-                                  <a:pt x="2024137" y="3139128"/>
-                                </a:lnTo>
-                                <a:lnTo>
-                                  <a:pt x="2070530" y="3148195"/>
-                                </a:lnTo>
-                                <a:lnTo>
-                                  <a:pt x="2117221" y="3156437"/>
-                                </a:lnTo>
-                                <a:lnTo>
-                                  <a:pt x="2164202" y="3163846"/>
-                                </a:lnTo>
-                                <a:lnTo>
-                                  <a:pt x="2211466" y="3170413"/>
-                                </a:lnTo>
-                                <a:lnTo>
-                                  <a:pt x="2259004" y="3176131"/>
-                                </a:lnTo>
-                                <a:lnTo>
-                                  <a:pt x="2306808" y="3180991"/>
-                                </a:lnTo>
-                                <a:lnTo>
-                                  <a:pt x="2354869" y="3184985"/>
-                                </a:lnTo>
-                                <a:lnTo>
-                                  <a:pt x="2403180" y="3188106"/>
-                                </a:lnTo>
-                                <a:lnTo>
-                                  <a:pt x="2451731" y="3190346"/>
-                                </a:lnTo>
-                                <a:lnTo>
-                                  <a:pt x="2500516" y="3191695"/>
-                                </a:lnTo>
-                                <a:lnTo>
-                                  <a:pt x="2549525" y="3192147"/>
-                                </a:lnTo>
-                                <a:lnTo>
-                                  <a:pt x="2598533" y="3191695"/>
-                                </a:lnTo>
-                                <a:lnTo>
-                                  <a:pt x="2647318" y="3190346"/>
-                                </a:lnTo>
-                                <a:lnTo>
-                                  <a:pt x="2695869" y="3188106"/>
-                                </a:lnTo>
-                                <a:lnTo>
-                                  <a:pt x="2744180" y="3184985"/>
-                                </a:lnTo>
-                                <a:lnTo>
-                                  <a:pt x="2792241" y="3180991"/>
-                                </a:lnTo>
-                                <a:lnTo>
-                                  <a:pt x="2840045" y="3176131"/>
-                                </a:lnTo>
-                                <a:lnTo>
-                                  <a:pt x="2887583" y="3170413"/>
-                                </a:lnTo>
-                                <a:lnTo>
-                                  <a:pt x="2934847" y="3163846"/>
-                                </a:lnTo>
-                                <a:lnTo>
-                                  <a:pt x="2981828" y="3156437"/>
-                                </a:lnTo>
-                                <a:lnTo>
-                                  <a:pt x="3028519" y="3148195"/>
-                                </a:lnTo>
-                                <a:lnTo>
-                                  <a:pt x="3074912" y="3139128"/>
-                                </a:lnTo>
-                                <a:lnTo>
-                                  <a:pt x="3120997" y="3129244"/>
-                                </a:lnTo>
-                                <a:lnTo>
-                                  <a:pt x="3166767" y="3118551"/>
-                                </a:lnTo>
-                                <a:lnTo>
-                                  <a:pt x="3212213" y="3107057"/>
-                                </a:lnTo>
-                                <a:lnTo>
-                                  <a:pt x="3257328" y="3094770"/>
-                                </a:lnTo>
-                                <a:lnTo>
-                                  <a:pt x="3302102" y="3081698"/>
-                                </a:lnTo>
-                                <a:lnTo>
-                                  <a:pt x="3346528" y="3067849"/>
-                                </a:lnTo>
-                                <a:lnTo>
-                                  <a:pt x="3390598" y="3053232"/>
-                                </a:lnTo>
-                                <a:lnTo>
-                                  <a:pt x="3434302" y="3037854"/>
-                                </a:lnTo>
-                                <a:lnTo>
-                                  <a:pt x="3477634" y="3021724"/>
-                                </a:lnTo>
-                                <a:lnTo>
-                                  <a:pt x="3520584" y="3004849"/>
-                                </a:lnTo>
-                                <a:lnTo>
-                                  <a:pt x="3563145" y="2987237"/>
-                                </a:lnTo>
-                                <a:lnTo>
-                                  <a:pt x="3605308" y="2968898"/>
-                                </a:lnTo>
-                                <a:lnTo>
-                                  <a:pt x="3647065" y="2949838"/>
-                                </a:lnTo>
-                                <a:lnTo>
-                                  <a:pt x="3688407" y="2930065"/>
-                                </a:lnTo>
-                                <a:lnTo>
-                                  <a:pt x="3729327" y="2909589"/>
-                                </a:lnTo>
-                                <a:lnTo>
-                                  <a:pt x="3769816" y="2888417"/>
-                                </a:lnTo>
-                                <a:lnTo>
-                                  <a:pt x="3809866" y="2866557"/>
-                                </a:lnTo>
-                                <a:lnTo>
-                                  <a:pt x="3849468" y="2844017"/>
-                                </a:lnTo>
-                                <a:lnTo>
-                                  <a:pt x="3888615" y="2820805"/>
-                                </a:lnTo>
-                                <a:lnTo>
-                                  <a:pt x="3927298" y="2796929"/>
-                                </a:lnTo>
-                                <a:lnTo>
-                                  <a:pt x="3965509" y="2772398"/>
-                                </a:lnTo>
-                                <a:lnTo>
-                                  <a:pt x="4003240" y="2747219"/>
-                                </a:lnTo>
-                                <a:lnTo>
-                                  <a:pt x="4040482" y="2721401"/>
-                                </a:lnTo>
-                                <a:lnTo>
-                                  <a:pt x="4077227" y="2694951"/>
-                                </a:lnTo>
-                                <a:lnTo>
-                                  <a:pt x="4113467" y="2667878"/>
-                                </a:lnTo>
-                                <a:lnTo>
-                                  <a:pt x="4149194" y="2640190"/>
-                                </a:lnTo>
-                                <a:lnTo>
-                                  <a:pt x="4184399" y="2611894"/>
-                                </a:lnTo>
-                                <a:lnTo>
-                                  <a:pt x="4219074" y="2582999"/>
-                                </a:lnTo>
-                                <a:lnTo>
-                                  <a:pt x="4253211" y="2553514"/>
-                                </a:lnTo>
-                                <a:lnTo>
-                                  <a:pt x="4286801" y="2523445"/>
-                                </a:lnTo>
-                                <a:lnTo>
-                                  <a:pt x="4319837" y="2492801"/>
-                                </a:lnTo>
-                                <a:lnTo>
-                                  <a:pt x="4352310" y="2461590"/>
-                                </a:lnTo>
-                                <a:lnTo>
-                                  <a:pt x="4384212" y="2429821"/>
-                                </a:lnTo>
-                                <a:lnTo>
-                                  <a:pt x="4415535" y="2397501"/>
-                                </a:lnTo>
-                                <a:lnTo>
-                                  <a:pt x="4446269" y="2364638"/>
-                                </a:lnTo>
-                                <a:lnTo>
-                                  <a:pt x="4476408" y="2331241"/>
-                                </a:lnTo>
-                                <a:lnTo>
-                                  <a:pt x="4505943" y="2297317"/>
-                                </a:lnTo>
-                                <a:lnTo>
-                                  <a:pt x="4534866" y="2262875"/>
-                                </a:lnTo>
-                                <a:lnTo>
-                                  <a:pt x="4563167" y="2227923"/>
-                                </a:lnTo>
-                                <a:lnTo>
-                                  <a:pt x="4590840" y="2192468"/>
-                                </a:lnTo>
-                                <a:lnTo>
-                                  <a:pt x="4617876" y="2156519"/>
-                                </a:lnTo>
-                                <a:lnTo>
-                                  <a:pt x="4644266" y="2120084"/>
-                                </a:lnTo>
-                                <a:lnTo>
-                                  <a:pt x="4670003" y="2083171"/>
-                                </a:lnTo>
-                                <a:lnTo>
-                                  <a:pt x="4695077" y="2045788"/>
-                                </a:lnTo>
-                                <a:lnTo>
-                                  <a:pt x="4719482" y="2007944"/>
-                                </a:lnTo>
-                                <a:lnTo>
-                                  <a:pt x="4743208" y="1969645"/>
-                                </a:lnTo>
-                                <a:lnTo>
-                                  <a:pt x="4766247" y="1930901"/>
-                                </a:lnTo>
-                                <a:lnTo>
-                                  <a:pt x="4788591" y="1891718"/>
-                                </a:lnTo>
-                                <a:lnTo>
-                                  <a:pt x="4810233" y="1852107"/>
-                                </a:lnTo>
-                                <a:lnTo>
-                                  <a:pt x="4831162" y="1812074"/>
-                                </a:lnTo>
-                                <a:lnTo>
-                                  <a:pt x="4851372" y="1771627"/>
-                                </a:lnTo>
-                                <a:lnTo>
-                                  <a:pt x="4870855" y="1730775"/>
-                                </a:lnTo>
-                                <a:lnTo>
-                                  <a:pt x="4889601" y="1689526"/>
-                                </a:lnTo>
-                                <a:lnTo>
-                                  <a:pt x="4907602" y="1647887"/>
-                                </a:lnTo>
-                                <a:lnTo>
-                                  <a:pt x="4924851" y="1605868"/>
-                                </a:lnTo>
-                                <a:lnTo>
-                                  <a:pt x="4941339" y="1563475"/>
-                                </a:lnTo>
-                                <a:lnTo>
-                                  <a:pt x="4957057" y="1520717"/>
-                                </a:lnTo>
-                                <a:lnTo>
-                                  <a:pt x="4971998" y="1477602"/>
-                                </a:lnTo>
-                                <a:lnTo>
-                                  <a:pt x="4986154" y="1434139"/>
-                                </a:lnTo>
-                                <a:lnTo>
-                                  <a:pt x="4999515" y="1390335"/>
-                                </a:lnTo>
-                                <a:lnTo>
-                                  <a:pt x="5012075" y="1346198"/>
-                                </a:lnTo>
-                                <a:lnTo>
-                                  <a:pt x="5023823" y="1301736"/>
-                                </a:lnTo>
-                                <a:lnTo>
-                                  <a:pt x="5034753" y="1256958"/>
-                                </a:lnTo>
-                                <a:lnTo>
-                                  <a:pt x="5044857" y="1211871"/>
-                                </a:lnTo>
-                                <a:lnTo>
-                                  <a:pt x="5051042" y="1181578"/>
-                                </a:lnTo>
-                                <a:lnTo>
-                                  <a:pt x="5051042" y="214156"/>
-                                </a:lnTo>
-                                <a:lnTo>
-                                  <a:pt x="5034753" y="138776"/>
-                                </a:lnTo>
-                                <a:lnTo>
-                                  <a:pt x="5023823" y="93998"/>
-                                </a:lnTo>
-                                <a:lnTo>
-                                  <a:pt x="5012075" y="49536"/>
-                                </a:lnTo>
-                                <a:lnTo>
-                                  <a:pt x="4999515" y="5399"/>
-                                </a:lnTo>
-                                <a:lnTo>
-                                  <a:pt x="4997868" y="0"/>
-                                </a:lnTo>
-                                <a:close/>
-                              </a:path>
-                            </a:pathLst>
-                          </a:custGeom>
-                          <a:solidFill>
-                            <a:srgbClr val="FF0000"/>
-                          </a:solidFill>
-                        </wps:spPr>
-                        <wps:bodyPr wrap="square" lIns="0" tIns="0" rIns="0" bIns="0" rtlCol="0">
-                          <a:prstTxWarp prst="textNoShape">
-                            <a:avLst/>
-                          </a:prstTxWarp>
-                          <a:noAutofit/>
-                        </wps:bodyPr>
-                      </wps:wsp>
-                      <wps:wsp>
-                        <wps:cNvPr id="8" name="Graphic 8"/>
-                        <wps:cNvSpPr/>
-                        <wps:spPr>
-                          <a:xfrm>
-                            <a:off x="3675381" y="19050"/>
-                            <a:ext cx="2929890" cy="2274570"/>
-                          </a:xfrm>
-                          <a:custGeom>
-                            <a:avLst/>
-                            <a:gdLst/>
-                            <a:ahLst/>
-                            <a:cxnLst/>
-                            <a:rect l="l" t="t" r="r" b="b"/>
-                            <a:pathLst>
-                              <a:path w="2929890" h="2274570">
-                                <a:moveTo>
-                                  <a:pt x="2689409" y="0"/>
-                                </a:moveTo>
-                                <a:lnTo>
-                                  <a:pt x="240480" y="0"/>
-                                </a:lnTo>
-                                <a:lnTo>
-                                  <a:pt x="231552" y="13468"/>
-                                </a:lnTo>
-                                <a:lnTo>
-                                  <a:pt x="207700" y="51974"/>
-                                </a:lnTo>
-                                <a:lnTo>
-                                  <a:pt x="185013" y="91260"/>
-                                </a:lnTo>
-                                <a:lnTo>
-                                  <a:pt x="163514" y="131301"/>
-                                </a:lnTo>
-                                <a:lnTo>
-                                  <a:pt x="143227" y="172073"/>
-                                </a:lnTo>
-                                <a:lnTo>
-                                  <a:pt x="124176" y="213553"/>
-                                </a:lnTo>
-                                <a:lnTo>
-                                  <a:pt x="106386" y="255716"/>
-                                </a:lnTo>
-                                <a:lnTo>
-                                  <a:pt x="89880" y="298537"/>
-                                </a:lnTo>
-                                <a:lnTo>
-                                  <a:pt x="74683" y="341993"/>
-                                </a:lnTo>
-                                <a:lnTo>
-                                  <a:pt x="60819" y="386059"/>
-                                </a:lnTo>
-                                <a:lnTo>
-                                  <a:pt x="48312" y="430712"/>
-                                </a:lnTo>
-                                <a:lnTo>
-                                  <a:pt x="37186" y="475926"/>
-                                </a:lnTo>
-                                <a:lnTo>
-                                  <a:pt x="27465" y="521679"/>
-                                </a:lnTo>
-                                <a:lnTo>
-                                  <a:pt x="19173" y="567945"/>
-                                </a:lnTo>
-                                <a:lnTo>
-                                  <a:pt x="12335" y="614700"/>
-                                </a:lnTo>
-                                <a:lnTo>
-                                  <a:pt x="6974" y="661921"/>
-                                </a:lnTo>
-                                <a:lnTo>
-                                  <a:pt x="3116" y="709583"/>
-                                </a:lnTo>
-                                <a:lnTo>
-                                  <a:pt x="783" y="757662"/>
-                                </a:lnTo>
-                                <a:lnTo>
-                                  <a:pt x="0" y="806133"/>
-                                </a:lnTo>
-                                <a:lnTo>
-                                  <a:pt x="783" y="854605"/>
-                                </a:lnTo>
-                                <a:lnTo>
-                                  <a:pt x="3116" y="902683"/>
-                                </a:lnTo>
-                                <a:lnTo>
-                                  <a:pt x="6974" y="950345"/>
-                                </a:lnTo>
-                                <a:lnTo>
-                                  <a:pt x="12335" y="997566"/>
-                                </a:lnTo>
-                                <a:lnTo>
-                                  <a:pt x="19173" y="1044321"/>
-                                </a:lnTo>
-                                <a:lnTo>
-                                  <a:pt x="27465" y="1090588"/>
-                                </a:lnTo>
-                                <a:lnTo>
-                                  <a:pt x="37186" y="1136340"/>
-                                </a:lnTo>
-                                <a:lnTo>
-                                  <a:pt x="48312" y="1181554"/>
-                                </a:lnTo>
-                                <a:lnTo>
-                                  <a:pt x="60819" y="1226207"/>
-                                </a:lnTo>
-                                <a:lnTo>
-                                  <a:pt x="74683" y="1270273"/>
-                                </a:lnTo>
-                                <a:lnTo>
-                                  <a:pt x="89880" y="1313729"/>
-                                </a:lnTo>
-                                <a:lnTo>
-                                  <a:pt x="106386" y="1356550"/>
-                                </a:lnTo>
-                                <a:lnTo>
-                                  <a:pt x="124176" y="1398713"/>
-                                </a:lnTo>
-                                <a:lnTo>
-                                  <a:pt x="143227" y="1440193"/>
-                                </a:lnTo>
-                                <a:lnTo>
-                                  <a:pt x="163514" y="1480965"/>
-                                </a:lnTo>
-                                <a:lnTo>
-                                  <a:pt x="185013" y="1521006"/>
-                                </a:lnTo>
-                                <a:lnTo>
-                                  <a:pt x="207700" y="1560292"/>
-                                </a:lnTo>
-                                <a:lnTo>
-                                  <a:pt x="231552" y="1598798"/>
-                                </a:lnTo>
-                                <a:lnTo>
-                                  <a:pt x="256543" y="1636500"/>
-                                </a:lnTo>
-                                <a:lnTo>
-                                  <a:pt x="282649" y="1673374"/>
-                                </a:lnTo>
-                                <a:lnTo>
-                                  <a:pt x="309847" y="1709395"/>
-                                </a:lnTo>
-                                <a:lnTo>
-                                  <a:pt x="338113" y="1744540"/>
-                                </a:lnTo>
-                                <a:lnTo>
-                                  <a:pt x="367421" y="1778785"/>
-                                </a:lnTo>
-                                <a:lnTo>
-                                  <a:pt x="397749" y="1812105"/>
-                                </a:lnTo>
-                                <a:lnTo>
-                                  <a:pt x="429072" y="1844476"/>
-                                </a:lnTo>
-                                <a:lnTo>
-                                  <a:pt x="461366" y="1875873"/>
-                                </a:lnTo>
-                                <a:lnTo>
-                                  <a:pt x="494606" y="1906273"/>
-                                </a:lnTo>
-                                <a:lnTo>
-                                  <a:pt x="528770" y="1935652"/>
-                                </a:lnTo>
-                                <a:lnTo>
-                                  <a:pt x="563831" y="1963985"/>
-                                </a:lnTo>
-                                <a:lnTo>
-                                  <a:pt x="599767" y="1991248"/>
-                                </a:lnTo>
-                                <a:lnTo>
-                                  <a:pt x="636553" y="2017416"/>
-                                </a:lnTo>
-                                <a:lnTo>
-                                  <a:pt x="674166" y="2042467"/>
-                                </a:lnTo>
-                                <a:lnTo>
-                                  <a:pt x="712580" y="2066375"/>
-                                </a:lnTo>
-                                <a:lnTo>
-                                  <a:pt x="751772" y="2089116"/>
-                                </a:lnTo>
-                                <a:lnTo>
-                                  <a:pt x="791718" y="2110666"/>
-                                </a:lnTo>
-                                <a:lnTo>
-                                  <a:pt x="832394" y="2131002"/>
-                                </a:lnTo>
-                                <a:lnTo>
-                                  <a:pt x="873775" y="2150098"/>
-                                </a:lnTo>
-                                <a:lnTo>
-                                  <a:pt x="915837" y="2167930"/>
-                                </a:lnTo>
-                                <a:lnTo>
-                                  <a:pt x="958556" y="2184476"/>
-                                </a:lnTo>
-                                <a:lnTo>
-                                  <a:pt x="1001909" y="2199709"/>
-                                </a:lnTo>
-                                <a:lnTo>
-                                  <a:pt x="1045870" y="2213606"/>
-                                </a:lnTo>
-                                <a:lnTo>
-                                  <a:pt x="1090417" y="2226143"/>
-                                </a:lnTo>
-                                <a:lnTo>
-                                  <a:pt x="1135524" y="2237296"/>
-                                </a:lnTo>
-                                <a:lnTo>
-                                  <a:pt x="1181167" y="2247040"/>
-                                </a:lnTo>
-                                <a:lnTo>
-                                  <a:pt x="1227323" y="2255351"/>
-                                </a:lnTo>
-                                <a:lnTo>
-                                  <a:pt x="1273967" y="2262206"/>
-                                </a:lnTo>
-                                <a:lnTo>
-                                  <a:pt x="1321076" y="2267579"/>
-                                </a:lnTo>
-                                <a:lnTo>
-                                  <a:pt x="1368624" y="2271447"/>
-                                </a:lnTo>
-                                <a:lnTo>
-                                  <a:pt x="1416588" y="2273786"/>
-                                </a:lnTo>
-                                <a:lnTo>
-                                  <a:pt x="1464944" y="2274571"/>
-                                </a:lnTo>
-                                <a:lnTo>
-                                  <a:pt x="1513301" y="2273786"/>
-                                </a:lnTo>
-                                <a:lnTo>
-                                  <a:pt x="1561265" y="2271447"/>
-                                </a:lnTo>
-                                <a:lnTo>
-                                  <a:pt x="1608813" y="2267579"/>
-                                </a:lnTo>
-                                <a:lnTo>
-                                  <a:pt x="1655922" y="2262206"/>
-                                </a:lnTo>
-                                <a:lnTo>
-                                  <a:pt x="1702566" y="2255351"/>
-                                </a:lnTo>
-                                <a:lnTo>
-                                  <a:pt x="1748722" y="2247040"/>
-                                </a:lnTo>
-                                <a:lnTo>
-                                  <a:pt x="1794365" y="2237296"/>
-                                </a:lnTo>
-                                <a:lnTo>
-                                  <a:pt x="1839472" y="2226143"/>
-                                </a:lnTo>
-                                <a:lnTo>
-                                  <a:pt x="1884019" y="2213606"/>
-                                </a:lnTo>
-                                <a:lnTo>
-                                  <a:pt x="1927980" y="2199709"/>
-                                </a:lnTo>
-                                <a:lnTo>
-                                  <a:pt x="1971333" y="2184476"/>
-                                </a:lnTo>
-                                <a:lnTo>
-                                  <a:pt x="2014052" y="2167930"/>
-                                </a:lnTo>
-                                <a:lnTo>
-                                  <a:pt x="2056114" y="2150098"/>
-                                </a:lnTo>
-                                <a:lnTo>
-                                  <a:pt x="2097495" y="2131002"/>
-                                </a:lnTo>
-                                <a:lnTo>
-                                  <a:pt x="2138171" y="2110666"/>
-                                </a:lnTo>
-                                <a:lnTo>
-                                  <a:pt x="2178117" y="2089116"/>
-                                </a:lnTo>
-                                <a:lnTo>
-                                  <a:pt x="2217309" y="2066375"/>
-                                </a:lnTo>
-                                <a:lnTo>
-                                  <a:pt x="2255723" y="2042467"/>
-                                </a:lnTo>
-                                <a:lnTo>
-                                  <a:pt x="2293336" y="2017416"/>
-                                </a:lnTo>
-                                <a:lnTo>
-                                  <a:pt x="2330122" y="1991248"/>
-                                </a:lnTo>
-                                <a:lnTo>
-                                  <a:pt x="2366058" y="1963985"/>
-                                </a:lnTo>
-                                <a:lnTo>
-                                  <a:pt x="2401119" y="1935652"/>
-                                </a:lnTo>
-                                <a:lnTo>
-                                  <a:pt x="2435283" y="1906273"/>
-                                </a:lnTo>
-                                <a:lnTo>
-                                  <a:pt x="2468523" y="1875873"/>
-                                </a:lnTo>
-                                <a:lnTo>
-                                  <a:pt x="2500817" y="1844476"/>
-                                </a:lnTo>
-                                <a:lnTo>
-                                  <a:pt x="2532140" y="1812105"/>
-                                </a:lnTo>
-                                <a:lnTo>
-                                  <a:pt x="2562468" y="1778785"/>
-                                </a:lnTo>
-                                <a:lnTo>
-                                  <a:pt x="2591776" y="1744540"/>
-                                </a:lnTo>
-                                <a:lnTo>
-                                  <a:pt x="2620042" y="1709395"/>
-                                </a:lnTo>
-                                <a:lnTo>
-                                  <a:pt x="2647240" y="1673374"/>
-                                </a:lnTo>
-                                <a:lnTo>
-                                  <a:pt x="2673346" y="1636500"/>
-                                </a:lnTo>
-                                <a:lnTo>
-                                  <a:pt x="2698337" y="1598798"/>
-                                </a:lnTo>
-                                <a:lnTo>
-                                  <a:pt x="2722189" y="1560292"/>
-                                </a:lnTo>
-                                <a:lnTo>
-                                  <a:pt x="2744876" y="1521006"/>
-                                </a:lnTo>
-                                <a:lnTo>
-                                  <a:pt x="2766375" y="1480965"/>
-                                </a:lnTo>
-                                <a:lnTo>
-                                  <a:pt x="2786662" y="1440193"/>
-                                </a:lnTo>
-                                <a:lnTo>
-                                  <a:pt x="2805713" y="1398713"/>
-                                </a:lnTo>
-                                <a:lnTo>
-                                  <a:pt x="2823503" y="1356550"/>
-                                </a:lnTo>
-                                <a:lnTo>
-                                  <a:pt x="2840009" y="1313729"/>
-                                </a:lnTo>
-                                <a:lnTo>
-                                  <a:pt x="2855206" y="1270273"/>
-                                </a:lnTo>
-                                <a:lnTo>
-                                  <a:pt x="2869070" y="1226207"/>
-                                </a:lnTo>
-                                <a:lnTo>
-                                  <a:pt x="2881577" y="1181554"/>
-                                </a:lnTo>
-                                <a:lnTo>
-                                  <a:pt x="2892703" y="1136340"/>
-                                </a:lnTo>
-                                <a:lnTo>
-                                  <a:pt x="2902424" y="1090588"/>
-                                </a:lnTo>
-                                <a:lnTo>
-                                  <a:pt x="2910716" y="1044321"/>
-                                </a:lnTo>
-                                <a:lnTo>
-                                  <a:pt x="2917554" y="997566"/>
-                                </a:lnTo>
-                                <a:lnTo>
-                                  <a:pt x="2922915" y="950345"/>
-                                </a:lnTo>
-                                <a:lnTo>
-                                  <a:pt x="2926773" y="902683"/>
-                                </a:lnTo>
-                                <a:lnTo>
-                                  <a:pt x="2929106" y="854605"/>
-                                </a:lnTo>
-                                <a:lnTo>
-                                  <a:pt x="2929890" y="806133"/>
-                                </a:lnTo>
-                                <a:lnTo>
-                                  <a:pt x="2929106" y="757662"/>
-                                </a:lnTo>
-                                <a:lnTo>
-                                  <a:pt x="2926773" y="709583"/>
-                                </a:lnTo>
-                                <a:lnTo>
-                                  <a:pt x="2922915" y="661921"/>
-                                </a:lnTo>
-                                <a:lnTo>
-                                  <a:pt x="2917554" y="614700"/>
-                                </a:lnTo>
-                                <a:lnTo>
-                                  <a:pt x="2910716" y="567945"/>
-                                </a:lnTo>
-                                <a:lnTo>
-                                  <a:pt x="2902424" y="521679"/>
-                                </a:lnTo>
-                                <a:lnTo>
-                                  <a:pt x="2892703" y="475926"/>
-                                </a:lnTo>
-                                <a:lnTo>
-                                  <a:pt x="2881577" y="430712"/>
-                                </a:lnTo>
-                                <a:lnTo>
-                                  <a:pt x="2869070" y="386059"/>
-                                </a:lnTo>
-                                <a:lnTo>
-                                  <a:pt x="2855206" y="341993"/>
-                                </a:lnTo>
-                                <a:lnTo>
-                                  <a:pt x="2840009" y="298537"/>
-                                </a:lnTo>
-                                <a:lnTo>
-                                  <a:pt x="2823503" y="255716"/>
-                                </a:lnTo>
-                                <a:lnTo>
-                                  <a:pt x="2805713" y="213553"/>
-                                </a:lnTo>
-                                <a:lnTo>
-                                  <a:pt x="2786662" y="172073"/>
-                                </a:lnTo>
-                                <a:lnTo>
-                                  <a:pt x="2766375" y="131301"/>
-                                </a:lnTo>
-                                <a:lnTo>
-                                  <a:pt x="2744876" y="91260"/>
-                                </a:lnTo>
-                                <a:lnTo>
-                                  <a:pt x="2722189" y="51974"/>
-                                </a:lnTo>
-                                <a:lnTo>
-                                  <a:pt x="2698337" y="13468"/>
-                                </a:lnTo>
-                                <a:lnTo>
-                                  <a:pt x="2689409" y="0"/>
-                                </a:lnTo>
-                                <a:close/>
-                              </a:path>
-                            </a:pathLst>
-                          </a:custGeom>
-                          <a:solidFill>
-                            <a:srgbClr val="FFFFFF"/>
-                          </a:solidFill>
-                        </wps:spPr>
-                        <wps:bodyPr wrap="square" lIns="0" tIns="0" rIns="0" bIns="0" rtlCol="0">
-                          <a:prstTxWarp prst="textNoShape">
-                            <a:avLst/>
-                          </a:prstTxWarp>
-                          <a:noAutofit/>
-                        </wps:bodyPr>
-                      </wps:wsp>
-                      <wps:wsp>
-                        <wps:cNvPr id="9" name="Graphic 9"/>
-                        <wps:cNvSpPr/>
-                        <wps:spPr>
-                          <a:xfrm>
-                            <a:off x="3675381" y="19050"/>
-                            <a:ext cx="2929890" cy="2274570"/>
-                          </a:xfrm>
-                          <a:custGeom>
-                            <a:avLst/>
-                            <a:gdLst/>
-                            <a:ahLst/>
-                            <a:cxnLst/>
-                            <a:rect l="l" t="t" r="r" b="b"/>
-                            <a:pathLst>
-                              <a:path w="2929890" h="2274570">
-                                <a:moveTo>
-                                  <a:pt x="2689409" y="0"/>
-                                </a:moveTo>
-                                <a:lnTo>
-                                  <a:pt x="2722189" y="51974"/>
-                                </a:lnTo>
-                                <a:lnTo>
-                                  <a:pt x="2744876" y="91260"/>
-                                </a:lnTo>
-                                <a:lnTo>
-                                  <a:pt x="2766375" y="131301"/>
-                                </a:lnTo>
-                                <a:lnTo>
-                                  <a:pt x="2786662" y="172073"/>
-                                </a:lnTo>
-                                <a:lnTo>
-                                  <a:pt x="2805713" y="213553"/>
-                                </a:lnTo>
-                                <a:lnTo>
-                                  <a:pt x="2823503" y="255716"/>
-                                </a:lnTo>
-                                <a:lnTo>
-                                  <a:pt x="2840009" y="298537"/>
-                                </a:lnTo>
-                                <a:lnTo>
-                                  <a:pt x="2855206" y="341993"/>
-                                </a:lnTo>
-                                <a:lnTo>
-                                  <a:pt x="2869070" y="386059"/>
-                                </a:lnTo>
-                                <a:lnTo>
-                                  <a:pt x="2881577" y="430712"/>
-                                </a:lnTo>
-                                <a:lnTo>
-                                  <a:pt x="2892703" y="475926"/>
-                                </a:lnTo>
-                                <a:lnTo>
-                                  <a:pt x="2902424" y="521679"/>
-                                </a:lnTo>
-                                <a:lnTo>
-                                  <a:pt x="2910716" y="567945"/>
-                                </a:lnTo>
-                                <a:lnTo>
-                                  <a:pt x="2917554" y="614700"/>
-                                </a:lnTo>
-                                <a:lnTo>
-                                  <a:pt x="2922915" y="661921"/>
-                                </a:lnTo>
-                                <a:lnTo>
-                                  <a:pt x="2926773" y="709583"/>
-                                </a:lnTo>
-                                <a:lnTo>
-                                  <a:pt x="2929106" y="757662"/>
-                                </a:lnTo>
-                                <a:lnTo>
-                                  <a:pt x="2929890" y="806133"/>
-                                </a:lnTo>
-                                <a:lnTo>
-                                  <a:pt x="2929106" y="854605"/>
-                                </a:lnTo>
-                                <a:lnTo>
-                                  <a:pt x="2926773" y="902683"/>
-                                </a:lnTo>
-                                <a:lnTo>
-                                  <a:pt x="2922915" y="950345"/>
-                                </a:lnTo>
-                                <a:lnTo>
-                                  <a:pt x="2917554" y="997566"/>
-                                </a:lnTo>
-                                <a:lnTo>
-                                  <a:pt x="2910716" y="1044321"/>
-                                </a:lnTo>
-                                <a:lnTo>
-                                  <a:pt x="2902424" y="1090588"/>
-                                </a:lnTo>
-                                <a:lnTo>
-                                  <a:pt x="2892703" y="1136340"/>
-                                </a:lnTo>
-                                <a:lnTo>
-                                  <a:pt x="2881577" y="1181554"/>
-                                </a:lnTo>
-                                <a:lnTo>
-                                  <a:pt x="2869070" y="1226207"/>
-                                </a:lnTo>
-                                <a:lnTo>
-                                  <a:pt x="2855206" y="1270273"/>
-                                </a:lnTo>
-                                <a:lnTo>
-                                  <a:pt x="2840009" y="1313729"/>
-                                </a:lnTo>
-                                <a:lnTo>
-                                  <a:pt x="2823503" y="1356550"/>
-                                </a:lnTo>
-                                <a:lnTo>
-                                  <a:pt x="2805713" y="1398713"/>
-                                </a:lnTo>
-                                <a:lnTo>
-                                  <a:pt x="2786662" y="1440193"/>
-                                </a:lnTo>
-                                <a:lnTo>
-                                  <a:pt x="2766375" y="1480965"/>
-                                </a:lnTo>
-                                <a:lnTo>
-                                  <a:pt x="2744876" y="1521006"/>
-                                </a:lnTo>
-                                <a:lnTo>
-                                  <a:pt x="2722189" y="1560292"/>
-                                </a:lnTo>
-                                <a:lnTo>
-                                  <a:pt x="2698337" y="1598798"/>
-                                </a:lnTo>
-                                <a:lnTo>
-                                  <a:pt x="2673346" y="1636500"/>
-                                </a:lnTo>
-                                <a:lnTo>
-                                  <a:pt x="2647240" y="1673374"/>
-                                </a:lnTo>
-                                <a:lnTo>
-                                  <a:pt x="2620042" y="1709395"/>
-                                </a:lnTo>
-                                <a:lnTo>
-                                  <a:pt x="2591776" y="1744540"/>
-                                </a:lnTo>
-                                <a:lnTo>
-                                  <a:pt x="2562468" y="1778785"/>
-                                </a:lnTo>
-                                <a:lnTo>
-                                  <a:pt x="2532140" y="1812105"/>
-                                </a:lnTo>
-                                <a:lnTo>
-                                  <a:pt x="2500817" y="1844476"/>
-                                </a:lnTo>
-                                <a:lnTo>
-                                  <a:pt x="2468523" y="1875873"/>
-                                </a:lnTo>
-                                <a:lnTo>
-                                  <a:pt x="2435283" y="1906273"/>
-                                </a:lnTo>
-                                <a:lnTo>
-                                  <a:pt x="2401119" y="1935652"/>
-                                </a:lnTo>
-                                <a:lnTo>
-                                  <a:pt x="2366058" y="1963985"/>
-                                </a:lnTo>
-                                <a:lnTo>
-                                  <a:pt x="2330122" y="1991248"/>
-                                </a:lnTo>
-                                <a:lnTo>
-                                  <a:pt x="2293336" y="2017416"/>
-                                </a:lnTo>
-                                <a:lnTo>
-                                  <a:pt x="2255723" y="2042467"/>
-                                </a:lnTo>
-                                <a:lnTo>
-                                  <a:pt x="2217309" y="2066375"/>
-                                </a:lnTo>
-                                <a:lnTo>
-                                  <a:pt x="2178117" y="2089116"/>
-                                </a:lnTo>
-                                <a:lnTo>
-                                  <a:pt x="2138171" y="2110666"/>
-                                </a:lnTo>
-                                <a:lnTo>
-                                  <a:pt x="2097495" y="2131002"/>
-                                </a:lnTo>
-                                <a:lnTo>
-                                  <a:pt x="2056114" y="2150098"/>
-                                </a:lnTo>
-                                <a:lnTo>
-                                  <a:pt x="2014052" y="2167930"/>
-                                </a:lnTo>
-                                <a:lnTo>
-                                  <a:pt x="1971333" y="2184476"/>
-                                </a:lnTo>
-                                <a:lnTo>
-                                  <a:pt x="1927980" y="2199709"/>
-                                </a:lnTo>
-                                <a:lnTo>
-                                  <a:pt x="1884019" y="2213606"/>
-                                </a:lnTo>
-                                <a:lnTo>
-                                  <a:pt x="1839472" y="2226143"/>
-                                </a:lnTo>
-                                <a:lnTo>
-                                  <a:pt x="1794365" y="2237296"/>
-                                </a:lnTo>
-                                <a:lnTo>
-                                  <a:pt x="1748722" y="2247040"/>
-                                </a:lnTo>
-                                <a:lnTo>
-                                  <a:pt x="1702566" y="2255351"/>
-                                </a:lnTo>
-                                <a:lnTo>
-                                  <a:pt x="1655922" y="2262206"/>
-                                </a:lnTo>
-                                <a:lnTo>
-                                  <a:pt x="1608813" y="2267579"/>
-                                </a:lnTo>
-                                <a:lnTo>
-                                  <a:pt x="1561265" y="2271447"/>
-                                </a:lnTo>
-                                <a:lnTo>
-                                  <a:pt x="1513301" y="2273786"/>
-                                </a:lnTo>
-                                <a:lnTo>
-                                  <a:pt x="1464944" y="2274571"/>
-                                </a:lnTo>
-                                <a:lnTo>
-                                  <a:pt x="1416588" y="2273786"/>
-                                </a:lnTo>
-                                <a:lnTo>
-                                  <a:pt x="1368624" y="2271447"/>
-                                </a:lnTo>
-                                <a:lnTo>
-                                  <a:pt x="1321076" y="2267579"/>
-                                </a:lnTo>
-                                <a:lnTo>
-                                  <a:pt x="1273967" y="2262206"/>
-                                </a:lnTo>
-                                <a:lnTo>
-                                  <a:pt x="1227323" y="2255351"/>
-                                </a:lnTo>
-                                <a:lnTo>
-                                  <a:pt x="1181167" y="2247040"/>
-                                </a:lnTo>
-                                <a:lnTo>
-                                  <a:pt x="1135524" y="2237296"/>
-                                </a:lnTo>
-                                <a:lnTo>
-                                  <a:pt x="1090417" y="2226143"/>
-                                </a:lnTo>
-                                <a:lnTo>
-                                  <a:pt x="1045870" y="2213606"/>
-                                </a:lnTo>
-                                <a:lnTo>
-                                  <a:pt x="1001909" y="2199709"/>
-                                </a:lnTo>
-                                <a:lnTo>
-                                  <a:pt x="958556" y="2184476"/>
-                                </a:lnTo>
-                                <a:lnTo>
-                                  <a:pt x="915837" y="2167930"/>
-                                </a:lnTo>
-                                <a:lnTo>
-                                  <a:pt x="873775" y="2150098"/>
-                                </a:lnTo>
-                                <a:lnTo>
-                                  <a:pt x="832394" y="2131002"/>
-                                </a:lnTo>
-                                <a:lnTo>
-                                  <a:pt x="791718" y="2110666"/>
-                                </a:lnTo>
-                                <a:lnTo>
-                                  <a:pt x="751772" y="2089116"/>
-                                </a:lnTo>
-                                <a:lnTo>
-                                  <a:pt x="712580" y="2066375"/>
-                                </a:lnTo>
-                                <a:lnTo>
-                                  <a:pt x="674166" y="2042467"/>
-                                </a:lnTo>
-                                <a:lnTo>
-                                  <a:pt x="636553" y="2017416"/>
-                                </a:lnTo>
-                                <a:lnTo>
-                                  <a:pt x="599767" y="1991248"/>
-                                </a:lnTo>
-                                <a:lnTo>
-                                  <a:pt x="563831" y="1963985"/>
-                                </a:lnTo>
-                                <a:lnTo>
-                                  <a:pt x="528770" y="1935652"/>
-                                </a:lnTo>
-                                <a:lnTo>
-                                  <a:pt x="494606" y="1906273"/>
-                                </a:lnTo>
-                                <a:lnTo>
-                                  <a:pt x="461366" y="1875873"/>
-                                </a:lnTo>
-                                <a:lnTo>
-                                  <a:pt x="429072" y="1844476"/>
-                                </a:lnTo>
-                                <a:lnTo>
-                                  <a:pt x="397749" y="1812105"/>
-                                </a:lnTo>
-                                <a:lnTo>
-                                  <a:pt x="367421" y="1778785"/>
-                                </a:lnTo>
-                                <a:lnTo>
-                                  <a:pt x="338113" y="1744540"/>
-                                </a:lnTo>
-                                <a:lnTo>
-                                  <a:pt x="309847" y="1709395"/>
-                                </a:lnTo>
-                                <a:lnTo>
-                                  <a:pt x="282649" y="1673374"/>
-                                </a:lnTo>
-                                <a:lnTo>
-                                  <a:pt x="256543" y="1636500"/>
-                                </a:lnTo>
-                                <a:lnTo>
-                                  <a:pt x="231552" y="1598798"/>
-                                </a:lnTo>
-                                <a:lnTo>
-                                  <a:pt x="207700" y="1560292"/>
-                                </a:lnTo>
-                                <a:lnTo>
-                                  <a:pt x="185013" y="1521006"/>
-                                </a:lnTo>
-                                <a:lnTo>
-                                  <a:pt x="163514" y="1480965"/>
-                                </a:lnTo>
-                                <a:lnTo>
-                                  <a:pt x="143227" y="1440193"/>
-                                </a:lnTo>
-                                <a:lnTo>
-                                  <a:pt x="124176" y="1398713"/>
-                                </a:lnTo>
-                                <a:lnTo>
-                                  <a:pt x="106386" y="1356550"/>
-                                </a:lnTo>
-                                <a:lnTo>
-                                  <a:pt x="89880" y="1313729"/>
-                                </a:lnTo>
-                                <a:lnTo>
-                                  <a:pt x="74683" y="1270273"/>
-                                </a:lnTo>
-                                <a:lnTo>
-                                  <a:pt x="60819" y="1226207"/>
-                                </a:lnTo>
-                                <a:lnTo>
-                                  <a:pt x="48312" y="1181554"/>
-                                </a:lnTo>
-                                <a:lnTo>
-                                  <a:pt x="37186" y="1136340"/>
-                                </a:lnTo>
-                                <a:lnTo>
-                                  <a:pt x="27465" y="1090588"/>
-                                </a:lnTo>
-                                <a:lnTo>
-                                  <a:pt x="19173" y="1044321"/>
-                                </a:lnTo>
-                                <a:lnTo>
-                                  <a:pt x="12335" y="997566"/>
-                                </a:lnTo>
-                                <a:lnTo>
-                                  <a:pt x="6974" y="950345"/>
-                                </a:lnTo>
-                                <a:lnTo>
-                                  <a:pt x="3116" y="902683"/>
-                                </a:lnTo>
-                                <a:lnTo>
-                                  <a:pt x="783" y="854605"/>
-                                </a:lnTo>
-                                <a:lnTo>
-                                  <a:pt x="0" y="806133"/>
-                                </a:lnTo>
-                                <a:lnTo>
-                                  <a:pt x="783" y="757662"/>
-                                </a:lnTo>
-                                <a:lnTo>
-                                  <a:pt x="3116" y="709583"/>
-                                </a:lnTo>
-                                <a:lnTo>
-                                  <a:pt x="6974" y="661921"/>
-                                </a:lnTo>
-                                <a:lnTo>
-                                  <a:pt x="12335" y="614700"/>
-                                </a:lnTo>
-                                <a:lnTo>
-                                  <a:pt x="19173" y="567945"/>
-                                </a:lnTo>
-                                <a:lnTo>
-                                  <a:pt x="27465" y="521679"/>
-                                </a:lnTo>
-                                <a:lnTo>
-                                  <a:pt x="37186" y="475926"/>
-                                </a:lnTo>
-                                <a:lnTo>
-                                  <a:pt x="48312" y="430712"/>
-                                </a:lnTo>
-                                <a:lnTo>
-                                  <a:pt x="60819" y="386059"/>
-                                </a:lnTo>
-                                <a:lnTo>
-                                  <a:pt x="74683" y="341993"/>
-                                </a:lnTo>
-                                <a:lnTo>
-                                  <a:pt x="89880" y="298537"/>
-                                </a:lnTo>
-                                <a:lnTo>
-                                  <a:pt x="106386" y="255716"/>
-                                </a:lnTo>
-                                <a:lnTo>
-                                  <a:pt x="124176" y="213553"/>
-                                </a:lnTo>
-                                <a:lnTo>
-                                  <a:pt x="143227" y="172073"/>
-                                </a:lnTo>
-                                <a:lnTo>
-                                  <a:pt x="163514" y="131301"/>
-                                </a:lnTo>
-                                <a:lnTo>
-                                  <a:pt x="185013" y="91260"/>
-                                </a:lnTo>
-                                <a:lnTo>
-                                  <a:pt x="207700" y="51974"/>
-                                </a:lnTo>
-                                <a:lnTo>
-                                  <a:pt x="231552" y="13468"/>
-                                </a:lnTo>
-                                <a:lnTo>
-                                  <a:pt x="240480" y="0"/>
-                                </a:lnTo>
-                              </a:path>
-                            </a:pathLst>
-                          </a:custGeom>
-                          <a:ln w="38100">
-                            <a:solidFill>
-                              <a:srgbClr val="F8CAAC"/>
-                            </a:solidFill>
-                            <a:prstDash val="solid"/>
-                          </a:ln>
-                        </wps:spPr>
-                        <wps:bodyPr wrap="square" lIns="0" tIns="0" rIns="0" bIns="0" rtlCol="0">
-                          <a:prstTxWarp prst="textNoShape">
-                            <a:avLst/>
-                          </a:prstTxWarp>
-                          <a:noAutofit/>
-                        </wps:bodyPr>
-                      </wps:wsp>
-                      <pic:pic xmlns:pic="http://schemas.openxmlformats.org/drawingml/2006/picture">
-                        <pic:nvPicPr>
-                          <pic:cNvPr id="10" name="Image 10"/>
-                          <pic:cNvPicPr/>
-                        </pic:nvPicPr>
-                        <pic:blipFill>
-                          <a:blip r:embed="rId8" cstate="print"/>
-                          <a:stretch>
-                            <a:fillRect/>
-                          </a:stretch>
-                        </pic:blipFill>
-                        <pic:spPr>
-                          <a:xfrm>
-                            <a:off x="4342131" y="49531"/>
-                            <a:ext cx="1531605" cy="1516378"/>
-                          </a:xfrm>
-                          <a:prstGeom prst="rect">
-                            <a:avLst/>
-                          </a:prstGeom>
-                        </pic:spPr>
-                      </pic:pic>
-                    </wpg:wgp>
-                  </a:graphicData>
-                </a:graphic>
-              </wp:anchor>
-            </w:drawing>
-          </mc:Choice>
-          <mc:Fallback>
-            <w:pict>
-              <v:group w14:anchorId="0EB4C47E" id="Group 2" o:spid="_x0000_s1026" style="position:absolute;margin-left:6.5pt;margin-top:.3pt;width:596.35pt;height:425.15pt;z-index:-251659776;mso-wrap-distance-left:0;mso-wrap-distance-right:0;mso-position-horizontal-relative:page;mso-position-vertical-relative:page" coordsize="75736,53994" o:gfxdata="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">
-                <v:shape id="Graphic 3" o:spid="_x0000_s1027" style="position:absolute;left:63;top:190;width:61150;height:38005;visibility:visible;mso-wrap-style:square;v-text-anchor:top" coordsize="6115050,3800475" o:gfxdata="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" path="m6114643,l4796218,,,2980944r,819442l6114643,xe" fillcolor="red" stroked="f">
-                  <v:path arrowok="t"/>
-                </v:shape>
-                <v:shape id="Graphic 4" o:spid="_x0000_s1028" style="position:absolute;left:63;top:190;width:73501;height:45682;visibility:visible;mso-wrap-style:square;v-text-anchor:top" coordsize="7350125,4568190" o:gfxdata="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" path="m7349845,l6031420,,,3748659r,819429l7349845,xe" fillcolor="#f8caac" stroked="f">
-                  <v:path arrowok="t"/>
-                </v:shape>
-                <v:shape id="Graphic 5" o:spid="_x0000_s1029" style="position:absolute;left:63;top:190;width:75609;height:53740;visibility:visible;mso-wrap-style:square;v-text-anchor:top" coordsize="7560945,5374005" o:gfxdata="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" path="m7560576,l7327938,,,4554474r,819429l7560576,674839,7560576,xe" fillcolor="#f8caac" stroked="f">
-                  <v:fill opacity="21074f"/>
-                  <v:path arrowok="t"/>
-                </v:shape>
-                <v:shape id="Graphic 6" o:spid="_x0000_s1030" style="position:absolute;left:63;top:190;width:75609;height:53740;visibility:visible;mso-wrap-style:square;v-text-anchor:top" coordsize="7560945,5374005" o:gfxdata="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" path="m,4554468l7327933,em7560564,674841l,5373894e" filled="f" strokecolor="red" strokeweight="1pt">
-                  <v:path arrowok="t"/>
-                </v:shape>
-                <v:shape id="Graphic 7" o:spid="_x0000_s1031" style="position:absolute;left:25158;top:190;width:50514;height:31921;visibility:visible;mso-wrap-style:square;v-text-anchor:top" coordsize="5051425,3192145" o:gfxdata="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" path="m4997868,l101181,,99534,5399,86974,49536,75226,93998,64296,138776,54192,183862r-9267,45388l36500,274929r-7572,45964l22215,367133r-5844,46508l11403,460409,7320,507429,4129,554692,1841,602192,461,649920,,697867r461,47947l1841,793541r2288,47500l7320,888305r4083,47020l16371,982093r5844,46508l28928,1074841r7572,45964l44925,1166484r9267,45387l64296,1256958r10930,44778l86974,1346198r12560,44137l112895,1434139r14156,43463l141992,1520717r15718,42758l174198,1605868r17249,42019l209448,1689526r18746,41249l247677,1771627r20210,40447l288816,1852107r21642,39611l332802,1930901r23039,38744l379567,2007944r24405,37844l429046,2083171r25737,36913l481173,2156519r27036,35949l535882,2227923r28301,34952l593106,2297317r29535,33924l652780,2364638r30734,32863l714837,2429821r31902,31769l779212,2492801r33036,30644l845838,2553514r34137,29485l914650,2611894r35205,28296l985582,2667878r36240,27073l1058567,2721401r37242,25818l1133540,2772398r38211,24531l1210434,2820805r39147,23212l1289183,2866557r40050,21860l1369722,2909589r40920,20476l1451984,2949838r41757,19060l1535904,2987237r42561,17612l1621415,3021724r43332,16130l1708451,3053232r44070,14617l1796947,3081698r44774,13072l1886836,3107057r45446,11494l1978052,3129244r46085,9884l2070530,3148195r46691,8242l2164202,3163846r47264,6567l2259004,3176131r47804,4860l2354869,3184985r48311,3121l2451731,3190346r48785,1349l2549525,3192147r49008,-452l2647318,3190346r48551,-2240l2744180,3184985r48061,-3994l2840045,3176131r47538,-5718l2934847,3163846r46981,-7409l3028519,3148195r46393,-9067l3120997,3129244r45770,-10693l3212213,3107057r45115,-12287l3302102,3081698r44426,-13849l3390598,3053232r43704,-15378l3477634,3021724r42950,-16875l3563145,2987237r42163,-18339l3647065,2949838r41342,-19773l3729327,2909589r40489,-21172l3809866,2866557r39602,-22540l3888615,2820805r38683,-23876l3965509,2772398r37731,-25179l4040482,2721401r36745,-26450l4113467,2667878r35727,-27688l4184399,2611894r34675,-28895l4253211,2553514r33590,-30069l4319837,2492801r32473,-31211l4384212,2429821r31323,-32320l4446269,2364638r30139,-33397l4505943,2297317r28923,-34442l4563167,2227923r27673,-35455l4617876,2156519r26390,-36435l4670003,2083171r25074,-37383l4719482,2007944r23726,-38299l4766247,1930901r22344,-39183l4810233,1852107r20929,-40033l4851372,1771627r19483,-40852l4889601,1689526r18001,-41639l4924851,1605868r16488,-42393l4957057,1520717r14941,-43115l4986154,1434139r13361,-43804l5012075,1346198r11748,-44462l5034753,1256958r10104,-45087l5051042,1181578r,-967422l5034753,138776,5023823,93998,5012075,49536,4999515,5399,4997868,xe" fillcolor="red" stroked="f">
-                  <v:path arrowok="t"/>
-                </v:shape>
-                <v:shape id="Graphic 8" o:spid="_x0000_s1032" style="position:absolute;left:36753;top:190;width:29299;height:22746;visibility:visible;mso-wrap-style:square;v-text-anchor:top" coordsize="2929890,2274570" o:gfxdata="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" path="m2689409,l240480,r-8928,13468l207700,51974,185013,91260r-21499,40041l143227,172073r-19051,41480l106386,255716,89880,298537,74683,341993,60819,386059,48312,430712,37186,475926r-9721,45753l19173,567945r-6838,46755l6974,661921,3116,709583,783,757662,,806133r783,48472l3116,902683r3858,47662l12335,997566r6838,46755l27465,1090588r9721,45752l48312,1181554r12507,44653l74683,1270273r15197,43456l106386,1356550r17790,42163l143227,1440193r20287,40772l185013,1521006r22687,39286l231552,1598798r24991,37702l282649,1673374r27198,36021l338113,1744540r29308,34245l397749,1812105r31323,32371l461366,1875873r33240,30400l528770,1935652r35061,28333l599767,1991248r36786,26168l674166,2042467r38414,23908l751772,2089116r39946,21550l832394,2131002r41381,19096l915837,2167930r42719,16546l1001909,2199709r43961,13897l1090417,2226143r45107,11153l1181167,2247040r46156,8311l1273967,2262206r47109,5373l1368624,2271447r47964,2339l1464944,2274571r48357,-785l1561265,2271447r47548,-3868l1655922,2262206r46644,-6855l1748722,2247040r45643,-9744l1839472,2226143r44547,-12537l1927980,2199709r43353,-15233l2014052,2167930r42062,-17832l2097495,2131002r40676,-20336l2178117,2089116r39192,-22741l2255723,2042467r37613,-25051l2330122,1991248r35936,-27263l2401119,1935652r34164,-29379l2468523,1875873r32294,-31397l2532140,1812105r30328,-33320l2591776,1744540r28266,-35145l2647240,1673374r26106,-36874l2698337,1598798r23852,-38506l2744876,1521006r21499,-40041l2786662,1440193r19051,-41480l2823503,1356550r16506,-42821l2855206,1270273r13864,-44066l2881577,1181554r11126,-45214l2902424,1090588r8292,-46267l2917554,997566r5361,-47221l2926773,902683r2333,-48078l2929890,806133r-784,-48471l2926773,709583r-3858,-47662l2917554,614700r-6838,-46755l2902424,521679r-9721,-45753l2881577,430712r-12507,-44653l2855206,341993r-15197,-43456l2823503,255716r-17790,-42163l2786662,172073r-20287,-40772l2744876,91260,2722189,51974,2698337,13468,2689409,xe" stroked="f">
-                  <v:path arrowok="t"/>
-                </v:shape>
-                <v:shape id="Graphic 9" o:spid="_x0000_s1033" style="position:absolute;left:36753;top:190;width:29299;height:22746;visibility:visible;mso-wrap-style:square;v-text-anchor:top" coordsize="2929890,2274570" o:gfxdata="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" path="m2689409,r32780,51974l2744876,91260r21499,40041l2786662,172073r19051,41480l2823503,255716r16506,42821l2855206,341993r13864,44066l2881577,430712r11126,45214l2902424,521679r8292,46266l2917554,614700r5361,47221l2926773,709583r2333,48079l2929890,806133r-784,48472l2926773,902683r-3858,47662l2917554,997566r-6838,46755l2902424,1090588r-9721,45752l2881577,1181554r-12507,44653l2855206,1270273r-15197,43456l2823503,1356550r-17790,42163l2786662,1440193r-20287,40772l2744876,1521006r-22687,39286l2698337,1598798r-24991,37702l2647240,1673374r-27198,36021l2591776,1744540r-29308,34245l2532140,1812105r-31323,32371l2468523,1875873r-33240,30400l2401119,1935652r-35061,28333l2330122,1991248r-36786,26168l2255723,2042467r-38414,23908l2178117,2089116r-39946,21550l2097495,2131002r-41381,19096l2014052,2167930r-42719,16546l1927980,2199709r-43961,13897l1839472,2226143r-45107,11153l1748722,2247040r-46156,8311l1655922,2262206r-47109,5373l1561265,2271447r-47964,2339l1464944,2274571r-48356,-785l1368624,2271447r-47548,-3868l1273967,2262206r-46644,-6855l1181167,2247040r-45643,-9744l1090417,2226143r-44547,-12537l1001909,2199709r-43353,-15233l915837,2167930r-42062,-17832l832394,2131002r-40676,-20336l751772,2089116r-39192,-22741l674166,2042467r-37613,-25051l599767,1991248r-35936,-27263l528770,1935652r-34164,-29379l461366,1875873r-32294,-31397l397749,1812105r-30328,-33320l338113,1744540r-28266,-35145l282649,1673374r-26106,-36874l231552,1598798r-23852,-38506l185013,1521006r-21499,-40041l143227,1440193r-19051,-41480l106386,1356550,89880,1313729,74683,1270273,60819,1226207,48312,1181554,37186,1136340r-9721,-45752l19173,1044321,12335,997566,6974,950345,3116,902683,783,854605,,806133,783,757662,3116,709583,6974,661921r5361,-47221l19173,567945r8292,-46266l37186,475926,48312,430712,60819,386059,74683,341993,89880,298537r16506,-42821l124176,213553r19051,-41480l163514,131301,185013,91260,207700,51974,231552,13468,240480,e" filled="f" strokecolor="#f8caac" strokeweight="3pt">
-                  <v:path arrowok="t"/>
-                </v:shape>
-                <v:shapetype id="_x0000_t75" coordsize="21600,21600" o:spt="75" o:preferrelative="t" path="m@4@5l@4@11@9@11@9@5xe" filled="f" stroked="f">
-                  <v:stroke joinstyle="miter"/>
-                  <v:formulas>
-                    <v:f eqn="if lineDrawn pixelLineWidth 0"/>
-                    <v:f eqn="sum @0 1 0"/>
-                    <v:f eqn="sum 0 0 @1"/>
-                    <v:f eqn="prod @2 1 2"/>
-                    <v:f eqn="prod @3 21600 pixelWidth"/>
-                    <v:f eqn="prod @3 21600 pixelHeight"/>
-                    <v:f eqn="sum @0 0 1"/>
-                    <v:f eqn="prod @6 1 2"/>
-                    <v:f eqn="prod @7 21600 pixelWidth"/>
-                    <v:f eqn="sum @8 21600 0"/>
-                    <v:f eqn="prod @7 21600 pixelHeight"/>
-                    <v:f eqn="sum @10 21600 0"/>
-                  </v:formulas>
-                  <v:path o:extrusionok="f" gradientshapeok="t" o:connecttype="rect"/>
-                  <o:lock v:ext="edit" aspectratio="t"/>
-                </v:shapetype>
-                <v:shape id="Image 10" o:spid="_x0000_s1034" type="#_x0000_t75" style="position:absolute;left:43421;top:495;width:15316;height:15164;visibility:visible;mso-wrap-style:square" o:gfxdata="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">
-                  <v:imagedata r:id="rId9" o:title=""/>
-                </v:shape>
-                <w10:wrap anchorx="page" anchory="page"/>
-              </v:group>
-            </w:pict>
-          </mc:Fallback>
-        </mc:AlternateContent>
-      </w:r>
     </w:p>
     <w:p>
       <w:pPr>
@@ -1892,7 +97,7 @@
       <w:pPr>
         <w:pStyle w:val="Titre"/>
         <w:ind w:right="271"/>
-        <w:jc w:val="right"/>
+        <w:jc w:val="center"/>
       </w:pPr>
       <w:r>
         <w:rPr>
@@ -1927,7 +132,7 @@
       <w:pPr>
         <w:pStyle w:val="Titre"/>
         <w:spacing w:before="32"/>
-        <w:ind w:left="3345"/>
+        <w:jc w:val="center"/>
       </w:pPr>
       <w:r>
         <w:rPr>
@@ -1961,7 +166,7 @@
     <w:p>
       <w:pPr>
         <w:spacing w:before="18"/>
-        <w:ind w:left="4785"/>
+        <w:jc w:val="center"/>
         <w:rPr>
           <w:b/>
           <w:sz w:val="36"/>
@@ -2043,12 +248,16 @@
           <w:sz w:val="36"/>
         </w:rPr>
         <w:sectPr>
-          <w:footerReference w:type="default" r:id="rId10"/>
+          <w:headerReference w:type="even" r:id="rId8"/>
+          <w:headerReference w:type="default" r:id="rId9"/>
+          <w:headerReference w:type="first" r:id="rId10"/>
           <w:type w:val="continuous"/>
           <w:pgSz w:w="11910" w:h="16840"/>
           <w:pgMar w:top="0" w:right="992" w:bottom="1280" w:left="1275" w:header="0" w:footer="1081" w:gutter="0"/>
           <w:pgNumType w:start="1"/>
           <w:cols w:space="720"/>
+          <w:titlePg/>
+          <w:docGrid w:linePitch="299"/>
         </w:sectPr>
       </w:pPr>
     </w:p>
@@ -2805,8 +1014,12 @@
       <w:pPr>
         <w:pStyle w:val="TM1"/>
         <w:sectPr>
-          <w:headerReference w:type="default" r:id="rId11"/>
-          <w:footerReference w:type="default" r:id="rId12"/>
+          <w:headerReference w:type="even" r:id="rId11"/>
+          <w:headerReference w:type="default" r:id="rId12"/>
+          <w:footerReference w:type="even" r:id="rId13"/>
+          <w:footerReference w:type="default" r:id="rId14"/>
+          <w:headerReference w:type="first" r:id="rId15"/>
+          <w:footerReference w:type="first" r:id="rId16"/>
           <w:pgSz w:w="11910" w:h="16840"/>
           <w:pgMar w:top="1220" w:right="992" w:bottom="1280" w:left="1275" w:header="108" w:footer="1081" w:gutter="0"/>
           <w:cols w:space="720"/>
@@ -3337,6 +1550,12 @@
           <w:sz w:val="24"/>
         </w:rPr>
         <w:sectPr>
+          <w:headerReference w:type="even" r:id="rId17"/>
+          <w:headerReference w:type="default" r:id="rId18"/>
+          <w:footerReference w:type="even" r:id="rId19"/>
+          <w:footerReference w:type="default" r:id="rId20"/>
+          <w:headerReference w:type="first" r:id="rId21"/>
+          <w:footerReference w:type="first" r:id="rId22"/>
           <w:pgSz w:w="11910" w:h="16840"/>
           <w:pgMar w:top="1220" w:right="992" w:bottom="1280" w:left="1275" w:header="108" w:footer="1081" w:gutter="0"/>
           <w:cols w:space="720"/>
@@ -4016,8 +2235,12 @@
           <w:b/>
         </w:rPr>
         <w:sectPr>
-          <w:headerReference w:type="default" r:id="rId13"/>
-          <w:footerReference w:type="default" r:id="rId14"/>
+          <w:headerReference w:type="even" r:id="rId23"/>
+          <w:headerReference w:type="default" r:id="rId24"/>
+          <w:footerReference w:type="even" r:id="rId25"/>
+          <w:footerReference w:type="default" r:id="rId26"/>
+          <w:headerReference w:type="first" r:id="rId27"/>
+          <w:footerReference w:type="first" r:id="rId28"/>
           <w:pgSz w:w="16840" w:h="11910" w:orient="landscape"/>
           <w:pgMar w:top="1380" w:right="850" w:bottom="1280" w:left="1275" w:header="49" w:footer="1081" w:gutter="0"/>
           <w:cols w:space="720"/>
@@ -5714,6 +3937,12 @@
           <w:rFonts w:ascii="Times New Roman"/>
         </w:rPr>
         <w:sectPr>
+          <w:headerReference w:type="even" r:id="rId29"/>
+          <w:headerReference w:type="default" r:id="rId30"/>
+          <w:footerReference w:type="even" r:id="rId31"/>
+          <w:footerReference w:type="default" r:id="rId32"/>
+          <w:headerReference w:type="first" r:id="rId33"/>
+          <w:footerReference w:type="first" r:id="rId34"/>
           <w:pgSz w:w="16840" w:h="11910" w:orient="landscape"/>
           <w:pgMar w:top="1380" w:right="850" w:bottom="1280" w:left="1275" w:header="49" w:footer="1081" w:gutter="0"/>
           <w:cols w:space="720"/>
@@ -6486,6 +4715,12 @@
           <w:sz w:val="24"/>
         </w:rPr>
         <w:sectPr>
+          <w:headerReference w:type="even" r:id="rId35"/>
+          <w:headerReference w:type="default" r:id="rId36"/>
+          <w:footerReference w:type="even" r:id="rId37"/>
+          <w:footerReference w:type="default" r:id="rId38"/>
+          <w:headerReference w:type="first" r:id="rId39"/>
+          <w:footerReference w:type="first" r:id="rId40"/>
           <w:pgSz w:w="16840" w:h="11910" w:orient="landscape"/>
           <w:pgMar w:top="1380" w:right="850" w:bottom="1280" w:left="1275" w:header="49" w:footer="1081" w:gutter="0"/>
           <w:cols w:space="720"/>
@@ -7394,6 +5629,12 @@
         <w:pStyle w:val="Corpsdetexte"/>
         <w:spacing w:line="360" w:lineRule="auto"/>
         <w:sectPr>
+          <w:headerReference w:type="even" r:id="rId41"/>
+          <w:headerReference w:type="default" r:id="rId42"/>
+          <w:footerReference w:type="even" r:id="rId43"/>
+          <w:footerReference w:type="default" r:id="rId44"/>
+          <w:headerReference w:type="first" r:id="rId45"/>
+          <w:footerReference w:type="first" r:id="rId46"/>
           <w:pgSz w:w="16840" w:h="11910" w:orient="landscape"/>
           <w:pgMar w:top="1380" w:right="850" w:bottom="1280" w:left="1275" w:header="49" w:footer="1081" w:gutter="0"/>
           <w:cols w:space="720"/>
@@ -9061,8 +7302,9 @@
         </w:numPr>
         <w:tabs>
           <w:tab w:val="left" w:pos="860"/>
+          <w:tab w:val="left" w:pos="2972"/>
         </w:tabs>
-        <w:spacing w:before="0"/>
+        <w:spacing w:before="77"/>
         <w:ind w:left="860" w:hanging="359"/>
         <w:rPr>
           <w:sz w:val="24"/>
@@ -9072,6 +7314,7 @@
         <w:rPr>
           <w:sz w:val="24"/>
         </w:rPr>
+        <w:lastRenderedPageBreak/>
         <w:t>La</w:t>
       </w:r>
       <w:r>
@@ -9191,7 +7434,7 @@
           <w:spacing w:val="-1"/>
           <w:sz w:val="24"/>
         </w:rPr>
-        <w:t xml:space="preserve"> </w:t>
+        <w:t> </w:t>
       </w:r>
       <w:r>
         <w:rPr>
@@ -9200,21 +7443,6 @@
         </w:rPr>
         <w:t>;</w:t>
       </w:r>
-    </w:p>
-    <w:p>
-      <w:pPr>
-        <w:pStyle w:val="Paragraphedeliste"/>
-        <w:rPr>
-          <w:sz w:val="24"/>
-        </w:rPr>
-        <w:sectPr>
-          <w:headerReference w:type="default" r:id="rId15"/>
-          <w:footerReference w:type="default" r:id="rId16"/>
-          <w:pgSz w:w="11910" w:h="16840"/>
-          <w:pgMar w:top="1320" w:right="1275" w:bottom="1280" w:left="1275" w:header="121" w:footer="1081" w:gutter="0"/>
-          <w:cols w:space="720"/>
-        </w:sectPr>
-      </w:pPr>
     </w:p>
     <w:p>
       <w:pPr>
@@ -9224,19 +7452,19 @@
           <w:numId w:val="9"/>
         </w:numPr>
         <w:tabs>
+          <w:tab w:val="left" w:pos="860"/>
           <w:tab w:val="left" w:pos="2972"/>
         </w:tabs>
         <w:spacing w:before="77"/>
-        <w:ind w:left="2972" w:hanging="791"/>
-        <w:rPr>
-          <w:sz w:val="24"/>
-        </w:rPr>
-      </w:pPr>
-      <w:r>
-        <w:rPr>
-          <w:sz w:val="24"/>
-        </w:rPr>
-        <w:lastRenderedPageBreak/>
+        <w:ind w:left="860" w:hanging="359"/>
+        <w:rPr>
+          <w:sz w:val="24"/>
+        </w:rPr>
+      </w:pPr>
+      <w:r>
+        <w:rPr>
+          <w:sz w:val="24"/>
+        </w:rPr>
         <w:t>Le</w:t>
       </w:r>
       <w:r>
@@ -10666,18 +8894,18 @@
           <w:sz w:val="20"/>
         </w:rPr>
         <w:drawing>
-          <wp:anchor distT="0" distB="0" distL="0" distR="0" simplePos="0" relativeHeight="487588352" behindDoc="1" locked="0" layoutInCell="1" allowOverlap="1" wp14:anchorId="3D314384" wp14:editId="25F7E1A4">
+          <wp:anchor distT="0" distB="0" distL="0" distR="0" simplePos="0" relativeHeight="487588352" behindDoc="1" locked="0" layoutInCell="1" allowOverlap="1" wp14:anchorId="234DF9B4" wp14:editId="6167D5C4">
             <wp:simplePos x="0" y="0"/>
             <wp:positionH relativeFrom="page">
-              <wp:posOffset>1414146</wp:posOffset>
+              <wp:posOffset>1409700</wp:posOffset>
             </wp:positionH>
             <wp:positionV relativeFrom="paragraph">
-              <wp:posOffset>271594</wp:posOffset>
+              <wp:posOffset>272415</wp:posOffset>
             </wp:positionV>
-            <wp:extent cx="4503216" cy="2921127"/>
-            <wp:effectExtent l="0" t="0" r="0" b="0"/>
+            <wp:extent cx="4248150" cy="2390775"/>
+            <wp:effectExtent l="0" t="0" r="0" b="9525"/>
             <wp:wrapTopAndBottom/>
-            <wp:docPr id="20" name="Image 20"/>
+            <wp:docPr id="25" name="Image 25"/>
             <wp:cNvGraphicFramePr>
               <a:graphicFrameLocks xmlns:a="http://schemas.openxmlformats.org/drawingml/2006/main"/>
             </wp:cNvGraphicFramePr>
@@ -10689,7 +8917,7 @@
                     <pic:cNvPicPr/>
                   </pic:nvPicPr>
                   <pic:blipFill>
-                    <a:blip r:embed="rId17" cstate="print"/>
+                    <a:blip r:embed="rId47" cstate="print"/>
                     <a:stretch>
                       <a:fillRect/>
                     </a:stretch>
@@ -10697,7 +8925,7 @@
                   <pic:spPr>
                     <a:xfrm>
                       <a:off x="0" y="0"/>
-                      <a:ext cx="4503216" cy="2921127"/>
+                      <a:ext cx="4248150" cy="2390775"/>
                     </a:xfrm>
                     <a:prstGeom prst="rect">
                       <a:avLst/>
@@ -10706,6 +8934,12 @@
                 </pic:pic>
               </a:graphicData>
             </a:graphic>
+            <wp14:sizeRelH relativeFrom="margin">
+              <wp14:pctWidth>0</wp14:pctWidth>
+            </wp14:sizeRelH>
+            <wp14:sizeRelV relativeFrom="margin">
+              <wp14:pctHeight>0</wp14:pctHeight>
+            </wp14:sizeRelV>
           </wp:anchor>
         </w:drawing>
       </w:r>
@@ -10717,6 +8951,12 @@
           <w:sz w:val="20"/>
         </w:rPr>
         <w:sectPr>
+          <w:headerReference w:type="even" r:id="rId48"/>
+          <w:headerReference w:type="default" r:id="rId49"/>
+          <w:footerReference w:type="even" r:id="rId50"/>
+          <w:footerReference w:type="default" r:id="rId51"/>
+          <w:headerReference w:type="first" r:id="rId52"/>
+          <w:footerReference w:type="first" r:id="rId53"/>
           <w:pgSz w:w="11910" w:h="16840"/>
           <w:pgMar w:top="1320" w:right="1275" w:bottom="1280" w:left="1275" w:header="121" w:footer="1081" w:gutter="0"/>
           <w:cols w:space="720"/>
@@ -11342,6 +9582,12 @@
     </w:tbl>
     <w:p/>
     <w:sectPr>
+      <w:headerReference w:type="even" r:id="rId54"/>
+      <w:headerReference w:type="default" r:id="rId55"/>
+      <w:footerReference w:type="even" r:id="rId56"/>
+      <w:footerReference w:type="default" r:id="rId57"/>
+      <w:headerReference w:type="first" r:id="rId58"/>
+      <w:footerReference w:type="first" r:id="rId59"/>
       <w:pgSz w:w="11910" w:h="16840"/>
       <w:pgMar w:top="1320" w:right="1275" w:bottom="1280" w:left="1275" w:header="121" w:footer="1081" w:gutter="0"/>
       <w:cols w:space="720"/>
@@ -11371,729 +9617,145 @@
 
 <file path=word/footer1.xml><?xml version="1.0" encoding="utf-8"?>
 <w:ftr xmlns:wpc="http://schemas.microsoft.com/office/word/2010/wordprocessingCanvas" xmlns:cx="http://schemas.microsoft.com/office/drawing/2014/chartex" xmlns:cx1="http://schemas.microsoft.com/office/drawing/2015/9/8/chartex" xmlns:cx2="http://schemas.microsoft.com/office/drawing/2015/10/21/chartex" xmlns:cx3="http://schemas.microsoft.com/office/drawing/2016/5/9/chartex" xmlns:cx4="http://schemas.microsoft.com/office/drawing/2016/5/10/chartex" xmlns:cx5="http://schemas.microsoft.com/office/drawing/2016/5/11/chartex" xmlns:cx6="http://schemas.microsoft.com/office/drawing/2016/5/12/chartex" xmlns:cx7="http://schemas.microsoft.com/office/drawing/2016/5/13/chartex" xmlns:cx8="http://schemas.microsoft.com/office/drawing/2016/5/14/chartex" xmlns:mc="http://schemas.openxmlformats.org/markup-compatibility/2006" xmlns:aink="http://schemas.microsoft.com/office/drawing/2016/ink" xmlns:am3d="http://schemas.microsoft.com/office/drawing/2017/model3d" xmlns:o="urn:schemas-microsoft-com:office:office" xmlns:r="http://schemas.openxmlformats.org/officeDocument/2006/relationships" xmlns:m="http://schemas.openxmlformats.org/officeDocument/2006/math" xmlns:v="urn:schemas-microsoft-com:vml" xmlns:wp14="http://schemas.microsoft.com/office/word/2010/wordprocessingDrawing" xmlns:wp="http://schemas.openxmlformats.org/drawingml/2006/wordprocessingDrawing" xmlns:w10="urn:schemas-microsoft-com:office:word" xmlns:w="http://schemas.openxmlformats.org/wordprocessingml/2006/main" xmlns:w14="http://schemas.microsoft.com/office/word/2010/wordml" xmlns:w15="http://schemas.microsoft.com/office/word/2012/wordml" xmlns:w16cex="http://schemas.microsoft.com/office/word/2018/wordml/cex" xmlns:w16cid="http://schemas.microsoft.com/office/word/2016/wordml/cid" xmlns:w16="http://schemas.microsoft.com/office/word/2018/wordml" xmlns:w16sdtdh="http://schemas.microsoft.com/office/word/2020/wordml/sdtdatahash" xmlns:w16se="http://schemas.microsoft.com/office/word/2015/wordml/symex" xmlns:wpg="http://schemas.microsoft.com/office/word/2010/wordprocessingGroup" xmlns:wpi="http://schemas.microsoft.com/office/word/2010/wordprocessingInk" xmlns:wne="http://schemas.microsoft.com/office/word/2006/wordml" xmlns:wps="http://schemas.microsoft.com/office/word/2010/wordprocessingShape" mc:Ignorable="w14 w15 w16se w16cid w16 w16cex w16sdtdh wp14">
-  <w:p>
-    <w:pPr>
-      <w:pStyle w:val="Corpsdetexte"/>
-      <w:spacing w:line="14" w:lineRule="auto"/>
-      <w:rPr>
-        <w:sz w:val="20"/>
-      </w:rPr>
-    </w:pPr>
-    <w:r>
-      <w:rPr>
-        <w:noProof/>
-        <w:sz w:val="20"/>
-      </w:rPr>
-      <mc:AlternateContent>
-        <mc:Choice Requires="wps">
-          <w:drawing>
-            <wp:anchor distT="0" distB="0" distL="0" distR="0" simplePos="0" relativeHeight="487141376" behindDoc="1" locked="0" layoutInCell="1" allowOverlap="1" wp14:anchorId="1479219F" wp14:editId="060B8CB5">
-              <wp:simplePos x="0" y="0"/>
-              <wp:positionH relativeFrom="page">
-                <wp:posOffset>3710940</wp:posOffset>
-              </wp:positionH>
-              <wp:positionV relativeFrom="page">
-                <wp:posOffset>9866203</wp:posOffset>
-              </wp:positionV>
-              <wp:extent cx="148590" cy="203835"/>
-              <wp:effectExtent l="0" t="0" r="0" b="0"/>
-              <wp:wrapNone/>
-              <wp:docPr id="1" name="Textbox 1"/>
-              <wp:cNvGraphicFramePr>
-                <a:graphicFrameLocks xmlns:a="http://schemas.openxmlformats.org/drawingml/2006/main"/>
-              </wp:cNvGraphicFramePr>
-              <a:graphic xmlns:a="http://schemas.openxmlformats.org/drawingml/2006/main">
-                <a:graphicData uri="http://schemas.microsoft.com/office/word/2010/wordprocessingShape">
-                  <wps:wsp>
-                    <wps:cNvSpPr txBox="1">
-                      <a:spLocks/>
-                    </wps:cNvSpPr>
-                    <wps:spPr>
-                      <a:xfrm>
-                        <a:off x="0" y="0"/>
-                        <a:ext cx="148590" cy="203835"/>
-                      </a:xfrm>
-                      <a:prstGeom prst="rect">
-                        <a:avLst/>
-                      </a:prstGeom>
-                    </wps:spPr>
-                    <wps:txbx>
-                      <w:txbxContent>
-                        <w:p>
-                          <w:pPr>
-                            <w:spacing w:line="299" w:lineRule="exact"/>
-                            <w:ind w:left="60"/>
-                            <w:rPr>
-                              <w:b/>
-                              <w:sz w:val="28"/>
-                            </w:rPr>
-                          </w:pPr>
-                          <w:r>
-                            <w:rPr>
-                              <w:b/>
-                              <w:spacing w:val="-10"/>
-                              <w:sz w:val="28"/>
-                            </w:rPr>
-                            <w:fldChar w:fldCharType="begin"/>
-                          </w:r>
-                          <w:r>
-                            <w:rPr>
-                              <w:b/>
-                              <w:spacing w:val="-10"/>
-                              <w:sz w:val="28"/>
-                            </w:rPr>
-                            <w:instrText xml:space="preserve"> PAGE </w:instrText>
-                          </w:r>
-                          <w:r>
-                            <w:rPr>
-                              <w:b/>
-                              <w:spacing w:val="-10"/>
-                              <w:sz w:val="28"/>
-                            </w:rPr>
-                            <w:fldChar w:fldCharType="separate"/>
-                          </w:r>
-                          <w:r>
-                            <w:rPr>
-                              <w:b/>
-                              <w:spacing w:val="-10"/>
-                              <w:sz w:val="28"/>
-                            </w:rPr>
-                            <w:t>1</w:t>
-                          </w:r>
-                          <w:r>
-                            <w:rPr>
-                              <w:b/>
-                              <w:spacing w:val="-10"/>
-                              <w:sz w:val="28"/>
-                            </w:rPr>
-                            <w:fldChar w:fldCharType="end"/>
-                          </w:r>
-                        </w:p>
-                      </w:txbxContent>
-                    </wps:txbx>
-                    <wps:bodyPr wrap="square" lIns="0" tIns="0" rIns="0" bIns="0" rtlCol="0">
-                      <a:noAutofit/>
-                    </wps:bodyPr>
-                  </wps:wsp>
-                </a:graphicData>
-              </a:graphic>
-            </wp:anchor>
-          </w:drawing>
-        </mc:Choice>
-        <mc:Fallback>
-          <w:pict>
-            <v:shapetype w14:anchorId="1479219F" id="_x0000_t202" coordsize="21600,21600" o:spt="202" path="m,l,21600r21600,l21600,xe">
-              <v:stroke joinstyle="miter"/>
-              <v:path gradientshapeok="t" o:connecttype="rect"/>
-            </v:shapetype>
-            <v:shape id="Textbox 1" o:spid="_x0000_s1026" type="#_x0000_t202" style="position:absolute;margin-left:292.2pt;margin-top:776.85pt;width:11.7pt;height:16.05pt;z-index:-16175104;visibility:visible;mso-wrap-style:square;mso-wrap-distance-left:0;mso-wrap-distance-top:0;mso-wrap-distance-right:0;mso-wrap-distance-bottom:0;mso-position-horizontal:absolute;mso-position-horizontal-relative:page;mso-position-vertical:absolute;mso-position-vertical-relative:page;v-text-anchor:top" o:gfxdata="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" filled="f" stroked="f">
-              <v:textbox inset="0,0,0,0">
-                <w:txbxContent>
-                  <w:p>
-                    <w:pPr>
-                      <w:spacing w:line="299" w:lineRule="exact"/>
-                      <w:ind w:left="60"/>
-                      <w:rPr>
-                        <w:b/>
-                        <w:sz w:val="28"/>
-                      </w:rPr>
-                    </w:pPr>
-                    <w:r>
-                      <w:rPr>
-                        <w:b/>
-                        <w:spacing w:val="-10"/>
-                        <w:sz w:val="28"/>
-                      </w:rPr>
-                      <w:fldChar w:fldCharType="begin"/>
-                    </w:r>
-                    <w:r>
-                      <w:rPr>
-                        <w:b/>
-                        <w:spacing w:val="-10"/>
-                        <w:sz w:val="28"/>
-                      </w:rPr>
-                      <w:instrText xml:space="preserve"> PAGE </w:instrText>
-                    </w:r>
-                    <w:r>
-                      <w:rPr>
-                        <w:b/>
-                        <w:spacing w:val="-10"/>
-                        <w:sz w:val="28"/>
-                      </w:rPr>
-                      <w:fldChar w:fldCharType="separate"/>
-                    </w:r>
-                    <w:r>
-                      <w:rPr>
-                        <w:b/>
-                        <w:spacing w:val="-10"/>
-                        <w:sz w:val="28"/>
-                      </w:rPr>
-                      <w:t>1</w:t>
-                    </w:r>
-                    <w:r>
-                      <w:rPr>
-                        <w:b/>
-                        <w:spacing w:val="-10"/>
-                        <w:sz w:val="28"/>
-                      </w:rPr>
-                      <w:fldChar w:fldCharType="end"/>
-                    </w:r>
-                  </w:p>
-                </w:txbxContent>
-              </v:textbox>
-              <w10:wrap anchorx="page" anchory="page"/>
-            </v:shape>
-          </w:pict>
-        </mc:Fallback>
-      </mc:AlternateContent>
-    </w:r>
-  </w:p>
+  <w:p/>
+</w:ftr>
+</file>
+
+<file path=word/footer10.xml><?xml version="1.0" encoding="utf-8"?>
+<w:ftr xmlns:wpc="http://schemas.microsoft.com/office/word/2010/wordprocessingCanvas" xmlns:cx="http://schemas.microsoft.com/office/drawing/2014/chartex" xmlns:cx1="http://schemas.microsoft.com/office/drawing/2015/9/8/chartex" xmlns:cx2="http://schemas.microsoft.com/office/drawing/2015/10/21/chartex" xmlns:cx3="http://schemas.microsoft.com/office/drawing/2016/5/9/chartex" xmlns:cx4="http://schemas.microsoft.com/office/drawing/2016/5/10/chartex" xmlns:cx5="http://schemas.microsoft.com/office/drawing/2016/5/11/chartex" xmlns:cx6="http://schemas.microsoft.com/office/drawing/2016/5/12/chartex" xmlns:cx7="http://schemas.microsoft.com/office/drawing/2016/5/13/chartex" xmlns:cx8="http://schemas.microsoft.com/office/drawing/2016/5/14/chartex" xmlns:mc="http://schemas.openxmlformats.org/markup-compatibility/2006" xmlns:aink="http://schemas.microsoft.com/office/drawing/2016/ink" xmlns:am3d="http://schemas.microsoft.com/office/drawing/2017/model3d" xmlns:o="urn:schemas-microsoft-com:office:office" xmlns:r="http://schemas.openxmlformats.org/officeDocument/2006/relationships" xmlns:m="http://schemas.openxmlformats.org/officeDocument/2006/math" xmlns:v="urn:schemas-microsoft-com:vml" xmlns:wp14="http://schemas.microsoft.com/office/word/2010/wordprocessingDrawing" xmlns:wp="http://schemas.openxmlformats.org/drawingml/2006/wordprocessingDrawing" xmlns:w10="urn:schemas-microsoft-com:office:word" xmlns:w="http://schemas.openxmlformats.org/wordprocessingml/2006/main" xmlns:w14="http://schemas.microsoft.com/office/word/2010/wordml" xmlns:w15="http://schemas.microsoft.com/office/word/2012/wordml" xmlns:w16cex="http://schemas.microsoft.com/office/word/2018/wordml/cex" xmlns:w16cid="http://schemas.microsoft.com/office/word/2016/wordml/cid" xmlns:w16="http://schemas.microsoft.com/office/word/2018/wordml" xmlns:w16sdtdh="http://schemas.microsoft.com/office/word/2020/wordml/sdtdatahash" xmlns:w16se="http://schemas.microsoft.com/office/word/2015/wordml/symex" xmlns:wpg="http://schemas.microsoft.com/office/word/2010/wordprocessingGroup" xmlns:wpi="http://schemas.microsoft.com/office/word/2010/wordprocessingInk" xmlns:wne="http://schemas.microsoft.com/office/word/2006/wordml" xmlns:wps="http://schemas.microsoft.com/office/word/2010/wordprocessingShape" mc:Ignorable="w14 w15 w16se w16cid w16 w16cex w16sdtdh wp14">
+  <w:p/>
+</w:ftr>
+</file>
+
+<file path=word/footer11.xml><?xml version="1.0" encoding="utf-8"?>
+<w:ftr xmlns:wpc="http://schemas.microsoft.com/office/word/2010/wordprocessingCanvas" xmlns:cx="http://schemas.microsoft.com/office/drawing/2014/chartex" xmlns:cx1="http://schemas.microsoft.com/office/drawing/2015/9/8/chartex" xmlns:cx2="http://schemas.microsoft.com/office/drawing/2015/10/21/chartex" xmlns:cx3="http://schemas.microsoft.com/office/drawing/2016/5/9/chartex" xmlns:cx4="http://schemas.microsoft.com/office/drawing/2016/5/10/chartex" xmlns:cx5="http://schemas.microsoft.com/office/drawing/2016/5/11/chartex" xmlns:cx6="http://schemas.microsoft.com/office/drawing/2016/5/12/chartex" xmlns:cx7="http://schemas.microsoft.com/office/drawing/2016/5/13/chartex" xmlns:cx8="http://schemas.microsoft.com/office/drawing/2016/5/14/chartex" xmlns:mc="http://schemas.openxmlformats.org/markup-compatibility/2006" xmlns:aink="http://schemas.microsoft.com/office/drawing/2016/ink" xmlns:am3d="http://schemas.microsoft.com/office/drawing/2017/model3d" xmlns:o="urn:schemas-microsoft-com:office:office" xmlns:r="http://schemas.openxmlformats.org/officeDocument/2006/relationships" xmlns:m="http://schemas.openxmlformats.org/officeDocument/2006/math" xmlns:v="urn:schemas-microsoft-com:vml" xmlns:wp14="http://schemas.microsoft.com/office/word/2010/wordprocessingDrawing" xmlns:wp="http://schemas.openxmlformats.org/drawingml/2006/wordprocessingDrawing" xmlns:w10="urn:schemas-microsoft-com:office:word" xmlns:w="http://schemas.openxmlformats.org/wordprocessingml/2006/main" xmlns:w14="http://schemas.microsoft.com/office/word/2010/wordml" xmlns:w15="http://schemas.microsoft.com/office/word/2012/wordml" xmlns:w16cex="http://schemas.microsoft.com/office/word/2018/wordml/cex" xmlns:w16cid="http://schemas.microsoft.com/office/word/2016/wordml/cid" xmlns:w16="http://schemas.microsoft.com/office/word/2018/wordml" xmlns:w16sdtdh="http://schemas.microsoft.com/office/word/2020/wordml/sdtdatahash" xmlns:w16se="http://schemas.microsoft.com/office/word/2015/wordml/symex" xmlns:wpg="http://schemas.microsoft.com/office/word/2010/wordprocessingGroup" xmlns:wpi="http://schemas.microsoft.com/office/word/2010/wordprocessingInk" xmlns:wne="http://schemas.microsoft.com/office/word/2006/wordml" xmlns:wps="http://schemas.microsoft.com/office/word/2010/wordprocessingShape" mc:Ignorable="w14 w15 w16se w16cid w16 w16cex w16sdtdh wp14">
+  <w:p/>
+</w:ftr>
+</file>
+
+<file path=word/footer12.xml><?xml version="1.0" encoding="utf-8"?>
+<w:ftr xmlns:wpc="http://schemas.microsoft.com/office/word/2010/wordprocessingCanvas" xmlns:cx="http://schemas.microsoft.com/office/drawing/2014/chartex" xmlns:cx1="http://schemas.microsoft.com/office/drawing/2015/9/8/chartex" xmlns:cx2="http://schemas.microsoft.com/office/drawing/2015/10/21/chartex" xmlns:cx3="http://schemas.microsoft.com/office/drawing/2016/5/9/chartex" xmlns:cx4="http://schemas.microsoft.com/office/drawing/2016/5/10/chartex" xmlns:cx5="http://schemas.microsoft.com/office/drawing/2016/5/11/chartex" xmlns:cx6="http://schemas.microsoft.com/office/drawing/2016/5/12/chartex" xmlns:cx7="http://schemas.microsoft.com/office/drawing/2016/5/13/chartex" xmlns:cx8="http://schemas.microsoft.com/office/drawing/2016/5/14/chartex" xmlns:mc="http://schemas.openxmlformats.org/markup-compatibility/2006" xmlns:aink="http://schemas.microsoft.com/office/drawing/2016/ink" xmlns:am3d="http://schemas.microsoft.com/office/drawing/2017/model3d" xmlns:o="urn:schemas-microsoft-com:office:office" xmlns:r="http://schemas.openxmlformats.org/officeDocument/2006/relationships" xmlns:m="http://schemas.openxmlformats.org/officeDocument/2006/math" xmlns:v="urn:schemas-microsoft-com:vml" xmlns:wp14="http://schemas.microsoft.com/office/word/2010/wordprocessingDrawing" xmlns:wp="http://schemas.openxmlformats.org/drawingml/2006/wordprocessingDrawing" xmlns:w10="urn:schemas-microsoft-com:office:word" xmlns:w="http://schemas.openxmlformats.org/wordprocessingml/2006/main" xmlns:w14="http://schemas.microsoft.com/office/word/2010/wordml" xmlns:w15="http://schemas.microsoft.com/office/word/2012/wordml" xmlns:w16cex="http://schemas.microsoft.com/office/word/2018/wordml/cex" xmlns:w16cid="http://schemas.microsoft.com/office/word/2016/wordml/cid" xmlns:w16="http://schemas.microsoft.com/office/word/2018/wordml" xmlns:w16sdtdh="http://schemas.microsoft.com/office/word/2020/wordml/sdtdatahash" xmlns:w16se="http://schemas.microsoft.com/office/word/2015/wordml/symex" xmlns:wpg="http://schemas.microsoft.com/office/word/2010/wordprocessingGroup" xmlns:wpi="http://schemas.microsoft.com/office/word/2010/wordprocessingInk" xmlns:wne="http://schemas.microsoft.com/office/word/2006/wordml" xmlns:wps="http://schemas.microsoft.com/office/word/2010/wordprocessingShape" mc:Ignorable="w14 w15 w16se w16cid w16 w16cex w16sdtdh wp14">
+  <w:p/>
+</w:ftr>
+</file>
+
+<file path=word/footer13.xml><?xml version="1.0" encoding="utf-8"?>
+<w:ftr xmlns:wpc="http://schemas.microsoft.com/office/word/2010/wordprocessingCanvas" xmlns:cx="http://schemas.microsoft.com/office/drawing/2014/chartex" xmlns:cx1="http://schemas.microsoft.com/office/drawing/2015/9/8/chartex" xmlns:cx2="http://schemas.microsoft.com/office/drawing/2015/10/21/chartex" xmlns:cx3="http://schemas.microsoft.com/office/drawing/2016/5/9/chartex" xmlns:cx4="http://schemas.microsoft.com/office/drawing/2016/5/10/chartex" xmlns:cx5="http://schemas.microsoft.com/office/drawing/2016/5/11/chartex" xmlns:cx6="http://schemas.microsoft.com/office/drawing/2016/5/12/chartex" xmlns:cx7="http://schemas.microsoft.com/office/drawing/2016/5/13/chartex" xmlns:cx8="http://schemas.microsoft.com/office/drawing/2016/5/14/chartex" xmlns:mc="http://schemas.openxmlformats.org/markup-compatibility/2006" xmlns:aink="http://schemas.microsoft.com/office/drawing/2016/ink" xmlns:am3d="http://schemas.microsoft.com/office/drawing/2017/model3d" xmlns:o="urn:schemas-microsoft-com:office:office" xmlns:r="http://schemas.openxmlformats.org/officeDocument/2006/relationships" xmlns:m="http://schemas.openxmlformats.org/officeDocument/2006/math" xmlns:v="urn:schemas-microsoft-com:vml" xmlns:wp14="http://schemas.microsoft.com/office/word/2010/wordprocessingDrawing" xmlns:wp="http://schemas.openxmlformats.org/drawingml/2006/wordprocessingDrawing" xmlns:w10="urn:schemas-microsoft-com:office:word" xmlns:w="http://schemas.openxmlformats.org/wordprocessingml/2006/main" xmlns:w14="http://schemas.microsoft.com/office/word/2010/wordml" xmlns:w15="http://schemas.microsoft.com/office/word/2012/wordml" xmlns:w16cex="http://schemas.microsoft.com/office/word/2018/wordml/cex" xmlns:w16cid="http://schemas.microsoft.com/office/word/2016/wordml/cid" xmlns:w16="http://schemas.microsoft.com/office/word/2018/wordml" xmlns:w16sdtdh="http://schemas.microsoft.com/office/word/2020/wordml/sdtdatahash" xmlns:w16se="http://schemas.microsoft.com/office/word/2015/wordml/symex" xmlns:wpg="http://schemas.microsoft.com/office/word/2010/wordprocessingGroup" xmlns:wpi="http://schemas.microsoft.com/office/word/2010/wordprocessingInk" xmlns:wne="http://schemas.microsoft.com/office/word/2006/wordml" xmlns:wps="http://schemas.microsoft.com/office/word/2010/wordprocessingShape" mc:Ignorable="w14 w15 w16se w16cid w16 w16cex w16sdtdh wp14">
+  <w:p/>
+</w:ftr>
+</file>
+
+<file path=word/footer14.xml><?xml version="1.0" encoding="utf-8"?>
+<w:ftr xmlns:wpc="http://schemas.microsoft.com/office/word/2010/wordprocessingCanvas" xmlns:cx="http://schemas.microsoft.com/office/drawing/2014/chartex" xmlns:cx1="http://schemas.microsoft.com/office/drawing/2015/9/8/chartex" xmlns:cx2="http://schemas.microsoft.com/office/drawing/2015/10/21/chartex" xmlns:cx3="http://schemas.microsoft.com/office/drawing/2016/5/9/chartex" xmlns:cx4="http://schemas.microsoft.com/office/drawing/2016/5/10/chartex" xmlns:cx5="http://schemas.microsoft.com/office/drawing/2016/5/11/chartex" xmlns:cx6="http://schemas.microsoft.com/office/drawing/2016/5/12/chartex" xmlns:cx7="http://schemas.microsoft.com/office/drawing/2016/5/13/chartex" xmlns:cx8="http://schemas.microsoft.com/office/drawing/2016/5/14/chartex" xmlns:mc="http://schemas.openxmlformats.org/markup-compatibility/2006" xmlns:aink="http://schemas.microsoft.com/office/drawing/2016/ink" xmlns:am3d="http://schemas.microsoft.com/office/drawing/2017/model3d" xmlns:o="urn:schemas-microsoft-com:office:office" xmlns:r="http://schemas.openxmlformats.org/officeDocument/2006/relationships" xmlns:m="http://schemas.openxmlformats.org/officeDocument/2006/math" xmlns:v="urn:schemas-microsoft-com:vml" xmlns:wp14="http://schemas.microsoft.com/office/word/2010/wordprocessingDrawing" xmlns:wp="http://schemas.openxmlformats.org/drawingml/2006/wordprocessingDrawing" xmlns:w10="urn:schemas-microsoft-com:office:word" xmlns:w="http://schemas.openxmlformats.org/wordprocessingml/2006/main" xmlns:w14="http://schemas.microsoft.com/office/word/2010/wordml" xmlns:w15="http://schemas.microsoft.com/office/word/2012/wordml" xmlns:w16cex="http://schemas.microsoft.com/office/word/2018/wordml/cex" xmlns:w16cid="http://schemas.microsoft.com/office/word/2016/wordml/cid" xmlns:w16="http://schemas.microsoft.com/office/word/2018/wordml" xmlns:w16sdtdh="http://schemas.microsoft.com/office/word/2020/wordml/sdtdatahash" xmlns:w16se="http://schemas.microsoft.com/office/word/2015/wordml/symex" xmlns:wpg="http://schemas.microsoft.com/office/word/2010/wordprocessingGroup" xmlns:wpi="http://schemas.microsoft.com/office/word/2010/wordprocessingInk" xmlns:wne="http://schemas.microsoft.com/office/word/2006/wordml" xmlns:wps="http://schemas.microsoft.com/office/word/2010/wordprocessingShape" mc:Ignorable="w14 w15 w16se w16cid w16 w16cex w16sdtdh wp14">
+  <w:p/>
+</w:ftr>
+</file>
+
+<file path=word/footer15.xml><?xml version="1.0" encoding="utf-8"?>
+<w:ftr xmlns:wpc="http://schemas.microsoft.com/office/word/2010/wordprocessingCanvas" xmlns:cx="http://schemas.microsoft.com/office/drawing/2014/chartex" xmlns:cx1="http://schemas.microsoft.com/office/drawing/2015/9/8/chartex" xmlns:cx2="http://schemas.microsoft.com/office/drawing/2015/10/21/chartex" xmlns:cx3="http://schemas.microsoft.com/office/drawing/2016/5/9/chartex" xmlns:cx4="http://schemas.microsoft.com/office/drawing/2016/5/10/chartex" xmlns:cx5="http://schemas.microsoft.com/office/drawing/2016/5/11/chartex" xmlns:cx6="http://schemas.microsoft.com/office/drawing/2016/5/12/chartex" xmlns:cx7="http://schemas.microsoft.com/office/drawing/2016/5/13/chartex" xmlns:cx8="http://schemas.microsoft.com/office/drawing/2016/5/14/chartex" xmlns:mc="http://schemas.openxmlformats.org/markup-compatibility/2006" xmlns:aink="http://schemas.microsoft.com/office/drawing/2016/ink" xmlns:am3d="http://schemas.microsoft.com/office/drawing/2017/model3d" xmlns:o="urn:schemas-microsoft-com:office:office" xmlns:r="http://schemas.openxmlformats.org/officeDocument/2006/relationships" xmlns:m="http://schemas.openxmlformats.org/officeDocument/2006/math" xmlns:v="urn:schemas-microsoft-com:vml" xmlns:wp14="http://schemas.microsoft.com/office/word/2010/wordprocessingDrawing" xmlns:wp="http://schemas.openxmlformats.org/drawingml/2006/wordprocessingDrawing" xmlns:w10="urn:schemas-microsoft-com:office:word" xmlns:w="http://schemas.openxmlformats.org/wordprocessingml/2006/main" xmlns:w14="http://schemas.microsoft.com/office/word/2010/wordml" xmlns:w15="http://schemas.microsoft.com/office/word/2012/wordml" xmlns:w16cex="http://schemas.microsoft.com/office/word/2018/wordml/cex" xmlns:w16cid="http://schemas.microsoft.com/office/word/2016/wordml/cid" xmlns:w16="http://schemas.microsoft.com/office/word/2018/wordml" xmlns:w16sdtdh="http://schemas.microsoft.com/office/word/2020/wordml/sdtdatahash" xmlns:w16se="http://schemas.microsoft.com/office/word/2015/wordml/symex" xmlns:wpg="http://schemas.microsoft.com/office/word/2010/wordprocessingGroup" xmlns:wpi="http://schemas.microsoft.com/office/word/2010/wordprocessingInk" xmlns:wne="http://schemas.microsoft.com/office/word/2006/wordml" xmlns:wps="http://schemas.microsoft.com/office/word/2010/wordprocessingShape" mc:Ignorable="w14 w15 w16se w16cid w16 w16cex w16sdtdh wp14">
+  <w:p/>
+</w:ftr>
+</file>
+
+<file path=word/footer16.xml><?xml version="1.0" encoding="utf-8"?>
+<w:ftr xmlns:wpc="http://schemas.microsoft.com/office/word/2010/wordprocessingCanvas" xmlns:cx="http://schemas.microsoft.com/office/drawing/2014/chartex" xmlns:cx1="http://schemas.microsoft.com/office/drawing/2015/9/8/chartex" xmlns:cx2="http://schemas.microsoft.com/office/drawing/2015/10/21/chartex" xmlns:cx3="http://schemas.microsoft.com/office/drawing/2016/5/9/chartex" xmlns:cx4="http://schemas.microsoft.com/office/drawing/2016/5/10/chartex" xmlns:cx5="http://schemas.microsoft.com/office/drawing/2016/5/11/chartex" xmlns:cx6="http://schemas.microsoft.com/office/drawing/2016/5/12/chartex" xmlns:cx7="http://schemas.microsoft.com/office/drawing/2016/5/13/chartex" xmlns:cx8="http://schemas.microsoft.com/office/drawing/2016/5/14/chartex" xmlns:mc="http://schemas.openxmlformats.org/markup-compatibility/2006" xmlns:aink="http://schemas.microsoft.com/office/drawing/2016/ink" xmlns:am3d="http://schemas.microsoft.com/office/drawing/2017/model3d" xmlns:o="urn:schemas-microsoft-com:office:office" xmlns:r="http://schemas.openxmlformats.org/officeDocument/2006/relationships" xmlns:m="http://schemas.openxmlformats.org/officeDocument/2006/math" xmlns:v="urn:schemas-microsoft-com:vml" xmlns:wp14="http://schemas.microsoft.com/office/word/2010/wordprocessingDrawing" xmlns:wp="http://schemas.openxmlformats.org/drawingml/2006/wordprocessingDrawing" xmlns:w10="urn:schemas-microsoft-com:office:word" xmlns:w="http://schemas.openxmlformats.org/wordprocessingml/2006/main" xmlns:w14="http://schemas.microsoft.com/office/word/2010/wordml" xmlns:w15="http://schemas.microsoft.com/office/word/2012/wordml" xmlns:w16cex="http://schemas.microsoft.com/office/word/2018/wordml/cex" xmlns:w16cid="http://schemas.microsoft.com/office/word/2016/wordml/cid" xmlns:w16="http://schemas.microsoft.com/office/word/2018/wordml" xmlns:w16sdtdh="http://schemas.microsoft.com/office/word/2020/wordml/sdtdatahash" xmlns:w16se="http://schemas.microsoft.com/office/word/2015/wordml/symex" xmlns:wpg="http://schemas.microsoft.com/office/word/2010/wordprocessingGroup" xmlns:wpi="http://schemas.microsoft.com/office/word/2010/wordprocessingInk" xmlns:wne="http://schemas.microsoft.com/office/word/2006/wordml" xmlns:wps="http://schemas.microsoft.com/office/word/2010/wordprocessingShape" mc:Ignorable="w14 w15 w16se w16cid w16 w16cex w16sdtdh wp14">
+  <w:p/>
+</w:ftr>
+</file>
+
+<file path=word/footer17.xml><?xml version="1.0" encoding="utf-8"?>
+<w:ftr xmlns:wpc="http://schemas.microsoft.com/office/word/2010/wordprocessingCanvas" xmlns:cx="http://schemas.microsoft.com/office/drawing/2014/chartex" xmlns:cx1="http://schemas.microsoft.com/office/drawing/2015/9/8/chartex" xmlns:cx2="http://schemas.microsoft.com/office/drawing/2015/10/21/chartex" xmlns:cx3="http://schemas.microsoft.com/office/drawing/2016/5/9/chartex" xmlns:cx4="http://schemas.microsoft.com/office/drawing/2016/5/10/chartex" xmlns:cx5="http://schemas.microsoft.com/office/drawing/2016/5/11/chartex" xmlns:cx6="http://schemas.microsoft.com/office/drawing/2016/5/12/chartex" xmlns:cx7="http://schemas.microsoft.com/office/drawing/2016/5/13/chartex" xmlns:cx8="http://schemas.microsoft.com/office/drawing/2016/5/14/chartex" xmlns:mc="http://schemas.openxmlformats.org/markup-compatibility/2006" xmlns:aink="http://schemas.microsoft.com/office/drawing/2016/ink" xmlns:am3d="http://schemas.microsoft.com/office/drawing/2017/model3d" xmlns:o="urn:schemas-microsoft-com:office:office" xmlns:r="http://schemas.openxmlformats.org/officeDocument/2006/relationships" xmlns:m="http://schemas.openxmlformats.org/officeDocument/2006/math" xmlns:v="urn:schemas-microsoft-com:vml" xmlns:wp14="http://schemas.microsoft.com/office/word/2010/wordprocessingDrawing" xmlns:wp="http://schemas.openxmlformats.org/drawingml/2006/wordprocessingDrawing" xmlns:w10="urn:schemas-microsoft-com:office:word" xmlns:w="http://schemas.openxmlformats.org/wordprocessingml/2006/main" xmlns:w14="http://schemas.microsoft.com/office/word/2010/wordml" xmlns:w15="http://schemas.microsoft.com/office/word/2012/wordml" xmlns:w16cex="http://schemas.microsoft.com/office/word/2018/wordml/cex" xmlns:w16cid="http://schemas.microsoft.com/office/word/2016/wordml/cid" xmlns:w16="http://schemas.microsoft.com/office/word/2018/wordml" xmlns:w16sdtdh="http://schemas.microsoft.com/office/word/2020/wordml/sdtdatahash" xmlns:w16se="http://schemas.microsoft.com/office/word/2015/wordml/symex" xmlns:wpg="http://schemas.microsoft.com/office/word/2010/wordprocessingGroup" xmlns:wpi="http://schemas.microsoft.com/office/word/2010/wordprocessingInk" xmlns:wne="http://schemas.microsoft.com/office/word/2006/wordml" xmlns:wps="http://schemas.microsoft.com/office/word/2010/wordprocessingShape" mc:Ignorable="w14 w15 w16se w16cid w16 w16cex w16sdtdh wp14">
+  <w:p/>
+</w:ftr>
+</file>
+
+<file path=word/footer18.xml><?xml version="1.0" encoding="utf-8"?>
+<w:ftr xmlns:wpc="http://schemas.microsoft.com/office/word/2010/wordprocessingCanvas" xmlns:cx="http://schemas.microsoft.com/office/drawing/2014/chartex" xmlns:cx1="http://schemas.microsoft.com/office/drawing/2015/9/8/chartex" xmlns:cx2="http://schemas.microsoft.com/office/drawing/2015/10/21/chartex" xmlns:cx3="http://schemas.microsoft.com/office/drawing/2016/5/9/chartex" xmlns:cx4="http://schemas.microsoft.com/office/drawing/2016/5/10/chartex" xmlns:cx5="http://schemas.microsoft.com/office/drawing/2016/5/11/chartex" xmlns:cx6="http://schemas.microsoft.com/office/drawing/2016/5/12/chartex" xmlns:cx7="http://schemas.microsoft.com/office/drawing/2016/5/13/chartex" xmlns:cx8="http://schemas.microsoft.com/office/drawing/2016/5/14/chartex" xmlns:mc="http://schemas.openxmlformats.org/markup-compatibility/2006" xmlns:aink="http://schemas.microsoft.com/office/drawing/2016/ink" xmlns:am3d="http://schemas.microsoft.com/office/drawing/2017/model3d" xmlns:o="urn:schemas-microsoft-com:office:office" xmlns:r="http://schemas.openxmlformats.org/officeDocument/2006/relationships" xmlns:m="http://schemas.openxmlformats.org/officeDocument/2006/math" xmlns:v="urn:schemas-microsoft-com:vml" xmlns:wp14="http://schemas.microsoft.com/office/word/2010/wordprocessingDrawing" xmlns:wp="http://schemas.openxmlformats.org/drawingml/2006/wordprocessingDrawing" xmlns:w10="urn:schemas-microsoft-com:office:word" xmlns:w="http://schemas.openxmlformats.org/wordprocessingml/2006/main" xmlns:w14="http://schemas.microsoft.com/office/word/2010/wordml" xmlns:w15="http://schemas.microsoft.com/office/word/2012/wordml" xmlns:w16cex="http://schemas.microsoft.com/office/word/2018/wordml/cex" xmlns:w16cid="http://schemas.microsoft.com/office/word/2016/wordml/cid" xmlns:w16="http://schemas.microsoft.com/office/word/2018/wordml" xmlns:w16sdtdh="http://schemas.microsoft.com/office/word/2020/wordml/sdtdatahash" xmlns:w16se="http://schemas.microsoft.com/office/word/2015/wordml/symex" xmlns:wpg="http://schemas.microsoft.com/office/word/2010/wordprocessingGroup" xmlns:wpi="http://schemas.microsoft.com/office/word/2010/wordprocessingInk" xmlns:wne="http://schemas.microsoft.com/office/word/2006/wordml" xmlns:wps="http://schemas.microsoft.com/office/word/2010/wordprocessingShape" mc:Ignorable="w14 w15 w16se w16cid w16 w16cex w16sdtdh wp14">
+  <w:p/>
+</w:ftr>
+</file>
+
+<file path=word/footer19.xml><?xml version="1.0" encoding="utf-8"?>
+<w:ftr xmlns:wpc="http://schemas.microsoft.com/office/word/2010/wordprocessingCanvas" xmlns:cx="http://schemas.microsoft.com/office/drawing/2014/chartex" xmlns:cx1="http://schemas.microsoft.com/office/drawing/2015/9/8/chartex" xmlns:cx2="http://schemas.microsoft.com/office/drawing/2015/10/21/chartex" xmlns:cx3="http://schemas.microsoft.com/office/drawing/2016/5/9/chartex" xmlns:cx4="http://schemas.microsoft.com/office/drawing/2016/5/10/chartex" xmlns:cx5="http://schemas.microsoft.com/office/drawing/2016/5/11/chartex" xmlns:cx6="http://schemas.microsoft.com/office/drawing/2016/5/12/chartex" xmlns:cx7="http://schemas.microsoft.com/office/drawing/2016/5/13/chartex" xmlns:cx8="http://schemas.microsoft.com/office/drawing/2016/5/14/chartex" xmlns:mc="http://schemas.openxmlformats.org/markup-compatibility/2006" xmlns:aink="http://schemas.microsoft.com/office/drawing/2016/ink" xmlns:am3d="http://schemas.microsoft.com/office/drawing/2017/model3d" xmlns:o="urn:schemas-microsoft-com:office:office" xmlns:r="http://schemas.openxmlformats.org/officeDocument/2006/relationships" xmlns:m="http://schemas.openxmlformats.org/officeDocument/2006/math" xmlns:v="urn:schemas-microsoft-com:vml" xmlns:wp14="http://schemas.microsoft.com/office/word/2010/wordprocessingDrawing" xmlns:wp="http://schemas.openxmlformats.org/drawingml/2006/wordprocessingDrawing" xmlns:w10="urn:schemas-microsoft-com:office:word" xmlns:w="http://schemas.openxmlformats.org/wordprocessingml/2006/main" xmlns:w14="http://schemas.microsoft.com/office/word/2010/wordml" xmlns:w15="http://schemas.microsoft.com/office/word/2012/wordml" xmlns:w16cex="http://schemas.microsoft.com/office/word/2018/wordml/cex" xmlns:w16cid="http://schemas.microsoft.com/office/word/2016/wordml/cid" xmlns:w16="http://schemas.microsoft.com/office/word/2018/wordml" xmlns:w16sdtdh="http://schemas.microsoft.com/office/word/2020/wordml/sdtdatahash" xmlns:w16se="http://schemas.microsoft.com/office/word/2015/wordml/symex" xmlns:wpg="http://schemas.microsoft.com/office/word/2010/wordprocessingGroup" xmlns:wpi="http://schemas.microsoft.com/office/word/2010/wordprocessingInk" xmlns:wne="http://schemas.microsoft.com/office/word/2006/wordml" xmlns:wps="http://schemas.microsoft.com/office/word/2010/wordprocessingShape" mc:Ignorable="w14 w15 w16se w16cid w16 w16cex w16sdtdh wp14">
+  <w:p/>
 </w:ftr>
 </file>
 
 <file path=word/footer2.xml><?xml version="1.0" encoding="utf-8"?>
 <w:ftr xmlns:wpc="http://schemas.microsoft.com/office/word/2010/wordprocessingCanvas" xmlns:cx="http://schemas.microsoft.com/office/drawing/2014/chartex" xmlns:cx1="http://schemas.microsoft.com/office/drawing/2015/9/8/chartex" xmlns:cx2="http://schemas.microsoft.com/office/drawing/2015/10/21/chartex" xmlns:cx3="http://schemas.microsoft.com/office/drawing/2016/5/9/chartex" xmlns:cx4="http://schemas.microsoft.com/office/drawing/2016/5/10/chartex" xmlns:cx5="http://schemas.microsoft.com/office/drawing/2016/5/11/chartex" xmlns:cx6="http://schemas.microsoft.com/office/drawing/2016/5/12/chartex" xmlns:cx7="http://schemas.microsoft.com/office/drawing/2016/5/13/chartex" xmlns:cx8="http://schemas.microsoft.com/office/drawing/2016/5/14/chartex" xmlns:mc="http://schemas.openxmlformats.org/markup-compatibility/2006" xmlns:aink="http://schemas.microsoft.com/office/drawing/2016/ink" xmlns:am3d="http://schemas.microsoft.com/office/drawing/2017/model3d" xmlns:o="urn:schemas-microsoft-com:office:office" xmlns:r="http://schemas.openxmlformats.org/officeDocument/2006/relationships" xmlns:m="http://schemas.openxmlformats.org/officeDocument/2006/math" xmlns:v="urn:schemas-microsoft-com:vml" xmlns:wp14="http://schemas.microsoft.com/office/word/2010/wordprocessingDrawing" xmlns:wp="http://schemas.openxmlformats.org/drawingml/2006/wordprocessingDrawing" xmlns:w10="urn:schemas-microsoft-com:office:word" xmlns:w="http://schemas.openxmlformats.org/wordprocessingml/2006/main" xmlns:w14="http://schemas.microsoft.com/office/word/2010/wordml" xmlns:w15="http://schemas.microsoft.com/office/word/2012/wordml" xmlns:w16cex="http://schemas.microsoft.com/office/word/2018/wordml/cex" xmlns:w16cid="http://schemas.microsoft.com/office/word/2016/wordml/cid" xmlns:w16="http://schemas.microsoft.com/office/word/2018/wordml" xmlns:w16sdtdh="http://schemas.microsoft.com/office/word/2020/wordml/sdtdatahash" xmlns:w16se="http://schemas.microsoft.com/office/word/2015/wordml/symex" xmlns:wpg="http://schemas.microsoft.com/office/word/2010/wordprocessingGroup" xmlns:wpi="http://schemas.microsoft.com/office/word/2010/wordprocessingInk" xmlns:wne="http://schemas.microsoft.com/office/word/2006/wordml" xmlns:wps="http://schemas.microsoft.com/office/word/2010/wordprocessingShape" mc:Ignorable="w14 w15 w16se w16cid w16 w16cex w16sdtdh wp14">
-  <w:p>
-    <w:pPr>
-      <w:pStyle w:val="Corpsdetexte"/>
-      <w:spacing w:line="14" w:lineRule="auto"/>
-      <w:rPr>
-        <w:sz w:val="20"/>
-      </w:rPr>
-    </w:pPr>
-    <w:r>
-      <w:rPr>
-        <w:noProof/>
-        <w:sz w:val="20"/>
-      </w:rPr>
-      <mc:AlternateContent>
-        <mc:Choice Requires="wps">
-          <w:drawing>
-            <wp:anchor distT="0" distB="0" distL="0" distR="0" simplePos="0" relativeHeight="487142912" behindDoc="1" locked="0" layoutInCell="1" allowOverlap="1" wp14:anchorId="3EBBB5E8" wp14:editId="423E53BB">
-              <wp:simplePos x="0" y="0"/>
-              <wp:positionH relativeFrom="page">
-                <wp:posOffset>3698747</wp:posOffset>
-              </wp:positionH>
-              <wp:positionV relativeFrom="page">
-                <wp:posOffset>9866203</wp:posOffset>
-              </wp:positionV>
-              <wp:extent cx="174625" cy="203835"/>
-              <wp:effectExtent l="0" t="0" r="0" b="0"/>
-              <wp:wrapNone/>
-              <wp:docPr id="13" name="Textbox 13"/>
-              <wp:cNvGraphicFramePr>
-                <a:graphicFrameLocks xmlns:a="http://schemas.openxmlformats.org/drawingml/2006/main"/>
-              </wp:cNvGraphicFramePr>
-              <a:graphic xmlns:a="http://schemas.openxmlformats.org/drawingml/2006/main">
-                <a:graphicData uri="http://schemas.microsoft.com/office/word/2010/wordprocessingShape">
-                  <wps:wsp>
-                    <wps:cNvSpPr txBox="1">
-                      <a:spLocks/>
-                    </wps:cNvSpPr>
-                    <wps:spPr>
-                      <a:xfrm>
-                        <a:off x="0" y="0"/>
-                        <a:ext cx="174625" cy="203835"/>
-                      </a:xfrm>
-                      <a:prstGeom prst="rect">
-                        <a:avLst/>
-                      </a:prstGeom>
-                    </wps:spPr>
-                    <wps:txbx>
-                      <w:txbxContent>
-                        <w:p>
-                          <w:pPr>
-                            <w:spacing w:line="299" w:lineRule="exact"/>
-                            <w:ind w:left="60"/>
-                            <w:rPr>
-                              <w:b/>
-                              <w:sz w:val="28"/>
-                            </w:rPr>
-                          </w:pPr>
-                          <w:r>
-                            <w:rPr>
-                              <w:b/>
-                              <w:spacing w:val="-10"/>
-                              <w:sz w:val="28"/>
-                            </w:rPr>
-                            <w:fldChar w:fldCharType="begin"/>
-                          </w:r>
-                          <w:r>
-                            <w:rPr>
-                              <w:b/>
-                              <w:spacing w:val="-10"/>
-                              <w:sz w:val="28"/>
-                            </w:rPr>
-                            <w:instrText xml:space="preserve"> PAGE </w:instrText>
-                          </w:r>
-                          <w:r>
-                            <w:rPr>
-                              <w:b/>
-                              <w:spacing w:val="-10"/>
-                              <w:sz w:val="28"/>
-                            </w:rPr>
-                            <w:fldChar w:fldCharType="separate"/>
-                          </w:r>
-                          <w:r>
-                            <w:rPr>
-                              <w:b/>
-                              <w:spacing w:val="-10"/>
-                              <w:sz w:val="28"/>
-                            </w:rPr>
-                            <w:t>2</w:t>
-                          </w:r>
-                          <w:r>
-                            <w:rPr>
-                              <w:b/>
-                              <w:spacing w:val="-10"/>
-                              <w:sz w:val="28"/>
-                            </w:rPr>
-                            <w:fldChar w:fldCharType="end"/>
-                          </w:r>
-                        </w:p>
-                      </w:txbxContent>
-                    </wps:txbx>
-                    <wps:bodyPr wrap="square" lIns="0" tIns="0" rIns="0" bIns="0" rtlCol="0">
-                      <a:noAutofit/>
-                    </wps:bodyPr>
-                  </wps:wsp>
-                </a:graphicData>
-              </a:graphic>
-            </wp:anchor>
-          </w:drawing>
-        </mc:Choice>
-        <mc:Fallback>
-          <w:pict>
-            <v:shapetype w14:anchorId="3EBBB5E8" id="_x0000_t202" coordsize="21600,21600" o:spt="202" path="m,l,21600r21600,l21600,xe">
-              <v:stroke joinstyle="miter"/>
-              <v:path gradientshapeok="t" o:connecttype="rect"/>
-            </v:shapetype>
-            <v:shape id="Textbox 13" o:spid="_x0000_s1027" type="#_x0000_t202" style="position:absolute;margin-left:291.25pt;margin-top:776.85pt;width:13.75pt;height:16.05pt;z-index:-16173568;visibility:visible;mso-wrap-style:square;mso-wrap-distance-left:0;mso-wrap-distance-top:0;mso-wrap-distance-right:0;mso-wrap-distance-bottom:0;mso-position-horizontal:absolute;mso-position-horizontal-relative:page;mso-position-vertical:absolute;mso-position-vertical-relative:page;v-text-anchor:top" o:gfxdata="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" filled="f" stroked="f">
-              <v:textbox inset="0,0,0,0">
-                <w:txbxContent>
-                  <w:p>
-                    <w:pPr>
-                      <w:spacing w:line="299" w:lineRule="exact"/>
-                      <w:ind w:left="60"/>
-                      <w:rPr>
-                        <w:b/>
-                        <w:sz w:val="28"/>
-                      </w:rPr>
-                    </w:pPr>
-                    <w:r>
-                      <w:rPr>
-                        <w:b/>
-                        <w:spacing w:val="-10"/>
-                        <w:sz w:val="28"/>
-                      </w:rPr>
-                      <w:fldChar w:fldCharType="begin"/>
-                    </w:r>
-                    <w:r>
-                      <w:rPr>
-                        <w:b/>
-                        <w:spacing w:val="-10"/>
-                        <w:sz w:val="28"/>
-                      </w:rPr>
-                      <w:instrText xml:space="preserve"> PAGE </w:instrText>
-                    </w:r>
-                    <w:r>
-                      <w:rPr>
-                        <w:b/>
-                        <w:spacing w:val="-10"/>
-                        <w:sz w:val="28"/>
-                      </w:rPr>
-                      <w:fldChar w:fldCharType="separate"/>
-                    </w:r>
-                    <w:r>
-                      <w:rPr>
-                        <w:b/>
-                        <w:spacing w:val="-10"/>
-                        <w:sz w:val="28"/>
-                      </w:rPr>
-                      <w:t>2</w:t>
-                    </w:r>
-                    <w:r>
-                      <w:rPr>
-                        <w:b/>
-                        <w:spacing w:val="-10"/>
-                        <w:sz w:val="28"/>
-                      </w:rPr>
-                      <w:fldChar w:fldCharType="end"/>
-                    </w:r>
-                  </w:p>
-                </w:txbxContent>
-              </v:textbox>
-              <w10:wrap anchorx="page" anchory="page"/>
-            </v:shape>
-          </w:pict>
-        </mc:Fallback>
-      </mc:AlternateContent>
-    </w:r>
-  </w:p>
+  <w:p/>
+</w:ftr>
+</file>
+
+<file path=word/footer20.xml><?xml version="1.0" encoding="utf-8"?>
+<w:ftr xmlns:wpc="http://schemas.microsoft.com/office/word/2010/wordprocessingCanvas" xmlns:cx="http://schemas.microsoft.com/office/drawing/2014/chartex" xmlns:cx1="http://schemas.microsoft.com/office/drawing/2015/9/8/chartex" xmlns:cx2="http://schemas.microsoft.com/office/drawing/2015/10/21/chartex" xmlns:cx3="http://schemas.microsoft.com/office/drawing/2016/5/9/chartex" xmlns:cx4="http://schemas.microsoft.com/office/drawing/2016/5/10/chartex" xmlns:cx5="http://schemas.microsoft.com/office/drawing/2016/5/11/chartex" xmlns:cx6="http://schemas.microsoft.com/office/drawing/2016/5/12/chartex" xmlns:cx7="http://schemas.microsoft.com/office/drawing/2016/5/13/chartex" xmlns:cx8="http://schemas.microsoft.com/office/drawing/2016/5/14/chartex" xmlns:mc="http://schemas.openxmlformats.org/markup-compatibility/2006" xmlns:aink="http://schemas.microsoft.com/office/drawing/2016/ink" xmlns:am3d="http://schemas.microsoft.com/office/drawing/2017/model3d" xmlns:o="urn:schemas-microsoft-com:office:office" xmlns:r="http://schemas.openxmlformats.org/officeDocument/2006/relationships" xmlns:m="http://schemas.openxmlformats.org/officeDocument/2006/math" xmlns:v="urn:schemas-microsoft-com:vml" xmlns:wp14="http://schemas.microsoft.com/office/word/2010/wordprocessingDrawing" xmlns:wp="http://schemas.openxmlformats.org/drawingml/2006/wordprocessingDrawing" xmlns:w10="urn:schemas-microsoft-com:office:word" xmlns:w="http://schemas.openxmlformats.org/wordprocessingml/2006/main" xmlns:w14="http://schemas.microsoft.com/office/word/2010/wordml" xmlns:w15="http://schemas.microsoft.com/office/word/2012/wordml" xmlns:w16cex="http://schemas.microsoft.com/office/word/2018/wordml/cex" xmlns:w16cid="http://schemas.microsoft.com/office/word/2016/wordml/cid" xmlns:w16="http://schemas.microsoft.com/office/word/2018/wordml" xmlns:w16sdtdh="http://schemas.microsoft.com/office/word/2020/wordml/sdtdatahash" xmlns:w16se="http://schemas.microsoft.com/office/word/2015/wordml/symex" xmlns:wpg="http://schemas.microsoft.com/office/word/2010/wordprocessingGroup" xmlns:wpi="http://schemas.microsoft.com/office/word/2010/wordprocessingInk" xmlns:wne="http://schemas.microsoft.com/office/word/2006/wordml" xmlns:wps="http://schemas.microsoft.com/office/word/2010/wordprocessingShape" mc:Ignorable="w14 w15 w16se w16cid w16 w16cex w16sdtdh wp14">
+  <w:p/>
+</w:ftr>
+</file>
+
+<file path=word/footer21.xml><?xml version="1.0" encoding="utf-8"?>
+<w:ftr xmlns:wpc="http://schemas.microsoft.com/office/word/2010/wordprocessingCanvas" xmlns:cx="http://schemas.microsoft.com/office/drawing/2014/chartex" xmlns:cx1="http://schemas.microsoft.com/office/drawing/2015/9/8/chartex" xmlns:cx2="http://schemas.microsoft.com/office/drawing/2015/10/21/chartex" xmlns:cx3="http://schemas.microsoft.com/office/drawing/2016/5/9/chartex" xmlns:cx4="http://schemas.microsoft.com/office/drawing/2016/5/10/chartex" xmlns:cx5="http://schemas.microsoft.com/office/drawing/2016/5/11/chartex" xmlns:cx6="http://schemas.microsoft.com/office/drawing/2016/5/12/chartex" xmlns:cx7="http://schemas.microsoft.com/office/drawing/2016/5/13/chartex" xmlns:cx8="http://schemas.microsoft.com/office/drawing/2016/5/14/chartex" xmlns:mc="http://schemas.openxmlformats.org/markup-compatibility/2006" xmlns:aink="http://schemas.microsoft.com/office/drawing/2016/ink" xmlns:am3d="http://schemas.microsoft.com/office/drawing/2017/model3d" xmlns:o="urn:schemas-microsoft-com:office:office" xmlns:r="http://schemas.openxmlformats.org/officeDocument/2006/relationships" xmlns:m="http://schemas.openxmlformats.org/officeDocument/2006/math" xmlns:v="urn:schemas-microsoft-com:vml" xmlns:wp14="http://schemas.microsoft.com/office/word/2010/wordprocessingDrawing" xmlns:wp="http://schemas.openxmlformats.org/drawingml/2006/wordprocessingDrawing" xmlns:w10="urn:schemas-microsoft-com:office:word" xmlns:w="http://schemas.openxmlformats.org/wordprocessingml/2006/main" xmlns:w14="http://schemas.microsoft.com/office/word/2010/wordml" xmlns:w15="http://schemas.microsoft.com/office/word/2012/wordml" xmlns:w16cex="http://schemas.microsoft.com/office/word/2018/wordml/cex" xmlns:w16cid="http://schemas.microsoft.com/office/word/2016/wordml/cid" xmlns:w16="http://schemas.microsoft.com/office/word/2018/wordml" xmlns:w16sdtdh="http://schemas.microsoft.com/office/word/2020/wordml/sdtdatahash" xmlns:w16se="http://schemas.microsoft.com/office/word/2015/wordml/symex" xmlns:wpg="http://schemas.microsoft.com/office/word/2010/wordprocessingGroup" xmlns:wpi="http://schemas.microsoft.com/office/word/2010/wordprocessingInk" xmlns:wne="http://schemas.microsoft.com/office/word/2006/wordml" xmlns:wps="http://schemas.microsoft.com/office/word/2010/wordprocessingShape" mc:Ignorable="w14 w15 w16se w16cid w16 w16cex w16sdtdh wp14">
+  <w:p/>
+</w:ftr>
+</file>
+
+<file path=word/footer22.xml><?xml version="1.0" encoding="utf-8"?>
+<w:ftr xmlns:wpc="http://schemas.microsoft.com/office/word/2010/wordprocessingCanvas" xmlns:cx="http://schemas.microsoft.com/office/drawing/2014/chartex" xmlns:cx1="http://schemas.microsoft.com/office/drawing/2015/9/8/chartex" xmlns:cx2="http://schemas.microsoft.com/office/drawing/2015/10/21/chartex" xmlns:cx3="http://schemas.microsoft.com/office/drawing/2016/5/9/chartex" xmlns:cx4="http://schemas.microsoft.com/office/drawing/2016/5/10/chartex" xmlns:cx5="http://schemas.microsoft.com/office/drawing/2016/5/11/chartex" xmlns:cx6="http://schemas.microsoft.com/office/drawing/2016/5/12/chartex" xmlns:cx7="http://schemas.microsoft.com/office/drawing/2016/5/13/chartex" xmlns:cx8="http://schemas.microsoft.com/office/drawing/2016/5/14/chartex" xmlns:mc="http://schemas.openxmlformats.org/markup-compatibility/2006" xmlns:aink="http://schemas.microsoft.com/office/drawing/2016/ink" xmlns:am3d="http://schemas.microsoft.com/office/drawing/2017/model3d" xmlns:o="urn:schemas-microsoft-com:office:office" xmlns:r="http://schemas.openxmlformats.org/officeDocument/2006/relationships" xmlns:m="http://schemas.openxmlformats.org/officeDocument/2006/math" xmlns:v="urn:schemas-microsoft-com:vml" xmlns:wp14="http://schemas.microsoft.com/office/word/2010/wordprocessingDrawing" xmlns:wp="http://schemas.openxmlformats.org/drawingml/2006/wordprocessingDrawing" xmlns:w10="urn:schemas-microsoft-com:office:word" xmlns:w="http://schemas.openxmlformats.org/wordprocessingml/2006/main" xmlns:w14="http://schemas.microsoft.com/office/word/2010/wordml" xmlns:w15="http://schemas.microsoft.com/office/word/2012/wordml" xmlns:w16cex="http://schemas.microsoft.com/office/word/2018/wordml/cex" xmlns:w16cid="http://schemas.microsoft.com/office/word/2016/wordml/cid" xmlns:w16="http://schemas.microsoft.com/office/word/2018/wordml" xmlns:w16sdtdh="http://schemas.microsoft.com/office/word/2020/wordml/sdtdatahash" xmlns:w16se="http://schemas.microsoft.com/office/word/2015/wordml/symex" xmlns:wpg="http://schemas.microsoft.com/office/word/2010/wordprocessingGroup" xmlns:wpi="http://schemas.microsoft.com/office/word/2010/wordprocessingInk" xmlns:wne="http://schemas.microsoft.com/office/word/2006/wordml" xmlns:wps="http://schemas.microsoft.com/office/word/2010/wordprocessingShape" mc:Ignorable="w14 w15 w16se w16cid w16 w16cex w16sdtdh wp14">
+  <w:p/>
+</w:ftr>
+</file>
+
+<file path=word/footer23.xml><?xml version="1.0" encoding="utf-8"?>
+<w:ftr xmlns:wpc="http://schemas.microsoft.com/office/word/2010/wordprocessingCanvas" xmlns:cx="http://schemas.microsoft.com/office/drawing/2014/chartex" xmlns:cx1="http://schemas.microsoft.com/office/drawing/2015/9/8/chartex" xmlns:cx2="http://schemas.microsoft.com/office/drawing/2015/10/21/chartex" xmlns:cx3="http://schemas.microsoft.com/office/drawing/2016/5/9/chartex" xmlns:cx4="http://schemas.microsoft.com/office/drawing/2016/5/10/chartex" xmlns:cx5="http://schemas.microsoft.com/office/drawing/2016/5/11/chartex" xmlns:cx6="http://schemas.microsoft.com/office/drawing/2016/5/12/chartex" xmlns:cx7="http://schemas.microsoft.com/office/drawing/2016/5/13/chartex" xmlns:cx8="http://schemas.microsoft.com/office/drawing/2016/5/14/chartex" xmlns:mc="http://schemas.openxmlformats.org/markup-compatibility/2006" xmlns:aink="http://schemas.microsoft.com/office/drawing/2016/ink" xmlns:am3d="http://schemas.microsoft.com/office/drawing/2017/model3d" xmlns:o="urn:schemas-microsoft-com:office:office" xmlns:r="http://schemas.openxmlformats.org/officeDocument/2006/relationships" xmlns:m="http://schemas.openxmlformats.org/officeDocument/2006/math" xmlns:v="urn:schemas-microsoft-com:vml" xmlns:wp14="http://schemas.microsoft.com/office/word/2010/wordprocessingDrawing" xmlns:wp="http://schemas.openxmlformats.org/drawingml/2006/wordprocessingDrawing" xmlns:w10="urn:schemas-microsoft-com:office:word" xmlns:w="http://schemas.openxmlformats.org/wordprocessingml/2006/main" xmlns:w14="http://schemas.microsoft.com/office/word/2010/wordml" xmlns:w15="http://schemas.microsoft.com/office/word/2012/wordml" xmlns:w16cex="http://schemas.microsoft.com/office/word/2018/wordml/cex" xmlns:w16cid="http://schemas.microsoft.com/office/word/2016/wordml/cid" xmlns:w16="http://schemas.microsoft.com/office/word/2018/wordml" xmlns:w16sdtdh="http://schemas.microsoft.com/office/word/2020/wordml/sdtdatahash" xmlns:w16se="http://schemas.microsoft.com/office/word/2015/wordml/symex" xmlns:wpg="http://schemas.microsoft.com/office/word/2010/wordprocessingGroup" xmlns:wpi="http://schemas.microsoft.com/office/word/2010/wordprocessingInk" xmlns:wne="http://schemas.microsoft.com/office/word/2006/wordml" xmlns:wps="http://schemas.microsoft.com/office/word/2010/wordprocessingShape" mc:Ignorable="w14 w15 w16se w16cid w16 w16cex w16sdtdh wp14">
+  <w:p/>
+</w:ftr>
+</file>
+
+<file path=word/footer24.xml><?xml version="1.0" encoding="utf-8"?>
+<w:ftr xmlns:wpc="http://schemas.microsoft.com/office/word/2010/wordprocessingCanvas" xmlns:cx="http://schemas.microsoft.com/office/drawing/2014/chartex" xmlns:cx1="http://schemas.microsoft.com/office/drawing/2015/9/8/chartex" xmlns:cx2="http://schemas.microsoft.com/office/drawing/2015/10/21/chartex" xmlns:cx3="http://schemas.microsoft.com/office/drawing/2016/5/9/chartex" xmlns:cx4="http://schemas.microsoft.com/office/drawing/2016/5/10/chartex" xmlns:cx5="http://schemas.microsoft.com/office/drawing/2016/5/11/chartex" xmlns:cx6="http://schemas.microsoft.com/office/drawing/2016/5/12/chartex" xmlns:cx7="http://schemas.microsoft.com/office/drawing/2016/5/13/chartex" xmlns:cx8="http://schemas.microsoft.com/office/drawing/2016/5/14/chartex" xmlns:mc="http://schemas.openxmlformats.org/markup-compatibility/2006" xmlns:aink="http://schemas.microsoft.com/office/drawing/2016/ink" xmlns:am3d="http://schemas.microsoft.com/office/drawing/2017/model3d" xmlns:o="urn:schemas-microsoft-com:office:office" xmlns:r="http://schemas.openxmlformats.org/officeDocument/2006/relationships" xmlns:m="http://schemas.openxmlformats.org/officeDocument/2006/math" xmlns:v="urn:schemas-microsoft-com:vml" xmlns:wp14="http://schemas.microsoft.com/office/word/2010/wordprocessingDrawing" xmlns:wp="http://schemas.openxmlformats.org/drawingml/2006/wordprocessingDrawing" xmlns:w10="urn:schemas-microsoft-com:office:word" xmlns:w="http://schemas.openxmlformats.org/wordprocessingml/2006/main" xmlns:w14="http://schemas.microsoft.com/office/word/2010/wordml" xmlns:w15="http://schemas.microsoft.com/office/word/2012/wordml" xmlns:w16cex="http://schemas.microsoft.com/office/word/2018/wordml/cex" xmlns:w16cid="http://schemas.microsoft.com/office/word/2016/wordml/cid" xmlns:w16="http://schemas.microsoft.com/office/word/2018/wordml" xmlns:w16sdtdh="http://schemas.microsoft.com/office/word/2020/wordml/sdtdatahash" xmlns:w16se="http://schemas.microsoft.com/office/word/2015/wordml/symex" xmlns:wpg="http://schemas.microsoft.com/office/word/2010/wordprocessingGroup" xmlns:wpi="http://schemas.microsoft.com/office/word/2010/wordprocessingInk" xmlns:wne="http://schemas.microsoft.com/office/word/2006/wordml" xmlns:wps="http://schemas.microsoft.com/office/word/2010/wordprocessingShape" mc:Ignorable="w14 w15 w16se w16cid w16 w16cex w16sdtdh wp14">
+  <w:p/>
 </w:ftr>
 </file>
 
 <file path=word/footer3.xml><?xml version="1.0" encoding="utf-8"?>
 <w:ftr xmlns:wpc="http://schemas.microsoft.com/office/word/2010/wordprocessingCanvas" xmlns:cx="http://schemas.microsoft.com/office/drawing/2014/chartex" xmlns:cx1="http://schemas.microsoft.com/office/drawing/2015/9/8/chartex" xmlns:cx2="http://schemas.microsoft.com/office/drawing/2015/10/21/chartex" xmlns:cx3="http://schemas.microsoft.com/office/drawing/2016/5/9/chartex" xmlns:cx4="http://schemas.microsoft.com/office/drawing/2016/5/10/chartex" xmlns:cx5="http://schemas.microsoft.com/office/drawing/2016/5/11/chartex" xmlns:cx6="http://schemas.microsoft.com/office/drawing/2016/5/12/chartex" xmlns:cx7="http://schemas.microsoft.com/office/drawing/2016/5/13/chartex" xmlns:cx8="http://schemas.microsoft.com/office/drawing/2016/5/14/chartex" xmlns:mc="http://schemas.openxmlformats.org/markup-compatibility/2006" xmlns:aink="http://schemas.microsoft.com/office/drawing/2016/ink" xmlns:am3d="http://schemas.microsoft.com/office/drawing/2017/model3d" xmlns:o="urn:schemas-microsoft-com:office:office" xmlns:r="http://schemas.openxmlformats.org/officeDocument/2006/relationships" xmlns:m="http://schemas.openxmlformats.org/officeDocument/2006/math" xmlns:v="urn:schemas-microsoft-com:vml" xmlns:wp14="http://schemas.microsoft.com/office/word/2010/wordprocessingDrawing" xmlns:wp="http://schemas.openxmlformats.org/drawingml/2006/wordprocessingDrawing" xmlns:w10="urn:schemas-microsoft-com:office:word" xmlns:w="http://schemas.openxmlformats.org/wordprocessingml/2006/main" xmlns:w14="http://schemas.microsoft.com/office/word/2010/wordml" xmlns:w15="http://schemas.microsoft.com/office/word/2012/wordml" xmlns:w16cex="http://schemas.microsoft.com/office/word/2018/wordml/cex" xmlns:w16cid="http://schemas.microsoft.com/office/word/2016/wordml/cid" xmlns:w16="http://schemas.microsoft.com/office/word/2018/wordml" xmlns:w16sdtdh="http://schemas.microsoft.com/office/word/2020/wordml/sdtdatahash" xmlns:w16se="http://schemas.microsoft.com/office/word/2015/wordml/symex" xmlns:wpg="http://schemas.microsoft.com/office/word/2010/wordprocessingGroup" xmlns:wpi="http://schemas.microsoft.com/office/word/2010/wordprocessingInk" xmlns:wne="http://schemas.microsoft.com/office/word/2006/wordml" xmlns:wps="http://schemas.microsoft.com/office/word/2010/wordprocessingShape" mc:Ignorable="w14 w15 w16se w16cid w16 w16cex w16sdtdh wp14">
-  <w:p>
-    <w:pPr>
-      <w:pStyle w:val="Corpsdetexte"/>
-      <w:spacing w:line="14" w:lineRule="auto"/>
-      <w:rPr>
-        <w:sz w:val="20"/>
-      </w:rPr>
-    </w:pPr>
-    <w:r>
-      <w:rPr>
-        <w:noProof/>
-        <w:sz w:val="20"/>
-      </w:rPr>
-      <mc:AlternateContent>
-        <mc:Choice Requires="wps">
-          <w:drawing>
-            <wp:anchor distT="0" distB="0" distL="0" distR="0" simplePos="0" relativeHeight="251661824" behindDoc="1" locked="0" layoutInCell="1" allowOverlap="1" wp14:anchorId="769858AF" wp14:editId="4D8F24E3">
-              <wp:simplePos x="0" y="0"/>
-              <wp:positionH relativeFrom="page">
-                <wp:posOffset>5255767</wp:posOffset>
-              </wp:positionH>
-              <wp:positionV relativeFrom="page">
-                <wp:posOffset>6734384</wp:posOffset>
-              </wp:positionV>
-              <wp:extent cx="180340" cy="203835"/>
-              <wp:effectExtent l="0" t="0" r="0" b="0"/>
-              <wp:wrapNone/>
-              <wp:docPr id="16" name="Textbox 16"/>
-              <wp:cNvGraphicFramePr>
-                <a:graphicFrameLocks xmlns:a="http://schemas.openxmlformats.org/drawingml/2006/main"/>
-              </wp:cNvGraphicFramePr>
-              <a:graphic xmlns:a="http://schemas.openxmlformats.org/drawingml/2006/main">
-                <a:graphicData uri="http://schemas.microsoft.com/office/word/2010/wordprocessingShape">
-                  <wps:wsp>
-                    <wps:cNvSpPr txBox="1">
-                      <a:spLocks/>
-                    </wps:cNvSpPr>
-                    <wps:spPr>
-                      <a:xfrm>
-                        <a:off x="0" y="0"/>
-                        <a:ext cx="180340" cy="203835"/>
-                      </a:xfrm>
-                      <a:prstGeom prst="rect">
-                        <a:avLst/>
-                      </a:prstGeom>
-                    </wps:spPr>
-                    <wps:txbx>
-                      <w:txbxContent>
-                        <w:p>
-                          <w:pPr>
-                            <w:spacing w:line="299" w:lineRule="exact"/>
-                            <w:ind w:left="20"/>
-                            <w:rPr>
-                              <w:b/>
-                              <w:sz w:val="28"/>
-                            </w:rPr>
-                          </w:pPr>
-                          <w:r>
-                            <w:rPr>
-                              <w:b/>
-                              <w:spacing w:val="-5"/>
-                              <w:sz w:val="28"/>
-                            </w:rPr>
-                            <w:fldChar w:fldCharType="begin"/>
-                          </w:r>
-                          <w:r>
-                            <w:rPr>
-                              <w:b/>
-                              <w:spacing w:val="-5"/>
-                              <w:sz w:val="28"/>
-                            </w:rPr>
-                            <w:instrText xml:space="preserve"> PAGE </w:instrText>
-                          </w:r>
-                          <w:r>
-                            <w:rPr>
-                              <w:b/>
-                              <w:spacing w:val="-5"/>
-                              <w:sz w:val="28"/>
-                            </w:rPr>
-                            <w:fldChar w:fldCharType="separate"/>
-                          </w:r>
-                          <w:r>
-                            <w:rPr>
-                              <w:b/>
-                              <w:spacing w:val="-5"/>
-                              <w:sz w:val="28"/>
-                            </w:rPr>
-                            <w:t>10</w:t>
-                          </w:r>
-                          <w:r>
-                            <w:rPr>
-                              <w:b/>
-                              <w:spacing w:val="-5"/>
-                              <w:sz w:val="28"/>
-                            </w:rPr>
-                            <w:fldChar w:fldCharType="end"/>
-                          </w:r>
-                        </w:p>
-                      </w:txbxContent>
-                    </wps:txbx>
-                    <wps:bodyPr wrap="square" lIns="0" tIns="0" rIns="0" bIns="0" rtlCol="0">
-                      <a:noAutofit/>
-                    </wps:bodyPr>
-                  </wps:wsp>
-                </a:graphicData>
-              </a:graphic>
-            </wp:anchor>
-          </w:drawing>
-        </mc:Choice>
-        <mc:Fallback>
-          <w:pict>
-            <v:shapetype w14:anchorId="769858AF" id="_x0000_t202" coordsize="21600,21600" o:spt="202" path="m,l,21600r21600,l21600,xe">
-              <v:stroke joinstyle="miter"/>
-              <v:path gradientshapeok="t" o:connecttype="rect"/>
-            </v:shapetype>
-            <v:shape id="Textbox 16" o:spid="_x0000_s1028" type="#_x0000_t202" style="position:absolute;margin-left:413.85pt;margin-top:530.25pt;width:14.2pt;height:16.05pt;z-index:-251654656;visibility:visible;mso-wrap-style:square;mso-wrap-distance-left:0;mso-wrap-distance-top:0;mso-wrap-distance-right:0;mso-wrap-distance-bottom:0;mso-position-horizontal:absolute;mso-position-horizontal-relative:page;mso-position-vertical:absolute;mso-position-vertical-relative:page;v-text-anchor:top" o:gfxdata="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" filled="f" stroked="f">
-              <v:textbox inset="0,0,0,0">
-                <w:txbxContent>
-                  <w:p>
-                    <w:pPr>
-                      <w:spacing w:line="299" w:lineRule="exact"/>
-                      <w:ind w:left="20"/>
-                      <w:rPr>
-                        <w:b/>
-                        <w:sz w:val="28"/>
-                      </w:rPr>
-                    </w:pPr>
-                    <w:r>
-                      <w:rPr>
-                        <w:b/>
-                        <w:spacing w:val="-5"/>
-                        <w:sz w:val="28"/>
-                      </w:rPr>
-                      <w:fldChar w:fldCharType="begin"/>
-                    </w:r>
-                    <w:r>
-                      <w:rPr>
-                        <w:b/>
-                        <w:spacing w:val="-5"/>
-                        <w:sz w:val="28"/>
-                      </w:rPr>
-                      <w:instrText xml:space="preserve"> PAGE </w:instrText>
-                    </w:r>
-                    <w:r>
-                      <w:rPr>
-                        <w:b/>
-                        <w:spacing w:val="-5"/>
-                        <w:sz w:val="28"/>
-                      </w:rPr>
-                      <w:fldChar w:fldCharType="separate"/>
-                    </w:r>
-                    <w:r>
-                      <w:rPr>
-                        <w:b/>
-                        <w:spacing w:val="-5"/>
-                        <w:sz w:val="28"/>
-                      </w:rPr>
-                      <w:t>10</w:t>
-                    </w:r>
-                    <w:r>
-                      <w:rPr>
-                        <w:b/>
-                        <w:spacing w:val="-5"/>
-                        <w:sz w:val="28"/>
-                      </w:rPr>
-                      <w:fldChar w:fldCharType="end"/>
-                    </w:r>
-                  </w:p>
-                </w:txbxContent>
-              </v:textbox>
-              <w10:wrap anchorx="page" anchory="page"/>
-            </v:shape>
-          </w:pict>
-        </mc:Fallback>
-      </mc:AlternateContent>
-    </w:r>
-  </w:p>
+  <w:p/>
 </w:ftr>
 </file>
 
 <file path=word/footer4.xml><?xml version="1.0" encoding="utf-8"?>
 <w:ftr xmlns:wpc="http://schemas.microsoft.com/office/word/2010/wordprocessingCanvas" xmlns:cx="http://schemas.microsoft.com/office/drawing/2014/chartex" xmlns:cx1="http://schemas.microsoft.com/office/drawing/2015/9/8/chartex" xmlns:cx2="http://schemas.microsoft.com/office/drawing/2015/10/21/chartex" xmlns:cx3="http://schemas.microsoft.com/office/drawing/2016/5/9/chartex" xmlns:cx4="http://schemas.microsoft.com/office/drawing/2016/5/10/chartex" xmlns:cx5="http://schemas.microsoft.com/office/drawing/2016/5/11/chartex" xmlns:cx6="http://schemas.microsoft.com/office/drawing/2016/5/12/chartex" xmlns:cx7="http://schemas.microsoft.com/office/drawing/2016/5/13/chartex" xmlns:cx8="http://schemas.microsoft.com/office/drawing/2016/5/14/chartex" xmlns:mc="http://schemas.openxmlformats.org/markup-compatibility/2006" xmlns:aink="http://schemas.microsoft.com/office/drawing/2016/ink" xmlns:am3d="http://schemas.microsoft.com/office/drawing/2017/model3d" xmlns:o="urn:schemas-microsoft-com:office:office" xmlns:r="http://schemas.openxmlformats.org/officeDocument/2006/relationships" xmlns:m="http://schemas.openxmlformats.org/officeDocument/2006/math" xmlns:v="urn:schemas-microsoft-com:vml" xmlns:wp14="http://schemas.microsoft.com/office/word/2010/wordprocessingDrawing" xmlns:wp="http://schemas.openxmlformats.org/drawingml/2006/wordprocessingDrawing" xmlns:w10="urn:schemas-microsoft-com:office:word" xmlns:w="http://schemas.openxmlformats.org/wordprocessingml/2006/main" xmlns:w14="http://schemas.microsoft.com/office/word/2010/wordml" xmlns:w15="http://schemas.microsoft.com/office/word/2012/wordml" xmlns:w16cex="http://schemas.microsoft.com/office/word/2018/wordml/cex" xmlns:w16cid="http://schemas.microsoft.com/office/word/2016/wordml/cid" xmlns:w16="http://schemas.microsoft.com/office/word/2018/wordml" xmlns:w16sdtdh="http://schemas.microsoft.com/office/word/2020/wordml/sdtdatahash" xmlns:w16se="http://schemas.microsoft.com/office/word/2015/wordml/symex" xmlns:wpg="http://schemas.microsoft.com/office/word/2010/wordprocessingGroup" xmlns:wpi="http://schemas.microsoft.com/office/word/2010/wordprocessingInk" xmlns:wne="http://schemas.microsoft.com/office/word/2006/wordml" xmlns:wps="http://schemas.microsoft.com/office/word/2010/wordprocessingShape" mc:Ignorable="w14 w15 w16se w16cid w16 w16cex w16sdtdh wp14">
-  <w:p>
-    <w:pPr>
-      <w:pStyle w:val="Corpsdetexte"/>
-      <w:spacing w:line="14" w:lineRule="auto"/>
-      <w:rPr>
-        <w:sz w:val="20"/>
-      </w:rPr>
-    </w:pPr>
-    <w:r>
-      <w:rPr>
-        <w:noProof/>
-        <w:sz w:val="20"/>
-      </w:rPr>
-      <mc:AlternateContent>
-        <mc:Choice Requires="wps">
-          <w:drawing>
-            <wp:anchor distT="0" distB="0" distL="0" distR="0" simplePos="0" relativeHeight="487145984" behindDoc="1" locked="0" layoutInCell="1" allowOverlap="1" wp14:anchorId="11A911B3" wp14:editId="1E18BD05">
-              <wp:simplePos x="0" y="0"/>
-              <wp:positionH relativeFrom="page">
-                <wp:posOffset>3668267</wp:posOffset>
-              </wp:positionH>
-              <wp:positionV relativeFrom="page">
-                <wp:posOffset>9866203</wp:posOffset>
-              </wp:positionV>
-              <wp:extent cx="240029" cy="203835"/>
-              <wp:effectExtent l="0" t="0" r="0" b="0"/>
-              <wp:wrapNone/>
-              <wp:docPr id="19" name="Textbox 19"/>
-              <wp:cNvGraphicFramePr>
-                <a:graphicFrameLocks xmlns:a="http://schemas.openxmlformats.org/drawingml/2006/main"/>
-              </wp:cNvGraphicFramePr>
-              <a:graphic xmlns:a="http://schemas.openxmlformats.org/drawingml/2006/main">
-                <a:graphicData uri="http://schemas.microsoft.com/office/word/2010/wordprocessingShape">
-                  <wps:wsp>
-                    <wps:cNvSpPr txBox="1">
-                      <a:spLocks/>
-                    </wps:cNvSpPr>
-                    <wps:spPr>
-                      <a:xfrm>
-                        <a:off x="0" y="0"/>
-                        <a:ext cx="240029" cy="203835"/>
-                      </a:xfrm>
-                      <a:prstGeom prst="rect">
-                        <a:avLst/>
-                      </a:prstGeom>
-                    </wps:spPr>
-                    <wps:txbx>
-                      <w:txbxContent>
-                        <w:p>
-                          <w:pPr>
-                            <w:spacing w:line="299" w:lineRule="exact"/>
-                            <w:ind w:left="52"/>
-                            <w:rPr>
-                              <w:b/>
-                              <w:sz w:val="28"/>
-                            </w:rPr>
-                          </w:pPr>
-                          <w:r>
-                            <w:rPr>
-                              <w:b/>
-                              <w:spacing w:val="-5"/>
-                              <w:sz w:val="28"/>
-                            </w:rPr>
-                            <w:fldChar w:fldCharType="begin"/>
-                          </w:r>
-                          <w:r>
-                            <w:rPr>
-                              <w:b/>
-                              <w:spacing w:val="-5"/>
-                              <w:sz w:val="28"/>
-                            </w:rPr>
-                            <w:instrText xml:space="preserve"> PAGE </w:instrText>
-                          </w:r>
-                          <w:r>
-                            <w:rPr>
-                              <w:b/>
-                              <w:spacing w:val="-5"/>
-                              <w:sz w:val="28"/>
-                            </w:rPr>
-                            <w:fldChar w:fldCharType="separate"/>
-                          </w:r>
-                          <w:r>
-                            <w:rPr>
-                              <w:b/>
-                              <w:spacing w:val="-5"/>
-                              <w:sz w:val="28"/>
-                            </w:rPr>
-                            <w:t>14</w:t>
-                          </w:r>
-                          <w:r>
-                            <w:rPr>
-                              <w:b/>
-                              <w:spacing w:val="-5"/>
-                              <w:sz w:val="28"/>
-                            </w:rPr>
-                            <w:fldChar w:fldCharType="end"/>
-                          </w:r>
-                        </w:p>
-                      </w:txbxContent>
-                    </wps:txbx>
-                    <wps:bodyPr wrap="square" lIns="0" tIns="0" rIns="0" bIns="0" rtlCol="0">
-                      <a:noAutofit/>
-                    </wps:bodyPr>
-                  </wps:wsp>
-                </a:graphicData>
-              </a:graphic>
-            </wp:anchor>
-          </w:drawing>
-        </mc:Choice>
-        <mc:Fallback>
-          <w:pict>
-            <v:shapetype w14:anchorId="11A911B3" id="_x0000_t202" coordsize="21600,21600" o:spt="202" path="m,l,21600r21600,l21600,xe">
-              <v:stroke joinstyle="miter"/>
-              <v:path gradientshapeok="t" o:connecttype="rect"/>
-            </v:shapetype>
-            <v:shape id="Textbox 19" o:spid="_x0000_s1029" type="#_x0000_t202" style="position:absolute;margin-left:288.85pt;margin-top:776.85pt;width:18.9pt;height:16.05pt;z-index:-16170496;visibility:visible;mso-wrap-style:square;mso-wrap-distance-left:0;mso-wrap-distance-top:0;mso-wrap-distance-right:0;mso-wrap-distance-bottom:0;mso-position-horizontal:absolute;mso-position-horizontal-relative:page;mso-position-vertical:absolute;mso-position-vertical-relative:page;v-text-anchor:top" o:gfxdata="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" filled="f" stroked="f">
-              <v:textbox inset="0,0,0,0">
-                <w:txbxContent>
-                  <w:p>
-                    <w:pPr>
-                      <w:spacing w:line="299" w:lineRule="exact"/>
-                      <w:ind w:left="52"/>
-                      <w:rPr>
-                        <w:b/>
-                        <w:sz w:val="28"/>
-                      </w:rPr>
-                    </w:pPr>
-                    <w:r>
-                      <w:rPr>
-                        <w:b/>
-                        <w:spacing w:val="-5"/>
-                        <w:sz w:val="28"/>
-                      </w:rPr>
-                      <w:fldChar w:fldCharType="begin"/>
-                    </w:r>
-                    <w:r>
-                      <w:rPr>
-                        <w:b/>
-                        <w:spacing w:val="-5"/>
-                        <w:sz w:val="28"/>
-                      </w:rPr>
-                      <w:instrText xml:space="preserve"> PAGE </w:instrText>
-                    </w:r>
-                    <w:r>
-                      <w:rPr>
-                        <w:b/>
-                        <w:spacing w:val="-5"/>
-                        <w:sz w:val="28"/>
-                      </w:rPr>
-                      <w:fldChar w:fldCharType="separate"/>
-                    </w:r>
-                    <w:r>
-                      <w:rPr>
-                        <w:b/>
-                        <w:spacing w:val="-5"/>
-                        <w:sz w:val="28"/>
-                      </w:rPr>
-                      <w:t>14</w:t>
-                    </w:r>
-                    <w:r>
-                      <w:rPr>
-                        <w:b/>
-                        <w:spacing w:val="-5"/>
-                        <w:sz w:val="28"/>
-                      </w:rPr>
-                      <w:fldChar w:fldCharType="end"/>
-                    </w:r>
-                  </w:p>
-                </w:txbxContent>
-              </v:textbox>
-              <w10:wrap anchorx="page" anchory="page"/>
-            </v:shape>
-          </w:pict>
-        </mc:Fallback>
-      </mc:AlternateContent>
-    </w:r>
-  </w:p>
+  <w:p/>
+</w:ftr>
+</file>
+
+<file path=word/footer5.xml><?xml version="1.0" encoding="utf-8"?>
+<w:ftr xmlns:wpc="http://schemas.microsoft.com/office/word/2010/wordprocessingCanvas" xmlns:cx="http://schemas.microsoft.com/office/drawing/2014/chartex" xmlns:cx1="http://schemas.microsoft.com/office/drawing/2015/9/8/chartex" xmlns:cx2="http://schemas.microsoft.com/office/drawing/2015/10/21/chartex" xmlns:cx3="http://schemas.microsoft.com/office/drawing/2016/5/9/chartex" xmlns:cx4="http://schemas.microsoft.com/office/drawing/2016/5/10/chartex" xmlns:cx5="http://schemas.microsoft.com/office/drawing/2016/5/11/chartex" xmlns:cx6="http://schemas.microsoft.com/office/drawing/2016/5/12/chartex" xmlns:cx7="http://schemas.microsoft.com/office/drawing/2016/5/13/chartex" xmlns:cx8="http://schemas.microsoft.com/office/drawing/2016/5/14/chartex" xmlns:mc="http://schemas.openxmlformats.org/markup-compatibility/2006" xmlns:aink="http://schemas.microsoft.com/office/drawing/2016/ink" xmlns:am3d="http://schemas.microsoft.com/office/drawing/2017/model3d" xmlns:o="urn:schemas-microsoft-com:office:office" xmlns:r="http://schemas.openxmlformats.org/officeDocument/2006/relationships" xmlns:m="http://schemas.openxmlformats.org/officeDocument/2006/math" xmlns:v="urn:schemas-microsoft-com:vml" xmlns:wp14="http://schemas.microsoft.com/office/word/2010/wordprocessingDrawing" xmlns:wp="http://schemas.openxmlformats.org/drawingml/2006/wordprocessingDrawing" xmlns:w10="urn:schemas-microsoft-com:office:word" xmlns:w="http://schemas.openxmlformats.org/wordprocessingml/2006/main" xmlns:w14="http://schemas.microsoft.com/office/word/2010/wordml" xmlns:w15="http://schemas.microsoft.com/office/word/2012/wordml" xmlns:w16cex="http://schemas.microsoft.com/office/word/2018/wordml/cex" xmlns:w16cid="http://schemas.microsoft.com/office/word/2016/wordml/cid" xmlns:w16="http://schemas.microsoft.com/office/word/2018/wordml" xmlns:w16sdtdh="http://schemas.microsoft.com/office/word/2020/wordml/sdtdatahash" xmlns:w16se="http://schemas.microsoft.com/office/word/2015/wordml/symex" xmlns:wpg="http://schemas.microsoft.com/office/word/2010/wordprocessingGroup" xmlns:wpi="http://schemas.microsoft.com/office/word/2010/wordprocessingInk" xmlns:wne="http://schemas.microsoft.com/office/word/2006/wordml" xmlns:wps="http://schemas.microsoft.com/office/word/2010/wordprocessingShape" mc:Ignorable="w14 w15 w16se w16cid w16 w16cex w16sdtdh wp14">
+  <w:p/>
+</w:ftr>
+</file>
+
+<file path=word/footer6.xml><?xml version="1.0" encoding="utf-8"?>
+<w:ftr xmlns:wpc="http://schemas.microsoft.com/office/word/2010/wordprocessingCanvas" xmlns:cx="http://schemas.microsoft.com/office/drawing/2014/chartex" xmlns:cx1="http://schemas.microsoft.com/office/drawing/2015/9/8/chartex" xmlns:cx2="http://schemas.microsoft.com/office/drawing/2015/10/21/chartex" xmlns:cx3="http://schemas.microsoft.com/office/drawing/2016/5/9/chartex" xmlns:cx4="http://schemas.microsoft.com/office/drawing/2016/5/10/chartex" xmlns:cx5="http://schemas.microsoft.com/office/drawing/2016/5/11/chartex" xmlns:cx6="http://schemas.microsoft.com/office/drawing/2016/5/12/chartex" xmlns:cx7="http://schemas.microsoft.com/office/drawing/2016/5/13/chartex" xmlns:cx8="http://schemas.microsoft.com/office/drawing/2016/5/14/chartex" xmlns:mc="http://schemas.openxmlformats.org/markup-compatibility/2006" xmlns:aink="http://schemas.microsoft.com/office/drawing/2016/ink" xmlns:am3d="http://schemas.microsoft.com/office/drawing/2017/model3d" xmlns:o="urn:schemas-microsoft-com:office:office" xmlns:r="http://schemas.openxmlformats.org/officeDocument/2006/relationships" xmlns:m="http://schemas.openxmlformats.org/officeDocument/2006/math" xmlns:v="urn:schemas-microsoft-com:vml" xmlns:wp14="http://schemas.microsoft.com/office/word/2010/wordprocessingDrawing" xmlns:wp="http://schemas.openxmlformats.org/drawingml/2006/wordprocessingDrawing" xmlns:w10="urn:schemas-microsoft-com:office:word" xmlns:w="http://schemas.openxmlformats.org/wordprocessingml/2006/main" xmlns:w14="http://schemas.microsoft.com/office/word/2010/wordml" xmlns:w15="http://schemas.microsoft.com/office/word/2012/wordml" xmlns:w16cex="http://schemas.microsoft.com/office/word/2018/wordml/cex" xmlns:w16cid="http://schemas.microsoft.com/office/word/2016/wordml/cid" xmlns:w16="http://schemas.microsoft.com/office/word/2018/wordml" xmlns:w16sdtdh="http://schemas.microsoft.com/office/word/2020/wordml/sdtdatahash" xmlns:w16se="http://schemas.microsoft.com/office/word/2015/wordml/symex" xmlns:wpg="http://schemas.microsoft.com/office/word/2010/wordprocessingGroup" xmlns:wpi="http://schemas.microsoft.com/office/word/2010/wordprocessingInk" xmlns:wne="http://schemas.microsoft.com/office/word/2006/wordml" xmlns:wps="http://schemas.microsoft.com/office/word/2010/wordprocessingShape" mc:Ignorable="w14 w15 w16se w16cid w16 w16cex w16sdtdh wp14">
+  <w:p/>
+</w:ftr>
+</file>
+
+<file path=word/footer7.xml><?xml version="1.0" encoding="utf-8"?>
+<w:ftr xmlns:wpc="http://schemas.microsoft.com/office/word/2010/wordprocessingCanvas" xmlns:cx="http://schemas.microsoft.com/office/drawing/2014/chartex" xmlns:cx1="http://schemas.microsoft.com/office/drawing/2015/9/8/chartex" xmlns:cx2="http://schemas.microsoft.com/office/drawing/2015/10/21/chartex" xmlns:cx3="http://schemas.microsoft.com/office/drawing/2016/5/9/chartex" xmlns:cx4="http://schemas.microsoft.com/office/drawing/2016/5/10/chartex" xmlns:cx5="http://schemas.microsoft.com/office/drawing/2016/5/11/chartex" xmlns:cx6="http://schemas.microsoft.com/office/drawing/2016/5/12/chartex" xmlns:cx7="http://schemas.microsoft.com/office/drawing/2016/5/13/chartex" xmlns:cx8="http://schemas.microsoft.com/office/drawing/2016/5/14/chartex" xmlns:mc="http://schemas.openxmlformats.org/markup-compatibility/2006" xmlns:aink="http://schemas.microsoft.com/office/drawing/2016/ink" xmlns:am3d="http://schemas.microsoft.com/office/drawing/2017/model3d" xmlns:o="urn:schemas-microsoft-com:office:office" xmlns:r="http://schemas.openxmlformats.org/officeDocument/2006/relationships" xmlns:m="http://schemas.openxmlformats.org/officeDocument/2006/math" xmlns:v="urn:schemas-microsoft-com:vml" xmlns:wp14="http://schemas.microsoft.com/office/word/2010/wordprocessingDrawing" xmlns:wp="http://schemas.openxmlformats.org/drawingml/2006/wordprocessingDrawing" xmlns:w10="urn:schemas-microsoft-com:office:word" xmlns:w="http://schemas.openxmlformats.org/wordprocessingml/2006/main" xmlns:w14="http://schemas.microsoft.com/office/word/2010/wordml" xmlns:w15="http://schemas.microsoft.com/office/word/2012/wordml" xmlns:w16cex="http://schemas.microsoft.com/office/word/2018/wordml/cex" xmlns:w16cid="http://schemas.microsoft.com/office/word/2016/wordml/cid" xmlns:w16="http://schemas.microsoft.com/office/word/2018/wordml" xmlns:w16sdtdh="http://schemas.microsoft.com/office/word/2020/wordml/sdtdatahash" xmlns:w16se="http://schemas.microsoft.com/office/word/2015/wordml/symex" xmlns:wpg="http://schemas.microsoft.com/office/word/2010/wordprocessingGroup" xmlns:wpi="http://schemas.microsoft.com/office/word/2010/wordprocessingInk" xmlns:wne="http://schemas.microsoft.com/office/word/2006/wordml" xmlns:wps="http://schemas.microsoft.com/office/word/2010/wordprocessingShape" mc:Ignorable="w14 w15 w16se w16cid w16 w16cex w16sdtdh wp14">
+  <w:p/>
+</w:ftr>
+</file>
+
+<file path=word/footer8.xml><?xml version="1.0" encoding="utf-8"?>
+<w:ftr xmlns:wpc="http://schemas.microsoft.com/office/word/2010/wordprocessingCanvas" xmlns:cx="http://schemas.microsoft.com/office/drawing/2014/chartex" xmlns:cx1="http://schemas.microsoft.com/office/drawing/2015/9/8/chartex" xmlns:cx2="http://schemas.microsoft.com/office/drawing/2015/10/21/chartex" xmlns:cx3="http://schemas.microsoft.com/office/drawing/2016/5/9/chartex" xmlns:cx4="http://schemas.microsoft.com/office/drawing/2016/5/10/chartex" xmlns:cx5="http://schemas.microsoft.com/office/drawing/2016/5/11/chartex" xmlns:cx6="http://schemas.microsoft.com/office/drawing/2016/5/12/chartex" xmlns:cx7="http://schemas.microsoft.com/office/drawing/2016/5/13/chartex" xmlns:cx8="http://schemas.microsoft.com/office/drawing/2016/5/14/chartex" xmlns:mc="http://schemas.openxmlformats.org/markup-compatibility/2006" xmlns:aink="http://schemas.microsoft.com/office/drawing/2016/ink" xmlns:am3d="http://schemas.microsoft.com/office/drawing/2017/model3d" xmlns:o="urn:schemas-microsoft-com:office:office" xmlns:r="http://schemas.openxmlformats.org/officeDocument/2006/relationships" xmlns:m="http://schemas.openxmlformats.org/officeDocument/2006/math" xmlns:v="urn:schemas-microsoft-com:vml" xmlns:wp14="http://schemas.microsoft.com/office/word/2010/wordprocessingDrawing" xmlns:wp="http://schemas.openxmlformats.org/drawingml/2006/wordprocessingDrawing" xmlns:w10="urn:schemas-microsoft-com:office:word" xmlns:w="http://schemas.openxmlformats.org/wordprocessingml/2006/main" xmlns:w14="http://schemas.microsoft.com/office/word/2010/wordml" xmlns:w15="http://schemas.microsoft.com/office/word/2012/wordml" xmlns:w16cex="http://schemas.microsoft.com/office/word/2018/wordml/cex" xmlns:w16cid="http://schemas.microsoft.com/office/word/2016/wordml/cid" xmlns:w16="http://schemas.microsoft.com/office/word/2018/wordml" xmlns:w16sdtdh="http://schemas.microsoft.com/office/word/2020/wordml/sdtdatahash" xmlns:w16se="http://schemas.microsoft.com/office/word/2015/wordml/symex" xmlns:wpg="http://schemas.microsoft.com/office/word/2010/wordprocessingGroup" xmlns:wpi="http://schemas.microsoft.com/office/word/2010/wordprocessingInk" xmlns:wne="http://schemas.microsoft.com/office/word/2006/wordml" xmlns:wps="http://schemas.microsoft.com/office/word/2010/wordprocessingShape" mc:Ignorable="w14 w15 w16se w16cid w16 w16cex w16sdtdh wp14">
+  <w:p/>
+</w:ftr>
+</file>
+
+<file path=word/footer9.xml><?xml version="1.0" encoding="utf-8"?>
+<w:ftr xmlns:wpc="http://schemas.microsoft.com/office/word/2010/wordprocessingCanvas" xmlns:cx="http://schemas.microsoft.com/office/drawing/2014/chartex" xmlns:cx1="http://schemas.microsoft.com/office/drawing/2015/9/8/chartex" xmlns:cx2="http://schemas.microsoft.com/office/drawing/2015/10/21/chartex" xmlns:cx3="http://schemas.microsoft.com/office/drawing/2016/5/9/chartex" xmlns:cx4="http://schemas.microsoft.com/office/drawing/2016/5/10/chartex" xmlns:cx5="http://schemas.microsoft.com/office/drawing/2016/5/11/chartex" xmlns:cx6="http://schemas.microsoft.com/office/drawing/2016/5/12/chartex" xmlns:cx7="http://schemas.microsoft.com/office/drawing/2016/5/13/chartex" xmlns:cx8="http://schemas.microsoft.com/office/drawing/2016/5/14/chartex" xmlns:mc="http://schemas.openxmlformats.org/markup-compatibility/2006" xmlns:aink="http://schemas.microsoft.com/office/drawing/2016/ink" xmlns:am3d="http://schemas.microsoft.com/office/drawing/2017/model3d" xmlns:o="urn:schemas-microsoft-com:office:office" xmlns:r="http://schemas.openxmlformats.org/officeDocument/2006/relationships" xmlns:m="http://schemas.openxmlformats.org/officeDocument/2006/math" xmlns:v="urn:schemas-microsoft-com:vml" xmlns:wp14="http://schemas.microsoft.com/office/word/2010/wordprocessingDrawing" xmlns:wp="http://schemas.openxmlformats.org/drawingml/2006/wordprocessingDrawing" xmlns:w10="urn:schemas-microsoft-com:office:word" xmlns:w="http://schemas.openxmlformats.org/wordprocessingml/2006/main" xmlns:w14="http://schemas.microsoft.com/office/word/2010/wordml" xmlns:w15="http://schemas.microsoft.com/office/word/2012/wordml" xmlns:w16cex="http://schemas.microsoft.com/office/word/2018/wordml/cex" xmlns:w16cid="http://schemas.microsoft.com/office/word/2016/wordml/cid" xmlns:w16="http://schemas.microsoft.com/office/word/2018/wordml" xmlns:w16sdtdh="http://schemas.microsoft.com/office/word/2020/wordml/sdtdatahash" xmlns:w16se="http://schemas.microsoft.com/office/word/2015/wordml/symex" xmlns:wpg="http://schemas.microsoft.com/office/word/2010/wordprocessingGroup" xmlns:wpi="http://schemas.microsoft.com/office/word/2010/wordprocessingInk" xmlns:wne="http://schemas.microsoft.com/office/word/2006/wordml" xmlns:wps="http://schemas.microsoft.com/office/word/2010/wordprocessingShape" mc:Ignorable="w14 w15 w16se w16cid w16 w16cex w16sdtdh wp14">
+  <w:p/>
 </w:ftr>
 </file>
 
@@ -12119,43 +9781,42 @@
 <file path=word/header1.xml><?xml version="1.0" encoding="utf-8"?>
 <w:hdr xmlns:wpc="http://schemas.microsoft.com/office/word/2010/wordprocessingCanvas" xmlns:cx="http://schemas.microsoft.com/office/drawing/2014/chartex" xmlns:cx1="http://schemas.microsoft.com/office/drawing/2015/9/8/chartex" xmlns:cx2="http://schemas.microsoft.com/office/drawing/2015/10/21/chartex" xmlns:cx3="http://schemas.microsoft.com/office/drawing/2016/5/9/chartex" xmlns:cx4="http://schemas.microsoft.com/office/drawing/2016/5/10/chartex" xmlns:cx5="http://schemas.microsoft.com/office/drawing/2016/5/11/chartex" xmlns:cx6="http://schemas.microsoft.com/office/drawing/2016/5/12/chartex" xmlns:cx7="http://schemas.microsoft.com/office/drawing/2016/5/13/chartex" xmlns:cx8="http://schemas.microsoft.com/office/drawing/2016/5/14/chartex" xmlns:mc="http://schemas.openxmlformats.org/markup-compatibility/2006" xmlns:aink="http://schemas.microsoft.com/office/drawing/2016/ink" xmlns:am3d="http://schemas.microsoft.com/office/drawing/2017/model3d" xmlns:o="urn:schemas-microsoft-com:office:office" xmlns:r="http://schemas.openxmlformats.org/officeDocument/2006/relationships" xmlns:m="http://schemas.openxmlformats.org/officeDocument/2006/math" xmlns:v="urn:schemas-microsoft-com:vml" xmlns:wp14="http://schemas.microsoft.com/office/word/2010/wordprocessingDrawing" xmlns:wp="http://schemas.openxmlformats.org/drawingml/2006/wordprocessingDrawing" xmlns:w10="urn:schemas-microsoft-com:office:word" xmlns:w="http://schemas.openxmlformats.org/wordprocessingml/2006/main" xmlns:w14="http://schemas.microsoft.com/office/word/2010/wordml" xmlns:w15="http://schemas.microsoft.com/office/word/2012/wordml" xmlns:w16cex="http://schemas.microsoft.com/office/word/2018/wordml/cex" xmlns:w16cid="http://schemas.microsoft.com/office/word/2016/wordml/cid" xmlns:w16="http://schemas.microsoft.com/office/word/2018/wordml" xmlns:w16sdtdh="http://schemas.microsoft.com/office/word/2020/wordml/sdtdatahash" xmlns:w16se="http://schemas.microsoft.com/office/word/2015/wordml/symex" xmlns:wpg="http://schemas.microsoft.com/office/word/2010/wordprocessingGroup" xmlns:wpi="http://schemas.microsoft.com/office/word/2010/wordprocessingInk" xmlns:wne="http://schemas.microsoft.com/office/word/2006/wordml" xmlns:wps="http://schemas.microsoft.com/office/word/2010/wordprocessingShape" mc:Ignorable="w14 w15 w16se w16cid w16 w16cex w16sdtdh wp14">
   <w:p>
-    <w:pPr>
-      <w:pStyle w:val="Corpsdetexte"/>
-      <w:spacing w:line="14" w:lineRule="auto"/>
-      <w:rPr>
-        <w:sz w:val="20"/>
-      </w:rPr>
-    </w:pPr>
     <w:r>
       <w:rPr>
         <w:noProof/>
-        <w:sz w:val="20"/>
+        <w:lang w:val="en-US"/>
       </w:rPr>
       <w:drawing>
-        <wp:anchor distT="0" distB="0" distL="0" distR="0" simplePos="0" relativeHeight="487141888" behindDoc="1" locked="0" layoutInCell="1" allowOverlap="1" wp14:anchorId="0421BB39" wp14:editId="1D18276A">
+        <wp:anchor distT="0" distB="0" distL="114300" distR="114300" simplePos="0" relativeHeight="251629056" behindDoc="1" locked="0" layoutInCell="1" allowOverlap="1" wp14:anchorId="19F97777" wp14:editId="1268C1D6">
           <wp:simplePos x="0" y="0"/>
           <wp:positionH relativeFrom="page">
-            <wp:posOffset>5783581</wp:posOffset>
+            <wp:posOffset>0</wp:posOffset>
           </wp:positionH>
           <wp:positionV relativeFrom="page">
-            <wp:posOffset>68580</wp:posOffset>
+            <wp:posOffset>5496</wp:posOffset>
           </wp:positionV>
-          <wp:extent cx="1028698" cy="716279"/>
-          <wp:effectExtent l="0" t="0" r="0" b="0"/>
+          <wp:extent cx="7555698" cy="10679883"/>
+          <wp:effectExtent l="0" t="0" r="7620" b="7620"/>
           <wp:wrapNone/>
-          <wp:docPr id="11" name="Image 11"/>
+          <wp:docPr id="2" name="Picture 16"/>
           <wp:cNvGraphicFramePr>
-            <a:graphicFrameLocks xmlns:a="http://schemas.openxmlformats.org/drawingml/2006/main"/>
+            <a:graphicFrameLocks xmlns:a="http://schemas.openxmlformats.org/drawingml/2006/main" noChangeAspect="1"/>
           </wp:cNvGraphicFramePr>
           <a:graphic xmlns:a="http://schemas.openxmlformats.org/drawingml/2006/main">
             <a:graphicData uri="http://schemas.openxmlformats.org/drawingml/2006/picture">
               <pic:pic xmlns:pic="http://schemas.openxmlformats.org/drawingml/2006/picture">
                 <pic:nvPicPr>
-                  <pic:cNvPr id="11" name="Image 11"/>
+                  <pic:cNvPr id="1" name="ginutech-letterhead.png"/>
                   <pic:cNvPicPr/>
                 </pic:nvPicPr>
                 <pic:blipFill>
-                  <a:blip r:embed="rId1" cstate="print"/>
+                  <a:blip r:embed="rId1" cstate="print">
+                    <a:extLst>
+                      <a:ext uri="{28A0092B-C50C-407E-A947-70E740481C1C}">
+                        <a14:useLocalDpi xmlns:a14="http://schemas.microsoft.com/office/drawing/2010/main" val="0"/>
+                      </a:ext>
+                    </a:extLst>
+                  </a:blip>
                   <a:stretch>
                     <a:fillRect/>
                   </a:stretch>
@@ -12163,7 +9824,7 @@
                 <pic:spPr>
                   <a:xfrm>
                     <a:off x="0" y="0"/>
-                    <a:ext cx="1028698" cy="716279"/>
+                    <a:ext cx="7555698" cy="10679883"/>
                   </a:xfrm>
                   <a:prstGeom prst="rect">
                     <a:avLst/>
@@ -12172,39 +9833,58 @@
               </pic:pic>
             </a:graphicData>
           </a:graphic>
+          <wp14:sizeRelH relativeFrom="margin">
+            <wp14:pctWidth>0</wp14:pctWidth>
+          </wp14:sizeRelH>
+          <wp14:sizeRelV relativeFrom="margin">
+            <wp14:pctHeight>0</wp14:pctHeight>
+          </wp14:sizeRelV>
         </wp:anchor>
       </w:drawing>
     </w:r>
+  </w:p>
+</w:hdr>
+</file>
+
+<file path=word/header10.xml><?xml version="1.0" encoding="utf-8"?>
+<w:hdr xmlns:wpc="http://schemas.microsoft.com/office/word/2010/wordprocessingCanvas" xmlns:cx="http://schemas.microsoft.com/office/drawing/2014/chartex" xmlns:cx1="http://schemas.microsoft.com/office/drawing/2015/9/8/chartex" xmlns:cx2="http://schemas.microsoft.com/office/drawing/2015/10/21/chartex" xmlns:cx3="http://schemas.microsoft.com/office/drawing/2016/5/9/chartex" xmlns:cx4="http://schemas.microsoft.com/office/drawing/2016/5/10/chartex" xmlns:cx5="http://schemas.microsoft.com/office/drawing/2016/5/11/chartex" xmlns:cx6="http://schemas.microsoft.com/office/drawing/2016/5/12/chartex" xmlns:cx7="http://schemas.microsoft.com/office/drawing/2016/5/13/chartex" xmlns:cx8="http://schemas.microsoft.com/office/drawing/2016/5/14/chartex" xmlns:mc="http://schemas.openxmlformats.org/markup-compatibility/2006" xmlns:aink="http://schemas.microsoft.com/office/drawing/2016/ink" xmlns:am3d="http://schemas.microsoft.com/office/drawing/2017/model3d" xmlns:o="urn:schemas-microsoft-com:office:office" xmlns:r="http://schemas.openxmlformats.org/officeDocument/2006/relationships" xmlns:m="http://schemas.openxmlformats.org/officeDocument/2006/math" xmlns:v="urn:schemas-microsoft-com:vml" xmlns:wp14="http://schemas.microsoft.com/office/word/2010/wordprocessingDrawing" xmlns:wp="http://schemas.openxmlformats.org/drawingml/2006/wordprocessingDrawing" xmlns:w10="urn:schemas-microsoft-com:office:word" xmlns:w="http://schemas.openxmlformats.org/wordprocessingml/2006/main" xmlns:w14="http://schemas.microsoft.com/office/word/2010/wordml" xmlns:w15="http://schemas.microsoft.com/office/word/2012/wordml" xmlns:w16cex="http://schemas.microsoft.com/office/word/2018/wordml/cex" xmlns:w16cid="http://schemas.microsoft.com/office/word/2016/wordml/cid" xmlns:w16="http://schemas.microsoft.com/office/word/2018/wordml" xmlns:w16sdtdh="http://schemas.microsoft.com/office/word/2020/wordml/sdtdatahash" xmlns:w16se="http://schemas.microsoft.com/office/word/2015/wordml/symex" xmlns:wpg="http://schemas.microsoft.com/office/word/2010/wordprocessingGroup" xmlns:wpi="http://schemas.microsoft.com/office/word/2010/wordprocessingInk" xmlns:wne="http://schemas.microsoft.com/office/word/2006/wordml" xmlns:wps="http://schemas.microsoft.com/office/word/2010/wordprocessingShape" mc:Ignorable="w14 w15 w16se w16cid w16 w16cex w16sdtdh wp14">
+  <w:p>
     <w:r>
       <w:rPr>
         <w:noProof/>
-        <w:sz w:val="20"/>
+        <w:lang w:val="en-US"/>
       </w:rPr>
       <w:drawing>
-        <wp:anchor distT="0" distB="0" distL="0" distR="0" simplePos="0" relativeHeight="487142400" behindDoc="1" locked="0" layoutInCell="1" allowOverlap="1" wp14:anchorId="42ACDFB4" wp14:editId="7D0EE031">
+        <wp:anchor distT="0" distB="0" distL="114300" distR="114300" simplePos="0" relativeHeight="251652096" behindDoc="1" locked="0" layoutInCell="1" allowOverlap="1" wp14:anchorId="46D4E799" wp14:editId="70C5A8AD">
           <wp:simplePos x="0" y="0"/>
           <wp:positionH relativeFrom="page">
-            <wp:posOffset>801929</wp:posOffset>
+            <wp:posOffset>0</wp:posOffset>
           </wp:positionH>
           <wp:positionV relativeFrom="page">
-            <wp:posOffset>94338</wp:posOffset>
+            <wp:posOffset>5496</wp:posOffset>
           </wp:positionV>
-          <wp:extent cx="713886" cy="607959"/>
-          <wp:effectExtent l="0" t="0" r="0" b="0"/>
+          <wp:extent cx="7555698" cy="10679883"/>
+          <wp:effectExtent l="0" t="0" r="7620" b="7620"/>
           <wp:wrapNone/>
-          <wp:docPr id="12" name="Image 12"/>
+          <wp:docPr id="11" name="Picture 16"/>
           <wp:cNvGraphicFramePr>
-            <a:graphicFrameLocks xmlns:a="http://schemas.openxmlformats.org/drawingml/2006/main"/>
+            <a:graphicFrameLocks xmlns:a="http://schemas.openxmlformats.org/drawingml/2006/main" noChangeAspect="1"/>
           </wp:cNvGraphicFramePr>
           <a:graphic xmlns:a="http://schemas.openxmlformats.org/drawingml/2006/main">
             <a:graphicData uri="http://schemas.openxmlformats.org/drawingml/2006/picture">
               <pic:pic xmlns:pic="http://schemas.openxmlformats.org/drawingml/2006/picture">
                 <pic:nvPicPr>
-                  <pic:cNvPr id="12" name="Image 12"/>
+                  <pic:cNvPr id="1" name="ginutech-letterhead.png"/>
                   <pic:cNvPicPr/>
                 </pic:nvPicPr>
                 <pic:blipFill>
-                  <a:blip r:embed="rId2" cstate="print"/>
+                  <a:blip r:embed="rId1" cstate="print">
+                    <a:extLst>
+                      <a:ext uri="{28A0092B-C50C-407E-A947-70E740481C1C}">
+                        <a14:useLocalDpi xmlns:a14="http://schemas.microsoft.com/office/drawing/2010/main" val="0"/>
+                      </a:ext>
+                    </a:extLst>
+                  </a:blip>
                   <a:stretch>
                     <a:fillRect/>
                   </a:stretch>
@@ -12212,7 +9892,7 @@
                 <pic:spPr>
                   <a:xfrm>
                     <a:off x="0" y="0"/>
-                    <a:ext cx="713886" cy="607959"/>
+                    <a:ext cx="7555698" cy="10679883"/>
                   </a:xfrm>
                   <a:prstGeom prst="rect">
                     <a:avLst/>
@@ -12221,6 +9901,624 @@
               </pic:pic>
             </a:graphicData>
           </a:graphic>
+          <wp14:sizeRelH relativeFrom="margin">
+            <wp14:pctWidth>0</wp14:pctWidth>
+          </wp14:sizeRelH>
+          <wp14:sizeRelV relativeFrom="margin">
+            <wp14:pctHeight>0</wp14:pctHeight>
+          </wp14:sizeRelV>
+        </wp:anchor>
+      </w:drawing>
+    </w:r>
+  </w:p>
+</w:hdr>
+</file>
+
+<file path=word/header11.xml><?xml version="1.0" encoding="utf-8"?>
+<w:hdr xmlns:wpc="http://schemas.microsoft.com/office/word/2010/wordprocessingCanvas" xmlns:cx="http://schemas.microsoft.com/office/drawing/2014/chartex" xmlns:cx1="http://schemas.microsoft.com/office/drawing/2015/9/8/chartex" xmlns:cx2="http://schemas.microsoft.com/office/drawing/2015/10/21/chartex" xmlns:cx3="http://schemas.microsoft.com/office/drawing/2016/5/9/chartex" xmlns:cx4="http://schemas.microsoft.com/office/drawing/2016/5/10/chartex" xmlns:cx5="http://schemas.microsoft.com/office/drawing/2016/5/11/chartex" xmlns:cx6="http://schemas.microsoft.com/office/drawing/2016/5/12/chartex" xmlns:cx7="http://schemas.microsoft.com/office/drawing/2016/5/13/chartex" xmlns:cx8="http://schemas.microsoft.com/office/drawing/2016/5/14/chartex" xmlns:mc="http://schemas.openxmlformats.org/markup-compatibility/2006" xmlns:aink="http://schemas.microsoft.com/office/drawing/2016/ink" xmlns:am3d="http://schemas.microsoft.com/office/drawing/2017/model3d" xmlns:o="urn:schemas-microsoft-com:office:office" xmlns:r="http://schemas.openxmlformats.org/officeDocument/2006/relationships" xmlns:m="http://schemas.openxmlformats.org/officeDocument/2006/math" xmlns:v="urn:schemas-microsoft-com:vml" xmlns:wp14="http://schemas.microsoft.com/office/word/2010/wordprocessingDrawing" xmlns:wp="http://schemas.openxmlformats.org/drawingml/2006/wordprocessingDrawing" xmlns:w10="urn:schemas-microsoft-com:office:word" xmlns:w="http://schemas.openxmlformats.org/wordprocessingml/2006/main" xmlns:w14="http://schemas.microsoft.com/office/word/2010/wordml" xmlns:w15="http://schemas.microsoft.com/office/word/2012/wordml" xmlns:w16cex="http://schemas.microsoft.com/office/word/2018/wordml/cex" xmlns:w16cid="http://schemas.microsoft.com/office/word/2016/wordml/cid" xmlns:w16="http://schemas.microsoft.com/office/word/2018/wordml" xmlns:w16sdtdh="http://schemas.microsoft.com/office/word/2020/wordml/sdtdatahash" xmlns:w16se="http://schemas.microsoft.com/office/word/2015/wordml/symex" xmlns:wpg="http://schemas.microsoft.com/office/word/2010/wordprocessingGroup" xmlns:wpi="http://schemas.microsoft.com/office/word/2010/wordprocessingInk" xmlns:wne="http://schemas.microsoft.com/office/word/2006/wordml" xmlns:wps="http://schemas.microsoft.com/office/word/2010/wordprocessingShape" mc:Ignorable="w14 w15 w16se w16cid w16 w16cex w16sdtdh wp14">
+  <w:p>
+    <w:r>
+      <w:rPr>
+        <w:noProof/>
+        <w:lang w:val="en-US"/>
+      </w:rPr>
+      <w:drawing>
+        <wp:anchor distT="0" distB="0" distL="114300" distR="114300" simplePos="0" relativeHeight="251653120" behindDoc="1" locked="0" layoutInCell="1" allowOverlap="1" wp14:anchorId="69E4FBB7" wp14:editId="109999E3">
+          <wp:simplePos x="0" y="0"/>
+          <wp:positionH relativeFrom="page">
+            <wp:posOffset>0</wp:posOffset>
+          </wp:positionH>
+          <wp:positionV relativeFrom="page">
+            <wp:posOffset>5496</wp:posOffset>
+          </wp:positionV>
+          <wp:extent cx="7555698" cy="10679883"/>
+          <wp:effectExtent l="0" t="0" r="7620" b="7620"/>
+          <wp:wrapNone/>
+          <wp:docPr id="9" name="Picture 16"/>
+          <wp:cNvGraphicFramePr>
+            <a:graphicFrameLocks xmlns:a="http://schemas.openxmlformats.org/drawingml/2006/main" noChangeAspect="1"/>
+          </wp:cNvGraphicFramePr>
+          <a:graphic xmlns:a="http://schemas.openxmlformats.org/drawingml/2006/main">
+            <a:graphicData uri="http://schemas.openxmlformats.org/drawingml/2006/picture">
+              <pic:pic xmlns:pic="http://schemas.openxmlformats.org/drawingml/2006/picture">
+                <pic:nvPicPr>
+                  <pic:cNvPr id="1" name="ginutech-letterhead.png"/>
+                  <pic:cNvPicPr/>
+                </pic:nvPicPr>
+                <pic:blipFill>
+                  <a:blip r:embed="rId1" cstate="print">
+                    <a:extLst>
+                      <a:ext uri="{28A0092B-C50C-407E-A947-70E740481C1C}">
+                        <a14:useLocalDpi xmlns:a14="http://schemas.microsoft.com/office/drawing/2010/main" val="0"/>
+                      </a:ext>
+                    </a:extLst>
+                  </a:blip>
+                  <a:stretch>
+                    <a:fillRect/>
+                  </a:stretch>
+                </pic:blipFill>
+                <pic:spPr>
+                  <a:xfrm>
+                    <a:off x="0" y="0"/>
+                    <a:ext cx="7555698" cy="10679883"/>
+                  </a:xfrm>
+                  <a:prstGeom prst="rect">
+                    <a:avLst/>
+                  </a:prstGeom>
+                </pic:spPr>
+              </pic:pic>
+            </a:graphicData>
+          </a:graphic>
+          <wp14:sizeRelH relativeFrom="margin">
+            <wp14:pctWidth>0</wp14:pctWidth>
+          </wp14:sizeRelH>
+          <wp14:sizeRelV relativeFrom="margin">
+            <wp14:pctHeight>0</wp14:pctHeight>
+          </wp14:sizeRelV>
+        </wp:anchor>
+      </w:drawing>
+    </w:r>
+  </w:p>
+</w:hdr>
+</file>
+
+<file path=word/header12.xml><?xml version="1.0" encoding="utf-8"?>
+<w:hdr xmlns:wpc="http://schemas.microsoft.com/office/word/2010/wordprocessingCanvas" xmlns:cx="http://schemas.microsoft.com/office/drawing/2014/chartex" xmlns:cx1="http://schemas.microsoft.com/office/drawing/2015/9/8/chartex" xmlns:cx2="http://schemas.microsoft.com/office/drawing/2015/10/21/chartex" xmlns:cx3="http://schemas.microsoft.com/office/drawing/2016/5/9/chartex" xmlns:cx4="http://schemas.microsoft.com/office/drawing/2016/5/10/chartex" xmlns:cx5="http://schemas.microsoft.com/office/drawing/2016/5/11/chartex" xmlns:cx6="http://schemas.microsoft.com/office/drawing/2016/5/12/chartex" xmlns:cx7="http://schemas.microsoft.com/office/drawing/2016/5/13/chartex" xmlns:cx8="http://schemas.microsoft.com/office/drawing/2016/5/14/chartex" xmlns:mc="http://schemas.openxmlformats.org/markup-compatibility/2006" xmlns:aink="http://schemas.microsoft.com/office/drawing/2016/ink" xmlns:am3d="http://schemas.microsoft.com/office/drawing/2017/model3d" xmlns:o="urn:schemas-microsoft-com:office:office" xmlns:r="http://schemas.openxmlformats.org/officeDocument/2006/relationships" xmlns:m="http://schemas.openxmlformats.org/officeDocument/2006/math" xmlns:v="urn:schemas-microsoft-com:vml" xmlns:wp14="http://schemas.microsoft.com/office/word/2010/wordprocessingDrawing" xmlns:wp="http://schemas.openxmlformats.org/drawingml/2006/wordprocessingDrawing" xmlns:w10="urn:schemas-microsoft-com:office:word" xmlns:w="http://schemas.openxmlformats.org/wordprocessingml/2006/main" xmlns:w14="http://schemas.microsoft.com/office/word/2010/wordml" xmlns:w15="http://schemas.microsoft.com/office/word/2012/wordml" xmlns:w16cex="http://schemas.microsoft.com/office/word/2018/wordml/cex" xmlns:w16cid="http://schemas.microsoft.com/office/word/2016/wordml/cid" xmlns:w16="http://schemas.microsoft.com/office/word/2018/wordml" xmlns:w16sdtdh="http://schemas.microsoft.com/office/word/2020/wordml/sdtdatahash" xmlns:w16se="http://schemas.microsoft.com/office/word/2015/wordml/symex" xmlns:wpg="http://schemas.microsoft.com/office/word/2010/wordprocessingGroup" xmlns:wpi="http://schemas.microsoft.com/office/word/2010/wordprocessingInk" xmlns:wne="http://schemas.microsoft.com/office/word/2006/wordml" xmlns:wps="http://schemas.microsoft.com/office/word/2010/wordprocessingShape" mc:Ignorable="w14 w15 w16se w16cid w16 w16cex w16sdtdh wp14">
+  <w:p>
+    <w:r>
+      <w:rPr>
+        <w:noProof/>
+        <w:lang w:val="en-US"/>
+      </w:rPr>
+      <w:drawing>
+        <wp:anchor distT="0" distB="0" distL="114300" distR="114300" simplePos="0" relativeHeight="251654144" behindDoc="1" locked="0" layoutInCell="1" allowOverlap="1" wp14:anchorId="6FB15D59" wp14:editId="02570EE8">
+          <wp:simplePos x="0" y="0"/>
+          <wp:positionH relativeFrom="page">
+            <wp:posOffset>0</wp:posOffset>
+          </wp:positionH>
+          <wp:positionV relativeFrom="page">
+            <wp:posOffset>5496</wp:posOffset>
+          </wp:positionV>
+          <wp:extent cx="7555698" cy="10679883"/>
+          <wp:effectExtent l="0" t="0" r="7620" b="7620"/>
+          <wp:wrapNone/>
+          <wp:docPr id="10" name="Picture 16"/>
+          <wp:cNvGraphicFramePr>
+            <a:graphicFrameLocks xmlns:a="http://schemas.openxmlformats.org/drawingml/2006/main" noChangeAspect="1"/>
+          </wp:cNvGraphicFramePr>
+          <a:graphic xmlns:a="http://schemas.openxmlformats.org/drawingml/2006/main">
+            <a:graphicData uri="http://schemas.openxmlformats.org/drawingml/2006/picture">
+              <pic:pic xmlns:pic="http://schemas.openxmlformats.org/drawingml/2006/picture">
+                <pic:nvPicPr>
+                  <pic:cNvPr id="1" name="ginutech-letterhead.png"/>
+                  <pic:cNvPicPr/>
+                </pic:nvPicPr>
+                <pic:blipFill>
+                  <a:blip r:embed="rId1" cstate="print">
+                    <a:extLst>
+                      <a:ext uri="{28A0092B-C50C-407E-A947-70E740481C1C}">
+                        <a14:useLocalDpi xmlns:a14="http://schemas.microsoft.com/office/drawing/2010/main" val="0"/>
+                      </a:ext>
+                    </a:extLst>
+                  </a:blip>
+                  <a:stretch>
+                    <a:fillRect/>
+                  </a:stretch>
+                </pic:blipFill>
+                <pic:spPr>
+                  <a:xfrm>
+                    <a:off x="0" y="0"/>
+                    <a:ext cx="7555698" cy="10679883"/>
+                  </a:xfrm>
+                  <a:prstGeom prst="rect">
+                    <a:avLst/>
+                  </a:prstGeom>
+                </pic:spPr>
+              </pic:pic>
+            </a:graphicData>
+          </a:graphic>
+          <wp14:sizeRelH relativeFrom="margin">
+            <wp14:pctWidth>0</wp14:pctWidth>
+          </wp14:sizeRelH>
+          <wp14:sizeRelV relativeFrom="margin">
+            <wp14:pctHeight>0</wp14:pctHeight>
+          </wp14:sizeRelV>
+        </wp:anchor>
+      </w:drawing>
+    </w:r>
+  </w:p>
+</w:hdr>
+</file>
+
+<file path=word/header13.xml><?xml version="1.0" encoding="utf-8"?>
+<w:hdr xmlns:wpc="http://schemas.microsoft.com/office/word/2010/wordprocessingCanvas" xmlns:cx="http://schemas.microsoft.com/office/drawing/2014/chartex" xmlns:cx1="http://schemas.microsoft.com/office/drawing/2015/9/8/chartex" xmlns:cx2="http://schemas.microsoft.com/office/drawing/2015/10/21/chartex" xmlns:cx3="http://schemas.microsoft.com/office/drawing/2016/5/9/chartex" xmlns:cx4="http://schemas.microsoft.com/office/drawing/2016/5/10/chartex" xmlns:cx5="http://schemas.microsoft.com/office/drawing/2016/5/11/chartex" xmlns:cx6="http://schemas.microsoft.com/office/drawing/2016/5/12/chartex" xmlns:cx7="http://schemas.microsoft.com/office/drawing/2016/5/13/chartex" xmlns:cx8="http://schemas.microsoft.com/office/drawing/2016/5/14/chartex" xmlns:mc="http://schemas.openxmlformats.org/markup-compatibility/2006" xmlns:aink="http://schemas.microsoft.com/office/drawing/2016/ink" xmlns:am3d="http://schemas.microsoft.com/office/drawing/2017/model3d" xmlns:o="urn:schemas-microsoft-com:office:office" xmlns:r="http://schemas.openxmlformats.org/officeDocument/2006/relationships" xmlns:m="http://schemas.openxmlformats.org/officeDocument/2006/math" xmlns:v="urn:schemas-microsoft-com:vml" xmlns:wp14="http://schemas.microsoft.com/office/word/2010/wordprocessingDrawing" xmlns:wp="http://schemas.openxmlformats.org/drawingml/2006/wordprocessingDrawing" xmlns:w10="urn:schemas-microsoft-com:office:word" xmlns:w="http://schemas.openxmlformats.org/wordprocessingml/2006/main" xmlns:w14="http://schemas.microsoft.com/office/word/2010/wordml" xmlns:w15="http://schemas.microsoft.com/office/word/2012/wordml" xmlns:w16cex="http://schemas.microsoft.com/office/word/2018/wordml/cex" xmlns:w16cid="http://schemas.microsoft.com/office/word/2016/wordml/cid" xmlns:w16="http://schemas.microsoft.com/office/word/2018/wordml" xmlns:w16sdtdh="http://schemas.microsoft.com/office/word/2020/wordml/sdtdatahash" xmlns:w16se="http://schemas.microsoft.com/office/word/2015/wordml/symex" xmlns:wpg="http://schemas.microsoft.com/office/word/2010/wordprocessingGroup" xmlns:wpi="http://schemas.microsoft.com/office/word/2010/wordprocessingInk" xmlns:wne="http://schemas.microsoft.com/office/word/2006/wordml" xmlns:wps="http://schemas.microsoft.com/office/word/2010/wordprocessingShape" mc:Ignorable="w14 w15 w16se w16cid w16 w16cex w16sdtdh wp14">
+  <w:p>
+    <w:r>
+      <w:rPr>
+        <w:noProof/>
+        <w:lang w:val="en-US"/>
+      </w:rPr>
+      <w:drawing>
+        <wp:anchor distT="0" distB="0" distL="114300" distR="114300" simplePos="0" relativeHeight="251655168" behindDoc="1" locked="0" layoutInCell="1" allowOverlap="1" wp14:anchorId="60E3793A" wp14:editId="11AE8097">
+          <wp:simplePos x="0" y="0"/>
+          <wp:positionH relativeFrom="page">
+            <wp:posOffset>0</wp:posOffset>
+          </wp:positionH>
+          <wp:positionV relativeFrom="page">
+            <wp:posOffset>5496</wp:posOffset>
+          </wp:positionV>
+          <wp:extent cx="7555698" cy="10679883"/>
+          <wp:effectExtent l="0" t="0" r="7620" b="7620"/>
+          <wp:wrapNone/>
+          <wp:docPr id="14" name="Picture 16"/>
+          <wp:cNvGraphicFramePr>
+            <a:graphicFrameLocks xmlns:a="http://schemas.openxmlformats.org/drawingml/2006/main" noChangeAspect="1"/>
+          </wp:cNvGraphicFramePr>
+          <a:graphic xmlns:a="http://schemas.openxmlformats.org/drawingml/2006/main">
+            <a:graphicData uri="http://schemas.openxmlformats.org/drawingml/2006/picture">
+              <pic:pic xmlns:pic="http://schemas.openxmlformats.org/drawingml/2006/picture">
+                <pic:nvPicPr>
+                  <pic:cNvPr id="1" name="ginutech-letterhead.png"/>
+                  <pic:cNvPicPr/>
+                </pic:nvPicPr>
+                <pic:blipFill>
+                  <a:blip r:embed="rId1" cstate="print">
+                    <a:extLst>
+                      <a:ext uri="{28A0092B-C50C-407E-A947-70E740481C1C}">
+                        <a14:useLocalDpi xmlns:a14="http://schemas.microsoft.com/office/drawing/2010/main" val="0"/>
+                      </a:ext>
+                    </a:extLst>
+                  </a:blip>
+                  <a:stretch>
+                    <a:fillRect/>
+                  </a:stretch>
+                </pic:blipFill>
+                <pic:spPr>
+                  <a:xfrm>
+                    <a:off x="0" y="0"/>
+                    <a:ext cx="7555698" cy="10679883"/>
+                  </a:xfrm>
+                  <a:prstGeom prst="rect">
+                    <a:avLst/>
+                  </a:prstGeom>
+                </pic:spPr>
+              </pic:pic>
+            </a:graphicData>
+          </a:graphic>
+          <wp14:sizeRelH relativeFrom="margin">
+            <wp14:pctWidth>0</wp14:pctWidth>
+          </wp14:sizeRelH>
+          <wp14:sizeRelV relativeFrom="margin">
+            <wp14:pctHeight>0</wp14:pctHeight>
+          </wp14:sizeRelV>
+        </wp:anchor>
+      </w:drawing>
+    </w:r>
+  </w:p>
+</w:hdr>
+</file>
+
+<file path=word/header14.xml><?xml version="1.0" encoding="utf-8"?>
+<w:hdr xmlns:wpc="http://schemas.microsoft.com/office/word/2010/wordprocessingCanvas" xmlns:cx="http://schemas.microsoft.com/office/drawing/2014/chartex" xmlns:cx1="http://schemas.microsoft.com/office/drawing/2015/9/8/chartex" xmlns:cx2="http://schemas.microsoft.com/office/drawing/2015/10/21/chartex" xmlns:cx3="http://schemas.microsoft.com/office/drawing/2016/5/9/chartex" xmlns:cx4="http://schemas.microsoft.com/office/drawing/2016/5/10/chartex" xmlns:cx5="http://schemas.microsoft.com/office/drawing/2016/5/11/chartex" xmlns:cx6="http://schemas.microsoft.com/office/drawing/2016/5/12/chartex" xmlns:cx7="http://schemas.microsoft.com/office/drawing/2016/5/13/chartex" xmlns:cx8="http://schemas.microsoft.com/office/drawing/2016/5/14/chartex" xmlns:mc="http://schemas.openxmlformats.org/markup-compatibility/2006" xmlns:aink="http://schemas.microsoft.com/office/drawing/2016/ink" xmlns:am3d="http://schemas.microsoft.com/office/drawing/2017/model3d" xmlns:o="urn:schemas-microsoft-com:office:office" xmlns:r="http://schemas.openxmlformats.org/officeDocument/2006/relationships" xmlns:m="http://schemas.openxmlformats.org/officeDocument/2006/math" xmlns:v="urn:schemas-microsoft-com:vml" xmlns:wp14="http://schemas.microsoft.com/office/word/2010/wordprocessingDrawing" xmlns:wp="http://schemas.openxmlformats.org/drawingml/2006/wordprocessingDrawing" xmlns:w10="urn:schemas-microsoft-com:office:word" xmlns:w="http://schemas.openxmlformats.org/wordprocessingml/2006/main" xmlns:w14="http://schemas.microsoft.com/office/word/2010/wordml" xmlns:w15="http://schemas.microsoft.com/office/word/2012/wordml" xmlns:w16cex="http://schemas.microsoft.com/office/word/2018/wordml/cex" xmlns:w16cid="http://schemas.microsoft.com/office/word/2016/wordml/cid" xmlns:w16="http://schemas.microsoft.com/office/word/2018/wordml" xmlns:w16sdtdh="http://schemas.microsoft.com/office/word/2020/wordml/sdtdatahash" xmlns:w16se="http://schemas.microsoft.com/office/word/2015/wordml/symex" xmlns:wpg="http://schemas.microsoft.com/office/word/2010/wordprocessingGroup" xmlns:wpi="http://schemas.microsoft.com/office/word/2010/wordprocessingInk" xmlns:wne="http://schemas.microsoft.com/office/word/2006/wordml" xmlns:wps="http://schemas.microsoft.com/office/word/2010/wordprocessingShape" mc:Ignorable="w14 w15 w16se w16cid w16 w16cex w16sdtdh wp14">
+  <w:p>
+    <w:r>
+      <w:rPr>
+        <w:noProof/>
+        <w:lang w:val="en-US"/>
+      </w:rPr>
+      <w:drawing>
+        <wp:anchor distT="0" distB="0" distL="114300" distR="114300" simplePos="0" relativeHeight="251656192" behindDoc="1" locked="0" layoutInCell="1" allowOverlap="1" wp14:anchorId="6E87D527" wp14:editId="6C093120">
+          <wp:simplePos x="0" y="0"/>
+          <wp:positionH relativeFrom="page">
+            <wp:posOffset>0</wp:posOffset>
+          </wp:positionH>
+          <wp:positionV relativeFrom="page">
+            <wp:posOffset>5496</wp:posOffset>
+          </wp:positionV>
+          <wp:extent cx="7555698" cy="10679883"/>
+          <wp:effectExtent l="0" t="0" r="7620" b="7620"/>
+          <wp:wrapNone/>
+          <wp:docPr id="12" name="Picture 16"/>
+          <wp:cNvGraphicFramePr>
+            <a:graphicFrameLocks xmlns:a="http://schemas.openxmlformats.org/drawingml/2006/main" noChangeAspect="1"/>
+          </wp:cNvGraphicFramePr>
+          <a:graphic xmlns:a="http://schemas.openxmlformats.org/drawingml/2006/main">
+            <a:graphicData uri="http://schemas.openxmlformats.org/drawingml/2006/picture">
+              <pic:pic xmlns:pic="http://schemas.openxmlformats.org/drawingml/2006/picture">
+                <pic:nvPicPr>
+                  <pic:cNvPr id="1" name="ginutech-letterhead.png"/>
+                  <pic:cNvPicPr/>
+                </pic:nvPicPr>
+                <pic:blipFill>
+                  <a:blip r:embed="rId1" cstate="print">
+                    <a:extLst>
+                      <a:ext uri="{28A0092B-C50C-407E-A947-70E740481C1C}">
+                        <a14:useLocalDpi xmlns:a14="http://schemas.microsoft.com/office/drawing/2010/main" val="0"/>
+                      </a:ext>
+                    </a:extLst>
+                  </a:blip>
+                  <a:stretch>
+                    <a:fillRect/>
+                  </a:stretch>
+                </pic:blipFill>
+                <pic:spPr>
+                  <a:xfrm>
+                    <a:off x="0" y="0"/>
+                    <a:ext cx="7555698" cy="10679883"/>
+                  </a:xfrm>
+                  <a:prstGeom prst="rect">
+                    <a:avLst/>
+                  </a:prstGeom>
+                </pic:spPr>
+              </pic:pic>
+            </a:graphicData>
+          </a:graphic>
+          <wp14:sizeRelH relativeFrom="margin">
+            <wp14:pctWidth>0</wp14:pctWidth>
+          </wp14:sizeRelH>
+          <wp14:sizeRelV relativeFrom="margin">
+            <wp14:pctHeight>0</wp14:pctHeight>
+          </wp14:sizeRelV>
+        </wp:anchor>
+      </w:drawing>
+    </w:r>
+  </w:p>
+</w:hdr>
+</file>
+
+<file path=word/header15.xml><?xml version="1.0" encoding="utf-8"?>
+<w:hdr xmlns:wpc="http://schemas.microsoft.com/office/word/2010/wordprocessingCanvas" xmlns:cx="http://schemas.microsoft.com/office/drawing/2014/chartex" xmlns:cx1="http://schemas.microsoft.com/office/drawing/2015/9/8/chartex" xmlns:cx2="http://schemas.microsoft.com/office/drawing/2015/10/21/chartex" xmlns:cx3="http://schemas.microsoft.com/office/drawing/2016/5/9/chartex" xmlns:cx4="http://schemas.microsoft.com/office/drawing/2016/5/10/chartex" xmlns:cx5="http://schemas.microsoft.com/office/drawing/2016/5/11/chartex" xmlns:cx6="http://schemas.microsoft.com/office/drawing/2016/5/12/chartex" xmlns:cx7="http://schemas.microsoft.com/office/drawing/2016/5/13/chartex" xmlns:cx8="http://schemas.microsoft.com/office/drawing/2016/5/14/chartex" xmlns:mc="http://schemas.openxmlformats.org/markup-compatibility/2006" xmlns:aink="http://schemas.microsoft.com/office/drawing/2016/ink" xmlns:am3d="http://schemas.microsoft.com/office/drawing/2017/model3d" xmlns:o="urn:schemas-microsoft-com:office:office" xmlns:r="http://schemas.openxmlformats.org/officeDocument/2006/relationships" xmlns:m="http://schemas.openxmlformats.org/officeDocument/2006/math" xmlns:v="urn:schemas-microsoft-com:vml" xmlns:wp14="http://schemas.microsoft.com/office/word/2010/wordprocessingDrawing" xmlns:wp="http://schemas.openxmlformats.org/drawingml/2006/wordprocessingDrawing" xmlns:w10="urn:schemas-microsoft-com:office:word" xmlns:w="http://schemas.openxmlformats.org/wordprocessingml/2006/main" xmlns:w14="http://schemas.microsoft.com/office/word/2010/wordml" xmlns:w15="http://schemas.microsoft.com/office/word/2012/wordml" xmlns:w16cex="http://schemas.microsoft.com/office/word/2018/wordml/cex" xmlns:w16cid="http://schemas.microsoft.com/office/word/2016/wordml/cid" xmlns:w16="http://schemas.microsoft.com/office/word/2018/wordml" xmlns:w16sdtdh="http://schemas.microsoft.com/office/word/2020/wordml/sdtdatahash" xmlns:w16se="http://schemas.microsoft.com/office/word/2015/wordml/symex" xmlns:wpg="http://schemas.microsoft.com/office/word/2010/wordprocessingGroup" xmlns:wpi="http://schemas.microsoft.com/office/word/2010/wordprocessingInk" xmlns:wne="http://schemas.microsoft.com/office/word/2006/wordml" xmlns:wps="http://schemas.microsoft.com/office/word/2010/wordprocessingShape" mc:Ignorable="w14 w15 w16se w16cid w16 w16cex w16sdtdh wp14">
+  <w:p>
+    <w:r>
+      <w:rPr>
+        <w:noProof/>
+        <w:lang w:val="en-US"/>
+      </w:rPr>
+      <w:drawing>
+        <wp:anchor distT="0" distB="0" distL="114300" distR="114300" simplePos="0" relativeHeight="251657216" behindDoc="1" locked="0" layoutInCell="1" allowOverlap="1" wp14:anchorId="37AE917C" wp14:editId="3F101B70">
+          <wp:simplePos x="0" y="0"/>
+          <wp:positionH relativeFrom="page">
+            <wp:posOffset>0</wp:posOffset>
+          </wp:positionH>
+          <wp:positionV relativeFrom="page">
+            <wp:posOffset>5496</wp:posOffset>
+          </wp:positionV>
+          <wp:extent cx="7555698" cy="10679883"/>
+          <wp:effectExtent l="0" t="0" r="7620" b="7620"/>
+          <wp:wrapNone/>
+          <wp:docPr id="13" name="Picture 16"/>
+          <wp:cNvGraphicFramePr>
+            <a:graphicFrameLocks xmlns:a="http://schemas.openxmlformats.org/drawingml/2006/main" noChangeAspect="1"/>
+          </wp:cNvGraphicFramePr>
+          <a:graphic xmlns:a="http://schemas.openxmlformats.org/drawingml/2006/main">
+            <a:graphicData uri="http://schemas.openxmlformats.org/drawingml/2006/picture">
+              <pic:pic xmlns:pic="http://schemas.openxmlformats.org/drawingml/2006/picture">
+                <pic:nvPicPr>
+                  <pic:cNvPr id="1" name="ginutech-letterhead.png"/>
+                  <pic:cNvPicPr/>
+                </pic:nvPicPr>
+                <pic:blipFill>
+                  <a:blip r:embed="rId1" cstate="print">
+                    <a:extLst>
+                      <a:ext uri="{28A0092B-C50C-407E-A947-70E740481C1C}">
+                        <a14:useLocalDpi xmlns:a14="http://schemas.microsoft.com/office/drawing/2010/main" val="0"/>
+                      </a:ext>
+                    </a:extLst>
+                  </a:blip>
+                  <a:stretch>
+                    <a:fillRect/>
+                  </a:stretch>
+                </pic:blipFill>
+                <pic:spPr>
+                  <a:xfrm>
+                    <a:off x="0" y="0"/>
+                    <a:ext cx="7555698" cy="10679883"/>
+                  </a:xfrm>
+                  <a:prstGeom prst="rect">
+                    <a:avLst/>
+                  </a:prstGeom>
+                </pic:spPr>
+              </pic:pic>
+            </a:graphicData>
+          </a:graphic>
+          <wp14:sizeRelH relativeFrom="margin">
+            <wp14:pctWidth>0</wp14:pctWidth>
+          </wp14:sizeRelH>
+          <wp14:sizeRelV relativeFrom="margin">
+            <wp14:pctHeight>0</wp14:pctHeight>
+          </wp14:sizeRelV>
+        </wp:anchor>
+      </w:drawing>
+    </w:r>
+  </w:p>
+</w:hdr>
+</file>
+
+<file path=word/header16.xml><?xml version="1.0" encoding="utf-8"?>
+<w:hdr xmlns:wpc="http://schemas.microsoft.com/office/word/2010/wordprocessingCanvas" xmlns:cx="http://schemas.microsoft.com/office/drawing/2014/chartex" xmlns:cx1="http://schemas.microsoft.com/office/drawing/2015/9/8/chartex" xmlns:cx2="http://schemas.microsoft.com/office/drawing/2015/10/21/chartex" xmlns:cx3="http://schemas.microsoft.com/office/drawing/2016/5/9/chartex" xmlns:cx4="http://schemas.microsoft.com/office/drawing/2016/5/10/chartex" xmlns:cx5="http://schemas.microsoft.com/office/drawing/2016/5/11/chartex" xmlns:cx6="http://schemas.microsoft.com/office/drawing/2016/5/12/chartex" xmlns:cx7="http://schemas.microsoft.com/office/drawing/2016/5/13/chartex" xmlns:cx8="http://schemas.microsoft.com/office/drawing/2016/5/14/chartex" xmlns:mc="http://schemas.openxmlformats.org/markup-compatibility/2006" xmlns:aink="http://schemas.microsoft.com/office/drawing/2016/ink" xmlns:am3d="http://schemas.microsoft.com/office/drawing/2017/model3d" xmlns:o="urn:schemas-microsoft-com:office:office" xmlns:r="http://schemas.openxmlformats.org/officeDocument/2006/relationships" xmlns:m="http://schemas.openxmlformats.org/officeDocument/2006/math" xmlns:v="urn:schemas-microsoft-com:vml" xmlns:wp14="http://schemas.microsoft.com/office/word/2010/wordprocessingDrawing" xmlns:wp="http://schemas.openxmlformats.org/drawingml/2006/wordprocessingDrawing" xmlns:w10="urn:schemas-microsoft-com:office:word" xmlns:w="http://schemas.openxmlformats.org/wordprocessingml/2006/main" xmlns:w14="http://schemas.microsoft.com/office/word/2010/wordml" xmlns:w15="http://schemas.microsoft.com/office/word/2012/wordml" xmlns:w16cex="http://schemas.microsoft.com/office/word/2018/wordml/cex" xmlns:w16cid="http://schemas.microsoft.com/office/word/2016/wordml/cid" xmlns:w16="http://schemas.microsoft.com/office/word/2018/wordml" xmlns:w16sdtdh="http://schemas.microsoft.com/office/word/2020/wordml/sdtdatahash" xmlns:w16se="http://schemas.microsoft.com/office/word/2015/wordml/symex" xmlns:wpg="http://schemas.microsoft.com/office/word/2010/wordprocessingGroup" xmlns:wpi="http://schemas.microsoft.com/office/word/2010/wordprocessingInk" xmlns:wne="http://schemas.microsoft.com/office/word/2006/wordml" xmlns:wps="http://schemas.microsoft.com/office/word/2010/wordprocessingShape" mc:Ignorable="w14 w15 w16se w16cid w16 w16cex w16sdtdh wp14">
+  <w:p>
+    <w:r>
+      <w:rPr>
+        <w:noProof/>
+        <w:lang w:val="en-US"/>
+      </w:rPr>
+      <w:drawing>
+        <wp:anchor distT="0" distB="0" distL="114300" distR="114300" simplePos="0" relativeHeight="251658240" behindDoc="1" locked="0" layoutInCell="1" allowOverlap="1" wp14:anchorId="67F965E9" wp14:editId="65C78DC2">
+          <wp:simplePos x="0" y="0"/>
+          <wp:positionH relativeFrom="page">
+            <wp:posOffset>0</wp:posOffset>
+          </wp:positionH>
+          <wp:positionV relativeFrom="page">
+            <wp:posOffset>5496</wp:posOffset>
+          </wp:positionV>
+          <wp:extent cx="7555698" cy="10679883"/>
+          <wp:effectExtent l="0" t="0" r="7620" b="7620"/>
+          <wp:wrapNone/>
+          <wp:docPr id="18" name="Picture 16"/>
+          <wp:cNvGraphicFramePr>
+            <a:graphicFrameLocks xmlns:a="http://schemas.openxmlformats.org/drawingml/2006/main" noChangeAspect="1"/>
+          </wp:cNvGraphicFramePr>
+          <a:graphic xmlns:a="http://schemas.openxmlformats.org/drawingml/2006/main">
+            <a:graphicData uri="http://schemas.openxmlformats.org/drawingml/2006/picture">
+              <pic:pic xmlns:pic="http://schemas.openxmlformats.org/drawingml/2006/picture">
+                <pic:nvPicPr>
+                  <pic:cNvPr id="1" name="ginutech-letterhead.png"/>
+                  <pic:cNvPicPr/>
+                </pic:nvPicPr>
+                <pic:blipFill>
+                  <a:blip r:embed="rId1" cstate="print">
+                    <a:extLst>
+                      <a:ext uri="{28A0092B-C50C-407E-A947-70E740481C1C}">
+                        <a14:useLocalDpi xmlns:a14="http://schemas.microsoft.com/office/drawing/2010/main" val="0"/>
+                      </a:ext>
+                    </a:extLst>
+                  </a:blip>
+                  <a:stretch>
+                    <a:fillRect/>
+                  </a:stretch>
+                </pic:blipFill>
+                <pic:spPr>
+                  <a:xfrm>
+                    <a:off x="0" y="0"/>
+                    <a:ext cx="7555698" cy="10679883"/>
+                  </a:xfrm>
+                  <a:prstGeom prst="rect">
+                    <a:avLst/>
+                  </a:prstGeom>
+                </pic:spPr>
+              </pic:pic>
+            </a:graphicData>
+          </a:graphic>
+          <wp14:sizeRelH relativeFrom="margin">
+            <wp14:pctWidth>0</wp14:pctWidth>
+          </wp14:sizeRelH>
+          <wp14:sizeRelV relativeFrom="margin">
+            <wp14:pctHeight>0</wp14:pctHeight>
+          </wp14:sizeRelV>
+        </wp:anchor>
+      </w:drawing>
+    </w:r>
+  </w:p>
+</w:hdr>
+</file>
+
+<file path=word/header17.xml><?xml version="1.0" encoding="utf-8"?>
+<w:hdr xmlns:wpc="http://schemas.microsoft.com/office/word/2010/wordprocessingCanvas" xmlns:cx="http://schemas.microsoft.com/office/drawing/2014/chartex" xmlns:cx1="http://schemas.microsoft.com/office/drawing/2015/9/8/chartex" xmlns:cx2="http://schemas.microsoft.com/office/drawing/2015/10/21/chartex" xmlns:cx3="http://schemas.microsoft.com/office/drawing/2016/5/9/chartex" xmlns:cx4="http://schemas.microsoft.com/office/drawing/2016/5/10/chartex" xmlns:cx5="http://schemas.microsoft.com/office/drawing/2016/5/11/chartex" xmlns:cx6="http://schemas.microsoft.com/office/drawing/2016/5/12/chartex" xmlns:cx7="http://schemas.microsoft.com/office/drawing/2016/5/13/chartex" xmlns:cx8="http://schemas.microsoft.com/office/drawing/2016/5/14/chartex" xmlns:mc="http://schemas.openxmlformats.org/markup-compatibility/2006" xmlns:aink="http://schemas.microsoft.com/office/drawing/2016/ink" xmlns:am3d="http://schemas.microsoft.com/office/drawing/2017/model3d" xmlns:o="urn:schemas-microsoft-com:office:office" xmlns:r="http://schemas.openxmlformats.org/officeDocument/2006/relationships" xmlns:m="http://schemas.openxmlformats.org/officeDocument/2006/math" xmlns:v="urn:schemas-microsoft-com:vml" xmlns:wp14="http://schemas.microsoft.com/office/word/2010/wordprocessingDrawing" xmlns:wp="http://schemas.openxmlformats.org/drawingml/2006/wordprocessingDrawing" xmlns:w10="urn:schemas-microsoft-com:office:word" xmlns:w="http://schemas.openxmlformats.org/wordprocessingml/2006/main" xmlns:w14="http://schemas.microsoft.com/office/word/2010/wordml" xmlns:w15="http://schemas.microsoft.com/office/word/2012/wordml" xmlns:w16cex="http://schemas.microsoft.com/office/word/2018/wordml/cex" xmlns:w16cid="http://schemas.microsoft.com/office/word/2016/wordml/cid" xmlns:w16="http://schemas.microsoft.com/office/word/2018/wordml" xmlns:w16sdtdh="http://schemas.microsoft.com/office/word/2020/wordml/sdtdatahash" xmlns:w16se="http://schemas.microsoft.com/office/word/2015/wordml/symex" xmlns:wpg="http://schemas.microsoft.com/office/word/2010/wordprocessingGroup" xmlns:wpi="http://schemas.microsoft.com/office/word/2010/wordprocessingInk" xmlns:wne="http://schemas.microsoft.com/office/word/2006/wordml" xmlns:wps="http://schemas.microsoft.com/office/word/2010/wordprocessingShape" mc:Ignorable="w14 w15 w16se w16cid w16 w16cex w16sdtdh wp14">
+  <w:p>
+    <w:r>
+      <w:rPr>
+        <w:noProof/>
+        <w:lang w:val="en-US"/>
+      </w:rPr>
+      <w:drawing>
+        <wp:anchor distT="0" distB="0" distL="114300" distR="114300" simplePos="0" relativeHeight="251659264" behindDoc="1" locked="0" layoutInCell="1" allowOverlap="1" wp14:anchorId="33963DD1" wp14:editId="25CE5BCF">
+          <wp:simplePos x="0" y="0"/>
+          <wp:positionH relativeFrom="page">
+            <wp:posOffset>0</wp:posOffset>
+          </wp:positionH>
+          <wp:positionV relativeFrom="page">
+            <wp:posOffset>5496</wp:posOffset>
+          </wp:positionV>
+          <wp:extent cx="7555698" cy="10679883"/>
+          <wp:effectExtent l="0" t="0" r="7620" b="7620"/>
+          <wp:wrapNone/>
+          <wp:docPr id="15" name="Picture 16"/>
+          <wp:cNvGraphicFramePr>
+            <a:graphicFrameLocks xmlns:a="http://schemas.openxmlformats.org/drawingml/2006/main" noChangeAspect="1"/>
+          </wp:cNvGraphicFramePr>
+          <a:graphic xmlns:a="http://schemas.openxmlformats.org/drawingml/2006/main">
+            <a:graphicData uri="http://schemas.openxmlformats.org/drawingml/2006/picture">
+              <pic:pic xmlns:pic="http://schemas.openxmlformats.org/drawingml/2006/picture">
+                <pic:nvPicPr>
+                  <pic:cNvPr id="1" name="ginutech-letterhead.png"/>
+                  <pic:cNvPicPr/>
+                </pic:nvPicPr>
+                <pic:blipFill>
+                  <a:blip r:embed="rId1" cstate="print">
+                    <a:extLst>
+                      <a:ext uri="{28A0092B-C50C-407E-A947-70E740481C1C}">
+                        <a14:useLocalDpi xmlns:a14="http://schemas.microsoft.com/office/drawing/2010/main" val="0"/>
+                      </a:ext>
+                    </a:extLst>
+                  </a:blip>
+                  <a:stretch>
+                    <a:fillRect/>
+                  </a:stretch>
+                </pic:blipFill>
+                <pic:spPr>
+                  <a:xfrm>
+                    <a:off x="0" y="0"/>
+                    <a:ext cx="7555698" cy="10679883"/>
+                  </a:xfrm>
+                  <a:prstGeom prst="rect">
+                    <a:avLst/>
+                  </a:prstGeom>
+                </pic:spPr>
+              </pic:pic>
+            </a:graphicData>
+          </a:graphic>
+          <wp14:sizeRelH relativeFrom="margin">
+            <wp14:pctWidth>0</wp14:pctWidth>
+          </wp14:sizeRelH>
+          <wp14:sizeRelV relativeFrom="margin">
+            <wp14:pctHeight>0</wp14:pctHeight>
+          </wp14:sizeRelV>
+        </wp:anchor>
+      </w:drawing>
+    </w:r>
+  </w:p>
+</w:hdr>
+</file>
+
+<file path=word/header18.xml><?xml version="1.0" encoding="utf-8"?>
+<w:hdr xmlns:wpc="http://schemas.microsoft.com/office/word/2010/wordprocessingCanvas" xmlns:cx="http://schemas.microsoft.com/office/drawing/2014/chartex" xmlns:cx1="http://schemas.microsoft.com/office/drawing/2015/9/8/chartex" xmlns:cx2="http://schemas.microsoft.com/office/drawing/2015/10/21/chartex" xmlns:cx3="http://schemas.microsoft.com/office/drawing/2016/5/9/chartex" xmlns:cx4="http://schemas.microsoft.com/office/drawing/2016/5/10/chartex" xmlns:cx5="http://schemas.microsoft.com/office/drawing/2016/5/11/chartex" xmlns:cx6="http://schemas.microsoft.com/office/drawing/2016/5/12/chartex" xmlns:cx7="http://schemas.microsoft.com/office/drawing/2016/5/13/chartex" xmlns:cx8="http://schemas.microsoft.com/office/drawing/2016/5/14/chartex" xmlns:mc="http://schemas.openxmlformats.org/markup-compatibility/2006" xmlns:aink="http://schemas.microsoft.com/office/drawing/2016/ink" xmlns:am3d="http://schemas.microsoft.com/office/drawing/2017/model3d" xmlns:o="urn:schemas-microsoft-com:office:office" xmlns:r="http://schemas.openxmlformats.org/officeDocument/2006/relationships" xmlns:m="http://schemas.openxmlformats.org/officeDocument/2006/math" xmlns:v="urn:schemas-microsoft-com:vml" xmlns:wp14="http://schemas.microsoft.com/office/word/2010/wordprocessingDrawing" xmlns:wp="http://schemas.openxmlformats.org/drawingml/2006/wordprocessingDrawing" xmlns:w10="urn:schemas-microsoft-com:office:word" xmlns:w="http://schemas.openxmlformats.org/wordprocessingml/2006/main" xmlns:w14="http://schemas.microsoft.com/office/word/2010/wordml" xmlns:w15="http://schemas.microsoft.com/office/word/2012/wordml" xmlns:w16cex="http://schemas.microsoft.com/office/word/2018/wordml/cex" xmlns:w16cid="http://schemas.microsoft.com/office/word/2016/wordml/cid" xmlns:w16="http://schemas.microsoft.com/office/word/2018/wordml" xmlns:w16sdtdh="http://schemas.microsoft.com/office/word/2020/wordml/sdtdatahash" xmlns:w16se="http://schemas.microsoft.com/office/word/2015/wordml/symex" xmlns:wpg="http://schemas.microsoft.com/office/word/2010/wordprocessingGroup" xmlns:wpi="http://schemas.microsoft.com/office/word/2010/wordprocessingInk" xmlns:wne="http://schemas.microsoft.com/office/word/2006/wordml" xmlns:wps="http://schemas.microsoft.com/office/word/2010/wordprocessingShape" mc:Ignorable="w14 w15 w16se w16cid w16 w16cex w16sdtdh wp14">
+  <w:p>
+    <w:r>
+      <w:rPr>
+        <w:noProof/>
+        <w:lang w:val="en-US"/>
+      </w:rPr>
+      <w:drawing>
+        <wp:anchor distT="0" distB="0" distL="114300" distR="114300" simplePos="0" relativeHeight="251660288" behindDoc="1" locked="0" layoutInCell="1" allowOverlap="1" wp14:anchorId="78A4E8B7" wp14:editId="6980B07C">
+          <wp:simplePos x="0" y="0"/>
+          <wp:positionH relativeFrom="page">
+            <wp:posOffset>0</wp:posOffset>
+          </wp:positionH>
+          <wp:positionV relativeFrom="page">
+            <wp:posOffset>5496</wp:posOffset>
+          </wp:positionV>
+          <wp:extent cx="7555698" cy="10679883"/>
+          <wp:effectExtent l="0" t="0" r="7620" b="7620"/>
+          <wp:wrapNone/>
+          <wp:docPr id="17" name="Picture 16"/>
+          <wp:cNvGraphicFramePr>
+            <a:graphicFrameLocks xmlns:a="http://schemas.openxmlformats.org/drawingml/2006/main" noChangeAspect="1"/>
+          </wp:cNvGraphicFramePr>
+          <a:graphic xmlns:a="http://schemas.openxmlformats.org/drawingml/2006/main">
+            <a:graphicData uri="http://schemas.openxmlformats.org/drawingml/2006/picture">
+              <pic:pic xmlns:pic="http://schemas.openxmlformats.org/drawingml/2006/picture">
+                <pic:nvPicPr>
+                  <pic:cNvPr id="1" name="ginutech-letterhead.png"/>
+                  <pic:cNvPicPr/>
+                </pic:nvPicPr>
+                <pic:blipFill>
+                  <a:blip r:embed="rId1" cstate="print">
+                    <a:extLst>
+                      <a:ext uri="{28A0092B-C50C-407E-A947-70E740481C1C}">
+                        <a14:useLocalDpi xmlns:a14="http://schemas.microsoft.com/office/drawing/2010/main" val="0"/>
+                      </a:ext>
+                    </a:extLst>
+                  </a:blip>
+                  <a:stretch>
+                    <a:fillRect/>
+                  </a:stretch>
+                </pic:blipFill>
+                <pic:spPr>
+                  <a:xfrm>
+                    <a:off x="0" y="0"/>
+                    <a:ext cx="7555698" cy="10679883"/>
+                  </a:xfrm>
+                  <a:prstGeom prst="rect">
+                    <a:avLst/>
+                  </a:prstGeom>
+                </pic:spPr>
+              </pic:pic>
+            </a:graphicData>
+          </a:graphic>
+          <wp14:sizeRelH relativeFrom="margin">
+            <wp14:pctWidth>0</wp14:pctWidth>
+          </wp14:sizeRelH>
+          <wp14:sizeRelV relativeFrom="margin">
+            <wp14:pctHeight>0</wp14:pctHeight>
+          </wp14:sizeRelV>
+        </wp:anchor>
+      </w:drawing>
+    </w:r>
+  </w:p>
+</w:hdr>
+</file>
+
+<file path=word/header19.xml><?xml version="1.0" encoding="utf-8"?>
+<w:hdr xmlns:wpc="http://schemas.microsoft.com/office/word/2010/wordprocessingCanvas" xmlns:cx="http://schemas.microsoft.com/office/drawing/2014/chartex" xmlns:cx1="http://schemas.microsoft.com/office/drawing/2015/9/8/chartex" xmlns:cx2="http://schemas.microsoft.com/office/drawing/2015/10/21/chartex" xmlns:cx3="http://schemas.microsoft.com/office/drawing/2016/5/9/chartex" xmlns:cx4="http://schemas.microsoft.com/office/drawing/2016/5/10/chartex" xmlns:cx5="http://schemas.microsoft.com/office/drawing/2016/5/11/chartex" xmlns:cx6="http://schemas.microsoft.com/office/drawing/2016/5/12/chartex" xmlns:cx7="http://schemas.microsoft.com/office/drawing/2016/5/13/chartex" xmlns:cx8="http://schemas.microsoft.com/office/drawing/2016/5/14/chartex" xmlns:mc="http://schemas.openxmlformats.org/markup-compatibility/2006" xmlns:aink="http://schemas.microsoft.com/office/drawing/2016/ink" xmlns:am3d="http://schemas.microsoft.com/office/drawing/2017/model3d" xmlns:o="urn:schemas-microsoft-com:office:office" xmlns:r="http://schemas.openxmlformats.org/officeDocument/2006/relationships" xmlns:m="http://schemas.openxmlformats.org/officeDocument/2006/math" xmlns:v="urn:schemas-microsoft-com:vml" xmlns:wp14="http://schemas.microsoft.com/office/word/2010/wordprocessingDrawing" xmlns:wp="http://schemas.openxmlformats.org/drawingml/2006/wordprocessingDrawing" xmlns:w10="urn:schemas-microsoft-com:office:word" xmlns:w="http://schemas.openxmlformats.org/wordprocessingml/2006/main" xmlns:w14="http://schemas.microsoft.com/office/word/2010/wordml" xmlns:w15="http://schemas.microsoft.com/office/word/2012/wordml" xmlns:w16cex="http://schemas.microsoft.com/office/word/2018/wordml/cex" xmlns:w16cid="http://schemas.microsoft.com/office/word/2016/wordml/cid" xmlns:w16="http://schemas.microsoft.com/office/word/2018/wordml" xmlns:w16sdtdh="http://schemas.microsoft.com/office/word/2020/wordml/sdtdatahash" xmlns:w16se="http://schemas.microsoft.com/office/word/2015/wordml/symex" xmlns:wpg="http://schemas.microsoft.com/office/word/2010/wordprocessingGroup" xmlns:wpi="http://schemas.microsoft.com/office/word/2010/wordprocessingInk" xmlns:wne="http://schemas.microsoft.com/office/word/2006/wordml" xmlns:wps="http://schemas.microsoft.com/office/word/2010/wordprocessingShape" mc:Ignorable="w14 w15 w16se w16cid w16 w16cex w16sdtdh wp14">
+  <w:p>
+    <w:r>
+      <w:rPr>
+        <w:noProof/>
+        <w:lang w:val="en-US"/>
+      </w:rPr>
+      <w:drawing>
+        <wp:anchor distT="0" distB="0" distL="114300" distR="114300" simplePos="0" relativeHeight="251661312" behindDoc="1" locked="0" layoutInCell="1" allowOverlap="1" wp14:anchorId="08FF7691" wp14:editId="4B745345">
+          <wp:simplePos x="0" y="0"/>
+          <wp:positionH relativeFrom="page">
+            <wp:posOffset>0</wp:posOffset>
+          </wp:positionH>
+          <wp:positionV relativeFrom="page">
+            <wp:posOffset>5496</wp:posOffset>
+          </wp:positionV>
+          <wp:extent cx="7555698" cy="10679883"/>
+          <wp:effectExtent l="0" t="0" r="7620" b="7620"/>
+          <wp:wrapNone/>
+          <wp:docPr id="21" name="Picture 16"/>
+          <wp:cNvGraphicFramePr>
+            <a:graphicFrameLocks xmlns:a="http://schemas.openxmlformats.org/drawingml/2006/main" noChangeAspect="1"/>
+          </wp:cNvGraphicFramePr>
+          <a:graphic xmlns:a="http://schemas.openxmlformats.org/drawingml/2006/main">
+            <a:graphicData uri="http://schemas.openxmlformats.org/drawingml/2006/picture">
+              <pic:pic xmlns:pic="http://schemas.openxmlformats.org/drawingml/2006/picture">
+                <pic:nvPicPr>
+                  <pic:cNvPr id="1" name="ginutech-letterhead.png"/>
+                  <pic:cNvPicPr/>
+                </pic:nvPicPr>
+                <pic:blipFill>
+                  <a:blip r:embed="rId1" cstate="print">
+                    <a:extLst>
+                      <a:ext uri="{28A0092B-C50C-407E-A947-70E740481C1C}">
+                        <a14:useLocalDpi xmlns:a14="http://schemas.microsoft.com/office/drawing/2010/main" val="0"/>
+                      </a:ext>
+                    </a:extLst>
+                  </a:blip>
+                  <a:stretch>
+                    <a:fillRect/>
+                  </a:stretch>
+                </pic:blipFill>
+                <pic:spPr>
+                  <a:xfrm>
+                    <a:off x="0" y="0"/>
+                    <a:ext cx="7555698" cy="10679883"/>
+                  </a:xfrm>
+                  <a:prstGeom prst="rect">
+                    <a:avLst/>
+                  </a:prstGeom>
+                </pic:spPr>
+              </pic:pic>
+            </a:graphicData>
+          </a:graphic>
+          <wp14:sizeRelH relativeFrom="margin">
+            <wp14:pctWidth>0</wp14:pctWidth>
+          </wp14:sizeRelH>
+          <wp14:sizeRelV relativeFrom="margin">
+            <wp14:pctHeight>0</wp14:pctHeight>
+          </wp14:sizeRelV>
         </wp:anchor>
       </w:drawing>
     </w:r>
@@ -12231,43 +10529,42 @@
 <file path=word/header2.xml><?xml version="1.0" encoding="utf-8"?>
 <w:hdr xmlns:wpc="http://schemas.microsoft.com/office/word/2010/wordprocessingCanvas" xmlns:cx="http://schemas.microsoft.com/office/drawing/2014/chartex" xmlns:cx1="http://schemas.microsoft.com/office/drawing/2015/9/8/chartex" xmlns:cx2="http://schemas.microsoft.com/office/drawing/2015/10/21/chartex" xmlns:cx3="http://schemas.microsoft.com/office/drawing/2016/5/9/chartex" xmlns:cx4="http://schemas.microsoft.com/office/drawing/2016/5/10/chartex" xmlns:cx5="http://schemas.microsoft.com/office/drawing/2016/5/11/chartex" xmlns:cx6="http://schemas.microsoft.com/office/drawing/2016/5/12/chartex" xmlns:cx7="http://schemas.microsoft.com/office/drawing/2016/5/13/chartex" xmlns:cx8="http://schemas.microsoft.com/office/drawing/2016/5/14/chartex" xmlns:mc="http://schemas.openxmlformats.org/markup-compatibility/2006" xmlns:aink="http://schemas.microsoft.com/office/drawing/2016/ink" xmlns:am3d="http://schemas.microsoft.com/office/drawing/2017/model3d" xmlns:o="urn:schemas-microsoft-com:office:office" xmlns:r="http://schemas.openxmlformats.org/officeDocument/2006/relationships" xmlns:m="http://schemas.openxmlformats.org/officeDocument/2006/math" xmlns:v="urn:schemas-microsoft-com:vml" xmlns:wp14="http://schemas.microsoft.com/office/word/2010/wordprocessingDrawing" xmlns:wp="http://schemas.openxmlformats.org/drawingml/2006/wordprocessingDrawing" xmlns:w10="urn:schemas-microsoft-com:office:word" xmlns:w="http://schemas.openxmlformats.org/wordprocessingml/2006/main" xmlns:w14="http://schemas.microsoft.com/office/word/2010/wordml" xmlns:w15="http://schemas.microsoft.com/office/word/2012/wordml" xmlns:w16cex="http://schemas.microsoft.com/office/word/2018/wordml/cex" xmlns:w16cid="http://schemas.microsoft.com/office/word/2016/wordml/cid" xmlns:w16="http://schemas.microsoft.com/office/word/2018/wordml" xmlns:w16sdtdh="http://schemas.microsoft.com/office/word/2020/wordml/sdtdatahash" xmlns:w16se="http://schemas.microsoft.com/office/word/2015/wordml/symex" xmlns:wpg="http://schemas.microsoft.com/office/word/2010/wordprocessingGroup" xmlns:wpi="http://schemas.microsoft.com/office/word/2010/wordprocessingInk" xmlns:wne="http://schemas.microsoft.com/office/word/2006/wordml" xmlns:wps="http://schemas.microsoft.com/office/word/2010/wordprocessingShape" mc:Ignorable="w14 w15 w16se w16cid w16 w16cex w16sdtdh wp14">
   <w:p>
-    <w:pPr>
-      <w:pStyle w:val="Corpsdetexte"/>
-      <w:spacing w:line="14" w:lineRule="auto"/>
-      <w:rPr>
-        <w:sz w:val="20"/>
-      </w:rPr>
-    </w:pPr>
     <w:r>
       <w:rPr>
         <w:noProof/>
-        <w:sz w:val="20"/>
+        <w:lang w:val="en-US"/>
       </w:rPr>
       <w:drawing>
-        <wp:anchor distT="0" distB="0" distL="0" distR="0" simplePos="0" relativeHeight="251655680" behindDoc="1" locked="0" layoutInCell="1" allowOverlap="1" wp14:anchorId="6C1F0D97" wp14:editId="7E593FD4">
+        <wp:anchor distT="0" distB="0" distL="114300" distR="114300" simplePos="0" relativeHeight="251630080" behindDoc="1" locked="0" layoutInCell="1" allowOverlap="1" wp14:anchorId="57E0EBA8" wp14:editId="6ABD7FB8">
           <wp:simplePos x="0" y="0"/>
           <wp:positionH relativeFrom="page">
-            <wp:posOffset>8138795</wp:posOffset>
+            <wp:posOffset>0</wp:posOffset>
           </wp:positionH>
           <wp:positionV relativeFrom="page">
-            <wp:posOffset>31115</wp:posOffset>
+            <wp:posOffset>5496</wp:posOffset>
           </wp:positionV>
-          <wp:extent cx="1028699" cy="716267"/>
-          <wp:effectExtent l="0" t="0" r="0" b="0"/>
+          <wp:extent cx="7555698" cy="10679883"/>
+          <wp:effectExtent l="0" t="0" r="7620" b="7620"/>
           <wp:wrapNone/>
-          <wp:docPr id="14" name="Image 14"/>
+          <wp:docPr id="16" name="Picture 16"/>
           <wp:cNvGraphicFramePr>
-            <a:graphicFrameLocks xmlns:a="http://schemas.openxmlformats.org/drawingml/2006/main"/>
+            <a:graphicFrameLocks xmlns:a="http://schemas.openxmlformats.org/drawingml/2006/main" noChangeAspect="1"/>
           </wp:cNvGraphicFramePr>
           <a:graphic xmlns:a="http://schemas.openxmlformats.org/drawingml/2006/main">
             <a:graphicData uri="http://schemas.openxmlformats.org/drawingml/2006/picture">
               <pic:pic xmlns:pic="http://schemas.openxmlformats.org/drawingml/2006/picture">
                 <pic:nvPicPr>
-                  <pic:cNvPr id="14" name="Image 14"/>
+                  <pic:cNvPr id="1" name="ginutech-letterhead.png"/>
                   <pic:cNvPicPr/>
                 </pic:nvPicPr>
                 <pic:blipFill>
-                  <a:blip r:embed="rId1" cstate="print"/>
+                  <a:blip r:embed="rId1" cstate="print">
+                    <a:extLst>
+                      <a:ext uri="{28A0092B-C50C-407E-A947-70E740481C1C}">
+                        <a14:useLocalDpi xmlns:a14="http://schemas.microsoft.com/office/drawing/2010/main" val="0"/>
+                      </a:ext>
+                    </a:extLst>
+                  </a:blip>
                   <a:stretch>
                     <a:fillRect/>
                   </a:stretch>
@@ -12275,7 +10572,7 @@
                 <pic:spPr>
                   <a:xfrm>
                     <a:off x="0" y="0"/>
-                    <a:ext cx="1028699" cy="716267"/>
+                    <a:ext cx="7555698" cy="10679883"/>
                   </a:xfrm>
                   <a:prstGeom prst="rect">
                     <a:avLst/>
@@ -12284,39 +10581,58 @@
               </pic:pic>
             </a:graphicData>
           </a:graphic>
+          <wp14:sizeRelH relativeFrom="margin">
+            <wp14:pctWidth>0</wp14:pctWidth>
+          </wp14:sizeRelH>
+          <wp14:sizeRelV relativeFrom="margin">
+            <wp14:pctHeight>0</wp14:pctHeight>
+          </wp14:sizeRelV>
         </wp:anchor>
       </w:drawing>
     </w:r>
+  </w:p>
+</w:hdr>
+</file>
+
+<file path=word/header20.xml><?xml version="1.0" encoding="utf-8"?>
+<w:hdr xmlns:wpc="http://schemas.microsoft.com/office/word/2010/wordprocessingCanvas" xmlns:cx="http://schemas.microsoft.com/office/drawing/2014/chartex" xmlns:cx1="http://schemas.microsoft.com/office/drawing/2015/9/8/chartex" xmlns:cx2="http://schemas.microsoft.com/office/drawing/2015/10/21/chartex" xmlns:cx3="http://schemas.microsoft.com/office/drawing/2016/5/9/chartex" xmlns:cx4="http://schemas.microsoft.com/office/drawing/2016/5/10/chartex" xmlns:cx5="http://schemas.microsoft.com/office/drawing/2016/5/11/chartex" xmlns:cx6="http://schemas.microsoft.com/office/drawing/2016/5/12/chartex" xmlns:cx7="http://schemas.microsoft.com/office/drawing/2016/5/13/chartex" xmlns:cx8="http://schemas.microsoft.com/office/drawing/2016/5/14/chartex" xmlns:mc="http://schemas.openxmlformats.org/markup-compatibility/2006" xmlns:aink="http://schemas.microsoft.com/office/drawing/2016/ink" xmlns:am3d="http://schemas.microsoft.com/office/drawing/2017/model3d" xmlns:o="urn:schemas-microsoft-com:office:office" xmlns:r="http://schemas.openxmlformats.org/officeDocument/2006/relationships" xmlns:m="http://schemas.openxmlformats.org/officeDocument/2006/math" xmlns:v="urn:schemas-microsoft-com:vml" xmlns:wp14="http://schemas.microsoft.com/office/word/2010/wordprocessingDrawing" xmlns:wp="http://schemas.openxmlformats.org/drawingml/2006/wordprocessingDrawing" xmlns:w10="urn:schemas-microsoft-com:office:word" xmlns:w="http://schemas.openxmlformats.org/wordprocessingml/2006/main" xmlns:w14="http://schemas.microsoft.com/office/word/2010/wordml" xmlns:w15="http://schemas.microsoft.com/office/word/2012/wordml" xmlns:w16cex="http://schemas.microsoft.com/office/word/2018/wordml/cex" xmlns:w16cid="http://schemas.microsoft.com/office/word/2016/wordml/cid" xmlns:w16="http://schemas.microsoft.com/office/word/2018/wordml" xmlns:w16sdtdh="http://schemas.microsoft.com/office/word/2020/wordml/sdtdatahash" xmlns:w16se="http://schemas.microsoft.com/office/word/2015/wordml/symex" xmlns:wpg="http://schemas.microsoft.com/office/word/2010/wordprocessingGroup" xmlns:wpi="http://schemas.microsoft.com/office/word/2010/wordprocessingInk" xmlns:wne="http://schemas.microsoft.com/office/word/2006/wordml" xmlns:wps="http://schemas.microsoft.com/office/word/2010/wordprocessingShape" mc:Ignorable="w14 w15 w16se w16cid w16 w16cex w16sdtdh wp14">
+  <w:p>
     <w:r>
       <w:rPr>
         <w:noProof/>
-        <w:sz w:val="20"/>
+        <w:lang w:val="en-US"/>
       </w:rPr>
       <w:drawing>
-        <wp:anchor distT="0" distB="0" distL="0" distR="0" simplePos="0" relativeHeight="251658752" behindDoc="1" locked="0" layoutInCell="1" allowOverlap="1" wp14:anchorId="40F2B076" wp14:editId="39686FDE">
+        <wp:anchor distT="0" distB="0" distL="114300" distR="114300" simplePos="0" relativeHeight="251662336" behindDoc="1" locked="0" layoutInCell="1" allowOverlap="1" wp14:anchorId="48AB598E" wp14:editId="70976E1B">
           <wp:simplePos x="0" y="0"/>
           <wp:positionH relativeFrom="page">
-            <wp:posOffset>1366443</wp:posOffset>
+            <wp:posOffset>0</wp:posOffset>
           </wp:positionH>
           <wp:positionV relativeFrom="page">
-            <wp:posOffset>54578</wp:posOffset>
+            <wp:posOffset>5496</wp:posOffset>
           </wp:positionV>
-          <wp:extent cx="713887" cy="608755"/>
-          <wp:effectExtent l="0" t="0" r="0" b="0"/>
+          <wp:extent cx="7555698" cy="10679883"/>
+          <wp:effectExtent l="0" t="0" r="7620" b="7620"/>
           <wp:wrapNone/>
-          <wp:docPr id="15" name="Image 15"/>
+          <wp:docPr id="19" name="Picture 16"/>
           <wp:cNvGraphicFramePr>
-            <a:graphicFrameLocks xmlns:a="http://schemas.openxmlformats.org/drawingml/2006/main"/>
+            <a:graphicFrameLocks xmlns:a="http://schemas.openxmlformats.org/drawingml/2006/main" noChangeAspect="1"/>
           </wp:cNvGraphicFramePr>
           <a:graphic xmlns:a="http://schemas.openxmlformats.org/drawingml/2006/main">
             <a:graphicData uri="http://schemas.openxmlformats.org/drawingml/2006/picture">
               <pic:pic xmlns:pic="http://schemas.openxmlformats.org/drawingml/2006/picture">
                 <pic:nvPicPr>
-                  <pic:cNvPr id="15" name="Image 15"/>
+                  <pic:cNvPr id="1" name="ginutech-letterhead.png"/>
                   <pic:cNvPicPr/>
                 </pic:nvPicPr>
                 <pic:blipFill>
-                  <a:blip r:embed="rId2" cstate="print"/>
+                  <a:blip r:embed="rId1" cstate="print">
+                    <a:extLst>
+                      <a:ext uri="{28A0092B-C50C-407E-A947-70E740481C1C}">
+                        <a14:useLocalDpi xmlns:a14="http://schemas.microsoft.com/office/drawing/2010/main" val="0"/>
+                      </a:ext>
+                    </a:extLst>
+                  </a:blip>
                   <a:stretch>
                     <a:fillRect/>
                   </a:stretch>
@@ -12324,7 +10640,7 @@
                 <pic:spPr>
                   <a:xfrm>
                     <a:off x="0" y="0"/>
-                    <a:ext cx="713887" cy="608755"/>
+                    <a:ext cx="7555698" cy="10679883"/>
                   </a:xfrm>
                   <a:prstGeom prst="rect">
                     <a:avLst/>
@@ -12333,6 +10649,488 @@
               </pic:pic>
             </a:graphicData>
           </a:graphic>
+          <wp14:sizeRelH relativeFrom="margin">
+            <wp14:pctWidth>0</wp14:pctWidth>
+          </wp14:sizeRelH>
+          <wp14:sizeRelV relativeFrom="margin">
+            <wp14:pctHeight>0</wp14:pctHeight>
+          </wp14:sizeRelV>
+        </wp:anchor>
+      </w:drawing>
+    </w:r>
+  </w:p>
+</w:hdr>
+</file>
+
+<file path=word/header21.xml><?xml version="1.0" encoding="utf-8"?>
+<w:hdr xmlns:wpc="http://schemas.microsoft.com/office/word/2010/wordprocessingCanvas" xmlns:cx="http://schemas.microsoft.com/office/drawing/2014/chartex" xmlns:cx1="http://schemas.microsoft.com/office/drawing/2015/9/8/chartex" xmlns:cx2="http://schemas.microsoft.com/office/drawing/2015/10/21/chartex" xmlns:cx3="http://schemas.microsoft.com/office/drawing/2016/5/9/chartex" xmlns:cx4="http://schemas.microsoft.com/office/drawing/2016/5/10/chartex" xmlns:cx5="http://schemas.microsoft.com/office/drawing/2016/5/11/chartex" xmlns:cx6="http://schemas.microsoft.com/office/drawing/2016/5/12/chartex" xmlns:cx7="http://schemas.microsoft.com/office/drawing/2016/5/13/chartex" xmlns:cx8="http://schemas.microsoft.com/office/drawing/2016/5/14/chartex" xmlns:mc="http://schemas.openxmlformats.org/markup-compatibility/2006" xmlns:aink="http://schemas.microsoft.com/office/drawing/2016/ink" xmlns:am3d="http://schemas.microsoft.com/office/drawing/2017/model3d" xmlns:o="urn:schemas-microsoft-com:office:office" xmlns:r="http://schemas.openxmlformats.org/officeDocument/2006/relationships" xmlns:m="http://schemas.openxmlformats.org/officeDocument/2006/math" xmlns:v="urn:schemas-microsoft-com:vml" xmlns:wp14="http://schemas.microsoft.com/office/word/2010/wordprocessingDrawing" xmlns:wp="http://schemas.openxmlformats.org/drawingml/2006/wordprocessingDrawing" xmlns:w10="urn:schemas-microsoft-com:office:word" xmlns:w="http://schemas.openxmlformats.org/wordprocessingml/2006/main" xmlns:w14="http://schemas.microsoft.com/office/word/2010/wordml" xmlns:w15="http://schemas.microsoft.com/office/word/2012/wordml" xmlns:w16cex="http://schemas.microsoft.com/office/word/2018/wordml/cex" xmlns:w16cid="http://schemas.microsoft.com/office/word/2016/wordml/cid" xmlns:w16="http://schemas.microsoft.com/office/word/2018/wordml" xmlns:w16sdtdh="http://schemas.microsoft.com/office/word/2020/wordml/sdtdatahash" xmlns:w16se="http://schemas.microsoft.com/office/word/2015/wordml/symex" xmlns:wpg="http://schemas.microsoft.com/office/word/2010/wordprocessingGroup" xmlns:wpi="http://schemas.microsoft.com/office/word/2010/wordprocessingInk" xmlns:wne="http://schemas.microsoft.com/office/word/2006/wordml" xmlns:wps="http://schemas.microsoft.com/office/word/2010/wordprocessingShape" mc:Ignorable="w14 w15 w16se w16cid w16 w16cex w16sdtdh wp14">
+  <w:p>
+    <w:r>
+      <w:rPr>
+        <w:noProof/>
+        <w:lang w:val="en-US"/>
+      </w:rPr>
+      <w:drawing>
+        <wp:anchor distT="0" distB="0" distL="114300" distR="114300" simplePos="0" relativeHeight="251663360" behindDoc="1" locked="0" layoutInCell="1" allowOverlap="1" wp14:anchorId="7C67F39F" wp14:editId="3AFA17AB">
+          <wp:simplePos x="0" y="0"/>
+          <wp:positionH relativeFrom="page">
+            <wp:posOffset>0</wp:posOffset>
+          </wp:positionH>
+          <wp:positionV relativeFrom="page">
+            <wp:posOffset>5496</wp:posOffset>
+          </wp:positionV>
+          <wp:extent cx="7555698" cy="10679883"/>
+          <wp:effectExtent l="0" t="0" r="7620" b="7620"/>
+          <wp:wrapNone/>
+          <wp:docPr id="20" name="Picture 16"/>
+          <wp:cNvGraphicFramePr>
+            <a:graphicFrameLocks xmlns:a="http://schemas.openxmlformats.org/drawingml/2006/main" noChangeAspect="1"/>
+          </wp:cNvGraphicFramePr>
+          <a:graphic xmlns:a="http://schemas.openxmlformats.org/drawingml/2006/main">
+            <a:graphicData uri="http://schemas.openxmlformats.org/drawingml/2006/picture">
+              <pic:pic xmlns:pic="http://schemas.openxmlformats.org/drawingml/2006/picture">
+                <pic:nvPicPr>
+                  <pic:cNvPr id="1" name="ginutech-letterhead.png"/>
+                  <pic:cNvPicPr/>
+                </pic:nvPicPr>
+                <pic:blipFill>
+                  <a:blip r:embed="rId1" cstate="print">
+                    <a:extLst>
+                      <a:ext uri="{28A0092B-C50C-407E-A947-70E740481C1C}">
+                        <a14:useLocalDpi xmlns:a14="http://schemas.microsoft.com/office/drawing/2010/main" val="0"/>
+                      </a:ext>
+                    </a:extLst>
+                  </a:blip>
+                  <a:stretch>
+                    <a:fillRect/>
+                  </a:stretch>
+                </pic:blipFill>
+                <pic:spPr>
+                  <a:xfrm>
+                    <a:off x="0" y="0"/>
+                    <a:ext cx="7555698" cy="10679883"/>
+                  </a:xfrm>
+                  <a:prstGeom prst="rect">
+                    <a:avLst/>
+                  </a:prstGeom>
+                </pic:spPr>
+              </pic:pic>
+            </a:graphicData>
+          </a:graphic>
+          <wp14:sizeRelH relativeFrom="margin">
+            <wp14:pctWidth>0</wp14:pctWidth>
+          </wp14:sizeRelH>
+          <wp14:sizeRelV relativeFrom="margin">
+            <wp14:pctHeight>0</wp14:pctHeight>
+          </wp14:sizeRelV>
+        </wp:anchor>
+      </w:drawing>
+    </w:r>
+  </w:p>
+</w:hdr>
+</file>
+
+<file path=word/header22.xml><?xml version="1.0" encoding="utf-8"?>
+<w:hdr xmlns:wpc="http://schemas.microsoft.com/office/word/2010/wordprocessingCanvas" xmlns:cx="http://schemas.microsoft.com/office/drawing/2014/chartex" xmlns:cx1="http://schemas.microsoft.com/office/drawing/2015/9/8/chartex" xmlns:cx2="http://schemas.microsoft.com/office/drawing/2015/10/21/chartex" xmlns:cx3="http://schemas.microsoft.com/office/drawing/2016/5/9/chartex" xmlns:cx4="http://schemas.microsoft.com/office/drawing/2016/5/10/chartex" xmlns:cx5="http://schemas.microsoft.com/office/drawing/2016/5/11/chartex" xmlns:cx6="http://schemas.microsoft.com/office/drawing/2016/5/12/chartex" xmlns:cx7="http://schemas.microsoft.com/office/drawing/2016/5/13/chartex" xmlns:cx8="http://schemas.microsoft.com/office/drawing/2016/5/14/chartex" xmlns:mc="http://schemas.openxmlformats.org/markup-compatibility/2006" xmlns:aink="http://schemas.microsoft.com/office/drawing/2016/ink" xmlns:am3d="http://schemas.microsoft.com/office/drawing/2017/model3d" xmlns:o="urn:schemas-microsoft-com:office:office" xmlns:r="http://schemas.openxmlformats.org/officeDocument/2006/relationships" xmlns:m="http://schemas.openxmlformats.org/officeDocument/2006/math" xmlns:v="urn:schemas-microsoft-com:vml" xmlns:wp14="http://schemas.microsoft.com/office/word/2010/wordprocessingDrawing" xmlns:wp="http://schemas.openxmlformats.org/drawingml/2006/wordprocessingDrawing" xmlns:w10="urn:schemas-microsoft-com:office:word" xmlns:w="http://schemas.openxmlformats.org/wordprocessingml/2006/main" xmlns:w14="http://schemas.microsoft.com/office/word/2010/wordml" xmlns:w15="http://schemas.microsoft.com/office/word/2012/wordml" xmlns:w16cex="http://schemas.microsoft.com/office/word/2018/wordml/cex" xmlns:w16cid="http://schemas.microsoft.com/office/word/2016/wordml/cid" xmlns:w16="http://schemas.microsoft.com/office/word/2018/wordml" xmlns:w16sdtdh="http://schemas.microsoft.com/office/word/2020/wordml/sdtdatahash" xmlns:w16se="http://schemas.microsoft.com/office/word/2015/wordml/symex" xmlns:wpg="http://schemas.microsoft.com/office/word/2010/wordprocessingGroup" xmlns:wpi="http://schemas.microsoft.com/office/word/2010/wordprocessingInk" xmlns:wne="http://schemas.microsoft.com/office/word/2006/wordml" xmlns:wps="http://schemas.microsoft.com/office/word/2010/wordprocessingShape" mc:Ignorable="w14 w15 w16se w16cid w16 w16cex w16sdtdh wp14">
+  <w:p>
+    <w:r>
+      <w:rPr>
+        <w:noProof/>
+        <w:lang w:val="en-US"/>
+      </w:rPr>
+      <w:drawing>
+        <wp:anchor distT="0" distB="0" distL="114300" distR="114300" simplePos="0" relativeHeight="251667456" behindDoc="1" locked="0" layoutInCell="1" allowOverlap="1" wp14:anchorId="7DA9A434" wp14:editId="700D4F95">
+          <wp:simplePos x="0" y="0"/>
+          <wp:positionH relativeFrom="page">
+            <wp:posOffset>0</wp:posOffset>
+          </wp:positionH>
+          <wp:positionV relativeFrom="page">
+            <wp:posOffset>5496</wp:posOffset>
+          </wp:positionV>
+          <wp:extent cx="7555698" cy="10679883"/>
+          <wp:effectExtent l="0" t="0" r="7620" b="7620"/>
+          <wp:wrapNone/>
+          <wp:docPr id="28" name="Picture 16"/>
+          <wp:cNvGraphicFramePr>
+            <a:graphicFrameLocks xmlns:a="http://schemas.openxmlformats.org/drawingml/2006/main" noChangeAspect="1"/>
+          </wp:cNvGraphicFramePr>
+          <a:graphic xmlns:a="http://schemas.openxmlformats.org/drawingml/2006/main">
+            <a:graphicData uri="http://schemas.openxmlformats.org/drawingml/2006/picture">
+              <pic:pic xmlns:pic="http://schemas.openxmlformats.org/drawingml/2006/picture">
+                <pic:nvPicPr>
+                  <pic:cNvPr id="1" name="ginutech-letterhead.png"/>
+                  <pic:cNvPicPr/>
+                </pic:nvPicPr>
+                <pic:blipFill>
+                  <a:blip r:embed="rId1" cstate="print">
+                    <a:extLst>
+                      <a:ext uri="{28A0092B-C50C-407E-A947-70E740481C1C}">
+                        <a14:useLocalDpi xmlns:a14="http://schemas.microsoft.com/office/drawing/2010/main" val="0"/>
+                      </a:ext>
+                    </a:extLst>
+                  </a:blip>
+                  <a:stretch>
+                    <a:fillRect/>
+                  </a:stretch>
+                </pic:blipFill>
+                <pic:spPr>
+                  <a:xfrm>
+                    <a:off x="0" y="0"/>
+                    <a:ext cx="7555698" cy="10679883"/>
+                  </a:xfrm>
+                  <a:prstGeom prst="rect">
+                    <a:avLst/>
+                  </a:prstGeom>
+                </pic:spPr>
+              </pic:pic>
+            </a:graphicData>
+          </a:graphic>
+          <wp14:sizeRelH relativeFrom="margin">
+            <wp14:pctWidth>0</wp14:pctWidth>
+          </wp14:sizeRelH>
+          <wp14:sizeRelV relativeFrom="margin">
+            <wp14:pctHeight>0</wp14:pctHeight>
+          </wp14:sizeRelV>
+        </wp:anchor>
+      </w:drawing>
+    </w:r>
+  </w:p>
+</w:hdr>
+</file>
+
+<file path=word/header23.xml><?xml version="1.0" encoding="utf-8"?>
+<w:hdr xmlns:wpc="http://schemas.microsoft.com/office/word/2010/wordprocessingCanvas" xmlns:cx="http://schemas.microsoft.com/office/drawing/2014/chartex" xmlns:cx1="http://schemas.microsoft.com/office/drawing/2015/9/8/chartex" xmlns:cx2="http://schemas.microsoft.com/office/drawing/2015/10/21/chartex" xmlns:cx3="http://schemas.microsoft.com/office/drawing/2016/5/9/chartex" xmlns:cx4="http://schemas.microsoft.com/office/drawing/2016/5/10/chartex" xmlns:cx5="http://schemas.microsoft.com/office/drawing/2016/5/11/chartex" xmlns:cx6="http://schemas.microsoft.com/office/drawing/2016/5/12/chartex" xmlns:cx7="http://schemas.microsoft.com/office/drawing/2016/5/13/chartex" xmlns:cx8="http://schemas.microsoft.com/office/drawing/2016/5/14/chartex" xmlns:mc="http://schemas.openxmlformats.org/markup-compatibility/2006" xmlns:aink="http://schemas.microsoft.com/office/drawing/2016/ink" xmlns:am3d="http://schemas.microsoft.com/office/drawing/2017/model3d" xmlns:o="urn:schemas-microsoft-com:office:office" xmlns:r="http://schemas.openxmlformats.org/officeDocument/2006/relationships" xmlns:m="http://schemas.openxmlformats.org/officeDocument/2006/math" xmlns:v="urn:schemas-microsoft-com:vml" xmlns:wp14="http://schemas.microsoft.com/office/word/2010/wordprocessingDrawing" xmlns:wp="http://schemas.openxmlformats.org/drawingml/2006/wordprocessingDrawing" xmlns:w10="urn:schemas-microsoft-com:office:word" xmlns:w="http://schemas.openxmlformats.org/wordprocessingml/2006/main" xmlns:w14="http://schemas.microsoft.com/office/word/2010/wordml" xmlns:w15="http://schemas.microsoft.com/office/word/2012/wordml" xmlns:w16cex="http://schemas.microsoft.com/office/word/2018/wordml/cex" xmlns:w16cid="http://schemas.microsoft.com/office/word/2016/wordml/cid" xmlns:w16="http://schemas.microsoft.com/office/word/2018/wordml" xmlns:w16sdtdh="http://schemas.microsoft.com/office/word/2020/wordml/sdtdatahash" xmlns:w16se="http://schemas.microsoft.com/office/word/2015/wordml/symex" xmlns:wpg="http://schemas.microsoft.com/office/word/2010/wordprocessingGroup" xmlns:wpi="http://schemas.microsoft.com/office/word/2010/wordprocessingInk" xmlns:wne="http://schemas.microsoft.com/office/word/2006/wordml" xmlns:wps="http://schemas.microsoft.com/office/word/2010/wordprocessingShape" mc:Ignorable="w14 w15 w16se w16cid w16 w16cex w16sdtdh wp14">
+  <w:p>
+    <w:r>
+      <w:rPr>
+        <w:noProof/>
+        <w:lang w:val="en-US"/>
+      </w:rPr>
+      <w:drawing>
+        <wp:anchor distT="0" distB="0" distL="114300" distR="114300" simplePos="0" relativeHeight="251668480" behindDoc="1" locked="0" layoutInCell="1" allowOverlap="1" wp14:anchorId="49B2E829" wp14:editId="6F814F6C">
+          <wp:simplePos x="0" y="0"/>
+          <wp:positionH relativeFrom="page">
+            <wp:posOffset>0</wp:posOffset>
+          </wp:positionH>
+          <wp:positionV relativeFrom="page">
+            <wp:posOffset>5496</wp:posOffset>
+          </wp:positionV>
+          <wp:extent cx="7555698" cy="10679883"/>
+          <wp:effectExtent l="0" t="0" r="7620" b="7620"/>
+          <wp:wrapNone/>
+          <wp:docPr id="26" name="Picture 16"/>
+          <wp:cNvGraphicFramePr>
+            <a:graphicFrameLocks xmlns:a="http://schemas.openxmlformats.org/drawingml/2006/main" noChangeAspect="1"/>
+          </wp:cNvGraphicFramePr>
+          <a:graphic xmlns:a="http://schemas.openxmlformats.org/drawingml/2006/main">
+            <a:graphicData uri="http://schemas.openxmlformats.org/drawingml/2006/picture">
+              <pic:pic xmlns:pic="http://schemas.openxmlformats.org/drawingml/2006/picture">
+                <pic:nvPicPr>
+                  <pic:cNvPr id="1" name="ginutech-letterhead.png"/>
+                  <pic:cNvPicPr/>
+                </pic:nvPicPr>
+                <pic:blipFill>
+                  <a:blip r:embed="rId1" cstate="print">
+                    <a:extLst>
+                      <a:ext uri="{28A0092B-C50C-407E-A947-70E740481C1C}">
+                        <a14:useLocalDpi xmlns:a14="http://schemas.microsoft.com/office/drawing/2010/main" val="0"/>
+                      </a:ext>
+                    </a:extLst>
+                  </a:blip>
+                  <a:stretch>
+                    <a:fillRect/>
+                  </a:stretch>
+                </pic:blipFill>
+                <pic:spPr>
+                  <a:xfrm>
+                    <a:off x="0" y="0"/>
+                    <a:ext cx="7555698" cy="10679883"/>
+                  </a:xfrm>
+                  <a:prstGeom prst="rect">
+                    <a:avLst/>
+                  </a:prstGeom>
+                </pic:spPr>
+              </pic:pic>
+            </a:graphicData>
+          </a:graphic>
+          <wp14:sizeRelH relativeFrom="margin">
+            <wp14:pctWidth>0</wp14:pctWidth>
+          </wp14:sizeRelH>
+          <wp14:sizeRelV relativeFrom="margin">
+            <wp14:pctHeight>0</wp14:pctHeight>
+          </wp14:sizeRelV>
+        </wp:anchor>
+      </w:drawing>
+    </w:r>
+  </w:p>
+</w:hdr>
+</file>
+
+<file path=word/header24.xml><?xml version="1.0" encoding="utf-8"?>
+<w:hdr xmlns:wpc="http://schemas.microsoft.com/office/word/2010/wordprocessingCanvas" xmlns:cx="http://schemas.microsoft.com/office/drawing/2014/chartex" xmlns:cx1="http://schemas.microsoft.com/office/drawing/2015/9/8/chartex" xmlns:cx2="http://schemas.microsoft.com/office/drawing/2015/10/21/chartex" xmlns:cx3="http://schemas.microsoft.com/office/drawing/2016/5/9/chartex" xmlns:cx4="http://schemas.microsoft.com/office/drawing/2016/5/10/chartex" xmlns:cx5="http://schemas.microsoft.com/office/drawing/2016/5/11/chartex" xmlns:cx6="http://schemas.microsoft.com/office/drawing/2016/5/12/chartex" xmlns:cx7="http://schemas.microsoft.com/office/drawing/2016/5/13/chartex" xmlns:cx8="http://schemas.microsoft.com/office/drawing/2016/5/14/chartex" xmlns:mc="http://schemas.openxmlformats.org/markup-compatibility/2006" xmlns:aink="http://schemas.microsoft.com/office/drawing/2016/ink" xmlns:am3d="http://schemas.microsoft.com/office/drawing/2017/model3d" xmlns:o="urn:schemas-microsoft-com:office:office" xmlns:r="http://schemas.openxmlformats.org/officeDocument/2006/relationships" xmlns:m="http://schemas.openxmlformats.org/officeDocument/2006/math" xmlns:v="urn:schemas-microsoft-com:vml" xmlns:wp14="http://schemas.microsoft.com/office/word/2010/wordprocessingDrawing" xmlns:wp="http://schemas.openxmlformats.org/drawingml/2006/wordprocessingDrawing" xmlns:w10="urn:schemas-microsoft-com:office:word" xmlns:w="http://schemas.openxmlformats.org/wordprocessingml/2006/main" xmlns:w14="http://schemas.microsoft.com/office/word/2010/wordml" xmlns:w15="http://schemas.microsoft.com/office/word/2012/wordml" xmlns:w16cex="http://schemas.microsoft.com/office/word/2018/wordml/cex" xmlns:w16cid="http://schemas.microsoft.com/office/word/2016/wordml/cid" xmlns:w16="http://schemas.microsoft.com/office/word/2018/wordml" xmlns:w16sdtdh="http://schemas.microsoft.com/office/word/2020/wordml/sdtdatahash" xmlns:w16se="http://schemas.microsoft.com/office/word/2015/wordml/symex" xmlns:wpg="http://schemas.microsoft.com/office/word/2010/wordprocessingGroup" xmlns:wpi="http://schemas.microsoft.com/office/word/2010/wordprocessingInk" xmlns:wne="http://schemas.microsoft.com/office/word/2006/wordml" xmlns:wps="http://schemas.microsoft.com/office/word/2010/wordprocessingShape" mc:Ignorable="w14 w15 w16se w16cid w16 w16cex w16sdtdh wp14">
+  <w:p>
+    <w:r>
+      <w:rPr>
+        <w:noProof/>
+        <w:lang w:val="en-US"/>
+      </w:rPr>
+      <w:drawing>
+        <wp:anchor distT="0" distB="0" distL="114300" distR="114300" simplePos="0" relativeHeight="251669504" behindDoc="1" locked="0" layoutInCell="1" allowOverlap="1" wp14:anchorId="4ED0DCF7" wp14:editId="3DB9DDF3">
+          <wp:simplePos x="0" y="0"/>
+          <wp:positionH relativeFrom="page">
+            <wp:posOffset>0</wp:posOffset>
+          </wp:positionH>
+          <wp:positionV relativeFrom="page">
+            <wp:posOffset>5496</wp:posOffset>
+          </wp:positionV>
+          <wp:extent cx="7555698" cy="10679883"/>
+          <wp:effectExtent l="0" t="0" r="7620" b="7620"/>
+          <wp:wrapNone/>
+          <wp:docPr id="27" name="Picture 16"/>
+          <wp:cNvGraphicFramePr>
+            <a:graphicFrameLocks xmlns:a="http://schemas.openxmlformats.org/drawingml/2006/main" noChangeAspect="1"/>
+          </wp:cNvGraphicFramePr>
+          <a:graphic xmlns:a="http://schemas.openxmlformats.org/drawingml/2006/main">
+            <a:graphicData uri="http://schemas.openxmlformats.org/drawingml/2006/picture">
+              <pic:pic xmlns:pic="http://schemas.openxmlformats.org/drawingml/2006/picture">
+                <pic:nvPicPr>
+                  <pic:cNvPr id="1" name="ginutech-letterhead.png"/>
+                  <pic:cNvPicPr/>
+                </pic:nvPicPr>
+                <pic:blipFill>
+                  <a:blip r:embed="rId1" cstate="print">
+                    <a:extLst>
+                      <a:ext uri="{28A0092B-C50C-407E-A947-70E740481C1C}">
+                        <a14:useLocalDpi xmlns:a14="http://schemas.microsoft.com/office/drawing/2010/main" val="0"/>
+                      </a:ext>
+                    </a:extLst>
+                  </a:blip>
+                  <a:stretch>
+                    <a:fillRect/>
+                  </a:stretch>
+                </pic:blipFill>
+                <pic:spPr>
+                  <a:xfrm>
+                    <a:off x="0" y="0"/>
+                    <a:ext cx="7555698" cy="10679883"/>
+                  </a:xfrm>
+                  <a:prstGeom prst="rect">
+                    <a:avLst/>
+                  </a:prstGeom>
+                </pic:spPr>
+              </pic:pic>
+            </a:graphicData>
+          </a:graphic>
+          <wp14:sizeRelH relativeFrom="margin">
+            <wp14:pctWidth>0</wp14:pctWidth>
+          </wp14:sizeRelH>
+          <wp14:sizeRelV relativeFrom="margin">
+            <wp14:pctHeight>0</wp14:pctHeight>
+          </wp14:sizeRelV>
+        </wp:anchor>
+      </w:drawing>
+    </w:r>
+  </w:p>
+</w:hdr>
+</file>
+
+<file path=word/header25.xml><?xml version="1.0" encoding="utf-8"?>
+<w:hdr xmlns:wpc="http://schemas.microsoft.com/office/word/2010/wordprocessingCanvas" xmlns:cx="http://schemas.microsoft.com/office/drawing/2014/chartex" xmlns:cx1="http://schemas.microsoft.com/office/drawing/2015/9/8/chartex" xmlns:cx2="http://schemas.microsoft.com/office/drawing/2015/10/21/chartex" xmlns:cx3="http://schemas.microsoft.com/office/drawing/2016/5/9/chartex" xmlns:cx4="http://schemas.microsoft.com/office/drawing/2016/5/10/chartex" xmlns:cx5="http://schemas.microsoft.com/office/drawing/2016/5/11/chartex" xmlns:cx6="http://schemas.microsoft.com/office/drawing/2016/5/12/chartex" xmlns:cx7="http://schemas.microsoft.com/office/drawing/2016/5/13/chartex" xmlns:cx8="http://schemas.microsoft.com/office/drawing/2016/5/14/chartex" xmlns:mc="http://schemas.openxmlformats.org/markup-compatibility/2006" xmlns:aink="http://schemas.microsoft.com/office/drawing/2016/ink" xmlns:am3d="http://schemas.microsoft.com/office/drawing/2017/model3d" xmlns:o="urn:schemas-microsoft-com:office:office" xmlns:r="http://schemas.openxmlformats.org/officeDocument/2006/relationships" xmlns:m="http://schemas.openxmlformats.org/officeDocument/2006/math" xmlns:v="urn:schemas-microsoft-com:vml" xmlns:wp14="http://schemas.microsoft.com/office/word/2010/wordprocessingDrawing" xmlns:wp="http://schemas.openxmlformats.org/drawingml/2006/wordprocessingDrawing" xmlns:w10="urn:schemas-microsoft-com:office:word" xmlns:w="http://schemas.openxmlformats.org/wordprocessingml/2006/main" xmlns:w14="http://schemas.microsoft.com/office/word/2010/wordml" xmlns:w15="http://schemas.microsoft.com/office/word/2012/wordml" xmlns:w16cex="http://schemas.microsoft.com/office/word/2018/wordml/cex" xmlns:w16cid="http://schemas.microsoft.com/office/word/2016/wordml/cid" xmlns:w16="http://schemas.microsoft.com/office/word/2018/wordml" xmlns:w16sdtdh="http://schemas.microsoft.com/office/word/2020/wordml/sdtdatahash" xmlns:w16se="http://schemas.microsoft.com/office/word/2015/wordml/symex" xmlns:wpg="http://schemas.microsoft.com/office/word/2010/wordprocessingGroup" xmlns:wpi="http://schemas.microsoft.com/office/word/2010/wordprocessingInk" xmlns:wne="http://schemas.microsoft.com/office/word/2006/wordml" xmlns:wps="http://schemas.microsoft.com/office/word/2010/wordprocessingShape" mc:Ignorable="w14 w15 w16se w16cid w16 w16cex w16sdtdh wp14">
+  <w:p>
+    <w:r>
+      <w:rPr>
+        <w:noProof/>
+        <w:lang w:val="en-US"/>
+      </w:rPr>
+      <w:drawing>
+        <wp:anchor distT="0" distB="0" distL="114300" distR="114300" simplePos="0" relativeHeight="251670528" behindDoc="1" locked="0" layoutInCell="1" allowOverlap="1" wp14:anchorId="1E849489" wp14:editId="5F431CC4">
+          <wp:simplePos x="0" y="0"/>
+          <wp:positionH relativeFrom="page">
+            <wp:posOffset>0</wp:posOffset>
+          </wp:positionH>
+          <wp:positionV relativeFrom="page">
+            <wp:posOffset>5496</wp:posOffset>
+          </wp:positionV>
+          <wp:extent cx="7555698" cy="10679883"/>
+          <wp:effectExtent l="0" t="0" r="7620" b="7620"/>
+          <wp:wrapNone/>
+          <wp:docPr id="31" name="Picture 16"/>
+          <wp:cNvGraphicFramePr>
+            <a:graphicFrameLocks xmlns:a="http://schemas.openxmlformats.org/drawingml/2006/main" noChangeAspect="1"/>
+          </wp:cNvGraphicFramePr>
+          <a:graphic xmlns:a="http://schemas.openxmlformats.org/drawingml/2006/main">
+            <a:graphicData uri="http://schemas.openxmlformats.org/drawingml/2006/picture">
+              <pic:pic xmlns:pic="http://schemas.openxmlformats.org/drawingml/2006/picture">
+                <pic:nvPicPr>
+                  <pic:cNvPr id="1" name="ginutech-letterhead.png"/>
+                  <pic:cNvPicPr/>
+                </pic:nvPicPr>
+                <pic:blipFill>
+                  <a:blip r:embed="rId1" cstate="print">
+                    <a:extLst>
+                      <a:ext uri="{28A0092B-C50C-407E-A947-70E740481C1C}">
+                        <a14:useLocalDpi xmlns:a14="http://schemas.microsoft.com/office/drawing/2010/main" val="0"/>
+                      </a:ext>
+                    </a:extLst>
+                  </a:blip>
+                  <a:stretch>
+                    <a:fillRect/>
+                  </a:stretch>
+                </pic:blipFill>
+                <pic:spPr>
+                  <a:xfrm>
+                    <a:off x="0" y="0"/>
+                    <a:ext cx="7555698" cy="10679883"/>
+                  </a:xfrm>
+                  <a:prstGeom prst="rect">
+                    <a:avLst/>
+                  </a:prstGeom>
+                </pic:spPr>
+              </pic:pic>
+            </a:graphicData>
+          </a:graphic>
+          <wp14:sizeRelH relativeFrom="margin">
+            <wp14:pctWidth>0</wp14:pctWidth>
+          </wp14:sizeRelH>
+          <wp14:sizeRelV relativeFrom="margin">
+            <wp14:pctHeight>0</wp14:pctHeight>
+          </wp14:sizeRelV>
+        </wp:anchor>
+      </w:drawing>
+    </w:r>
+  </w:p>
+</w:hdr>
+</file>
+
+<file path=word/header26.xml><?xml version="1.0" encoding="utf-8"?>
+<w:hdr xmlns:wpc="http://schemas.microsoft.com/office/word/2010/wordprocessingCanvas" xmlns:cx="http://schemas.microsoft.com/office/drawing/2014/chartex" xmlns:cx1="http://schemas.microsoft.com/office/drawing/2015/9/8/chartex" xmlns:cx2="http://schemas.microsoft.com/office/drawing/2015/10/21/chartex" xmlns:cx3="http://schemas.microsoft.com/office/drawing/2016/5/9/chartex" xmlns:cx4="http://schemas.microsoft.com/office/drawing/2016/5/10/chartex" xmlns:cx5="http://schemas.microsoft.com/office/drawing/2016/5/11/chartex" xmlns:cx6="http://schemas.microsoft.com/office/drawing/2016/5/12/chartex" xmlns:cx7="http://schemas.microsoft.com/office/drawing/2016/5/13/chartex" xmlns:cx8="http://schemas.microsoft.com/office/drawing/2016/5/14/chartex" xmlns:mc="http://schemas.openxmlformats.org/markup-compatibility/2006" xmlns:aink="http://schemas.microsoft.com/office/drawing/2016/ink" xmlns:am3d="http://schemas.microsoft.com/office/drawing/2017/model3d" xmlns:o="urn:schemas-microsoft-com:office:office" xmlns:r="http://schemas.openxmlformats.org/officeDocument/2006/relationships" xmlns:m="http://schemas.openxmlformats.org/officeDocument/2006/math" xmlns:v="urn:schemas-microsoft-com:vml" xmlns:wp14="http://schemas.microsoft.com/office/word/2010/wordprocessingDrawing" xmlns:wp="http://schemas.openxmlformats.org/drawingml/2006/wordprocessingDrawing" xmlns:w10="urn:schemas-microsoft-com:office:word" xmlns:w="http://schemas.openxmlformats.org/wordprocessingml/2006/main" xmlns:w14="http://schemas.microsoft.com/office/word/2010/wordml" xmlns:w15="http://schemas.microsoft.com/office/word/2012/wordml" xmlns:w16cex="http://schemas.microsoft.com/office/word/2018/wordml/cex" xmlns:w16cid="http://schemas.microsoft.com/office/word/2016/wordml/cid" xmlns:w16="http://schemas.microsoft.com/office/word/2018/wordml" xmlns:w16sdtdh="http://schemas.microsoft.com/office/word/2020/wordml/sdtdatahash" xmlns:w16se="http://schemas.microsoft.com/office/word/2015/wordml/symex" xmlns:wpg="http://schemas.microsoft.com/office/word/2010/wordprocessingGroup" xmlns:wpi="http://schemas.microsoft.com/office/word/2010/wordprocessingInk" xmlns:wne="http://schemas.microsoft.com/office/word/2006/wordml" xmlns:wps="http://schemas.microsoft.com/office/word/2010/wordprocessingShape" mc:Ignorable="w14 w15 w16se w16cid w16 w16cex w16sdtdh wp14">
+  <w:p>
+    <w:r>
+      <w:rPr>
+        <w:noProof/>
+        <w:lang w:val="en-US"/>
+      </w:rPr>
+      <w:drawing>
+        <wp:anchor distT="0" distB="0" distL="114300" distR="114300" simplePos="0" relativeHeight="251671552" behindDoc="1" locked="0" layoutInCell="1" allowOverlap="1" wp14:anchorId="2CB3729B" wp14:editId="7B407142">
+          <wp:simplePos x="0" y="0"/>
+          <wp:positionH relativeFrom="page">
+            <wp:posOffset>0</wp:posOffset>
+          </wp:positionH>
+          <wp:positionV relativeFrom="page">
+            <wp:posOffset>5496</wp:posOffset>
+          </wp:positionV>
+          <wp:extent cx="7555698" cy="10679883"/>
+          <wp:effectExtent l="0" t="0" r="7620" b="7620"/>
+          <wp:wrapNone/>
+          <wp:docPr id="29" name="Picture 16"/>
+          <wp:cNvGraphicFramePr>
+            <a:graphicFrameLocks xmlns:a="http://schemas.openxmlformats.org/drawingml/2006/main" noChangeAspect="1"/>
+          </wp:cNvGraphicFramePr>
+          <a:graphic xmlns:a="http://schemas.openxmlformats.org/drawingml/2006/main">
+            <a:graphicData uri="http://schemas.openxmlformats.org/drawingml/2006/picture">
+              <pic:pic xmlns:pic="http://schemas.openxmlformats.org/drawingml/2006/picture">
+                <pic:nvPicPr>
+                  <pic:cNvPr id="1" name="ginutech-letterhead.png"/>
+                  <pic:cNvPicPr/>
+                </pic:nvPicPr>
+                <pic:blipFill>
+                  <a:blip r:embed="rId1" cstate="print">
+                    <a:extLst>
+                      <a:ext uri="{28A0092B-C50C-407E-A947-70E740481C1C}">
+                        <a14:useLocalDpi xmlns:a14="http://schemas.microsoft.com/office/drawing/2010/main" val="0"/>
+                      </a:ext>
+                    </a:extLst>
+                  </a:blip>
+                  <a:stretch>
+                    <a:fillRect/>
+                  </a:stretch>
+                </pic:blipFill>
+                <pic:spPr>
+                  <a:xfrm>
+                    <a:off x="0" y="0"/>
+                    <a:ext cx="7555698" cy="10679883"/>
+                  </a:xfrm>
+                  <a:prstGeom prst="rect">
+                    <a:avLst/>
+                  </a:prstGeom>
+                </pic:spPr>
+              </pic:pic>
+            </a:graphicData>
+          </a:graphic>
+          <wp14:sizeRelH relativeFrom="margin">
+            <wp14:pctWidth>0</wp14:pctWidth>
+          </wp14:sizeRelH>
+          <wp14:sizeRelV relativeFrom="margin">
+            <wp14:pctHeight>0</wp14:pctHeight>
+          </wp14:sizeRelV>
+        </wp:anchor>
+      </w:drawing>
+    </w:r>
+  </w:p>
+</w:hdr>
+</file>
+
+<file path=word/header27.xml><?xml version="1.0" encoding="utf-8"?>
+<w:hdr xmlns:wpc="http://schemas.microsoft.com/office/word/2010/wordprocessingCanvas" xmlns:cx="http://schemas.microsoft.com/office/drawing/2014/chartex" xmlns:cx1="http://schemas.microsoft.com/office/drawing/2015/9/8/chartex" xmlns:cx2="http://schemas.microsoft.com/office/drawing/2015/10/21/chartex" xmlns:cx3="http://schemas.microsoft.com/office/drawing/2016/5/9/chartex" xmlns:cx4="http://schemas.microsoft.com/office/drawing/2016/5/10/chartex" xmlns:cx5="http://schemas.microsoft.com/office/drawing/2016/5/11/chartex" xmlns:cx6="http://schemas.microsoft.com/office/drawing/2016/5/12/chartex" xmlns:cx7="http://schemas.microsoft.com/office/drawing/2016/5/13/chartex" xmlns:cx8="http://schemas.microsoft.com/office/drawing/2016/5/14/chartex" xmlns:mc="http://schemas.openxmlformats.org/markup-compatibility/2006" xmlns:aink="http://schemas.microsoft.com/office/drawing/2016/ink" xmlns:am3d="http://schemas.microsoft.com/office/drawing/2017/model3d" xmlns:o="urn:schemas-microsoft-com:office:office" xmlns:r="http://schemas.openxmlformats.org/officeDocument/2006/relationships" xmlns:m="http://schemas.openxmlformats.org/officeDocument/2006/math" xmlns:v="urn:schemas-microsoft-com:vml" xmlns:wp14="http://schemas.microsoft.com/office/word/2010/wordprocessingDrawing" xmlns:wp="http://schemas.openxmlformats.org/drawingml/2006/wordprocessingDrawing" xmlns:w10="urn:schemas-microsoft-com:office:word" xmlns:w="http://schemas.openxmlformats.org/wordprocessingml/2006/main" xmlns:w14="http://schemas.microsoft.com/office/word/2010/wordml" xmlns:w15="http://schemas.microsoft.com/office/word/2012/wordml" xmlns:w16cex="http://schemas.microsoft.com/office/word/2018/wordml/cex" xmlns:w16cid="http://schemas.microsoft.com/office/word/2016/wordml/cid" xmlns:w16="http://schemas.microsoft.com/office/word/2018/wordml" xmlns:w16sdtdh="http://schemas.microsoft.com/office/word/2020/wordml/sdtdatahash" xmlns:w16se="http://schemas.microsoft.com/office/word/2015/wordml/symex" xmlns:wpg="http://schemas.microsoft.com/office/word/2010/wordprocessingGroup" xmlns:wpi="http://schemas.microsoft.com/office/word/2010/wordprocessingInk" xmlns:wne="http://schemas.microsoft.com/office/word/2006/wordml" xmlns:wps="http://schemas.microsoft.com/office/word/2010/wordprocessingShape" mc:Ignorable="w14 w15 w16se w16cid w16 w16cex w16sdtdh wp14">
+  <w:p>
+    <w:r>
+      <w:rPr>
+        <w:noProof/>
+        <w:lang w:val="en-US"/>
+      </w:rPr>
+      <w:drawing>
+        <wp:anchor distT="0" distB="0" distL="114300" distR="114300" simplePos="0" relativeHeight="251672576" behindDoc="1" locked="0" layoutInCell="1" allowOverlap="1" wp14:anchorId="7245DFB8" wp14:editId="7DA481AA">
+          <wp:simplePos x="0" y="0"/>
+          <wp:positionH relativeFrom="page">
+            <wp:posOffset>0</wp:posOffset>
+          </wp:positionH>
+          <wp:positionV relativeFrom="page">
+            <wp:posOffset>5496</wp:posOffset>
+          </wp:positionV>
+          <wp:extent cx="7555698" cy="10679883"/>
+          <wp:effectExtent l="0" t="0" r="7620" b="7620"/>
+          <wp:wrapNone/>
+          <wp:docPr id="30" name="Picture 16"/>
+          <wp:cNvGraphicFramePr>
+            <a:graphicFrameLocks xmlns:a="http://schemas.openxmlformats.org/drawingml/2006/main" noChangeAspect="1"/>
+          </wp:cNvGraphicFramePr>
+          <a:graphic xmlns:a="http://schemas.openxmlformats.org/drawingml/2006/main">
+            <a:graphicData uri="http://schemas.openxmlformats.org/drawingml/2006/picture">
+              <pic:pic xmlns:pic="http://schemas.openxmlformats.org/drawingml/2006/picture">
+                <pic:nvPicPr>
+                  <pic:cNvPr id="1" name="ginutech-letterhead.png"/>
+                  <pic:cNvPicPr/>
+                </pic:nvPicPr>
+                <pic:blipFill>
+                  <a:blip r:embed="rId1" cstate="print">
+                    <a:extLst>
+                      <a:ext uri="{28A0092B-C50C-407E-A947-70E740481C1C}">
+                        <a14:useLocalDpi xmlns:a14="http://schemas.microsoft.com/office/drawing/2010/main" val="0"/>
+                      </a:ext>
+                    </a:extLst>
+                  </a:blip>
+                  <a:stretch>
+                    <a:fillRect/>
+                  </a:stretch>
+                </pic:blipFill>
+                <pic:spPr>
+                  <a:xfrm>
+                    <a:off x="0" y="0"/>
+                    <a:ext cx="7555698" cy="10679883"/>
+                  </a:xfrm>
+                  <a:prstGeom prst="rect">
+                    <a:avLst/>
+                  </a:prstGeom>
+                </pic:spPr>
+              </pic:pic>
+            </a:graphicData>
+          </a:graphic>
+          <wp14:sizeRelH relativeFrom="margin">
+            <wp14:pctWidth>0</wp14:pctWidth>
+          </wp14:sizeRelH>
+          <wp14:sizeRelV relativeFrom="margin">
+            <wp14:pctHeight>0</wp14:pctHeight>
+          </wp14:sizeRelV>
         </wp:anchor>
       </w:drawing>
     </w:r>
@@ -12344,42 +11142,44 @@
 <w:hdr xmlns:wpc="http://schemas.microsoft.com/office/word/2010/wordprocessingCanvas" xmlns:cx="http://schemas.microsoft.com/office/drawing/2014/chartex" xmlns:cx1="http://schemas.microsoft.com/office/drawing/2015/9/8/chartex" xmlns:cx2="http://schemas.microsoft.com/office/drawing/2015/10/21/chartex" xmlns:cx3="http://schemas.microsoft.com/office/drawing/2016/5/9/chartex" xmlns:cx4="http://schemas.microsoft.com/office/drawing/2016/5/10/chartex" xmlns:cx5="http://schemas.microsoft.com/office/drawing/2016/5/11/chartex" xmlns:cx6="http://schemas.microsoft.com/office/drawing/2016/5/12/chartex" xmlns:cx7="http://schemas.microsoft.com/office/drawing/2016/5/13/chartex" xmlns:cx8="http://schemas.microsoft.com/office/drawing/2016/5/14/chartex" xmlns:mc="http://schemas.openxmlformats.org/markup-compatibility/2006" xmlns:aink="http://schemas.microsoft.com/office/drawing/2016/ink" xmlns:am3d="http://schemas.microsoft.com/office/drawing/2017/model3d" xmlns:o="urn:schemas-microsoft-com:office:office" xmlns:r="http://schemas.openxmlformats.org/officeDocument/2006/relationships" xmlns:m="http://schemas.openxmlformats.org/officeDocument/2006/math" xmlns:v="urn:schemas-microsoft-com:vml" xmlns:wp14="http://schemas.microsoft.com/office/word/2010/wordprocessingDrawing" xmlns:wp="http://schemas.openxmlformats.org/drawingml/2006/wordprocessingDrawing" xmlns:w10="urn:schemas-microsoft-com:office:word" xmlns:w="http://schemas.openxmlformats.org/wordprocessingml/2006/main" xmlns:w14="http://schemas.microsoft.com/office/word/2010/wordml" xmlns:w15="http://schemas.microsoft.com/office/word/2012/wordml" xmlns:w16cex="http://schemas.microsoft.com/office/word/2018/wordml/cex" xmlns:w16cid="http://schemas.microsoft.com/office/word/2016/wordml/cid" xmlns:w16="http://schemas.microsoft.com/office/word/2018/wordml" xmlns:w16sdtdh="http://schemas.microsoft.com/office/word/2020/wordml/sdtdatahash" xmlns:w16se="http://schemas.microsoft.com/office/word/2015/wordml/symex" xmlns:wpg="http://schemas.microsoft.com/office/word/2010/wordprocessingGroup" xmlns:wpi="http://schemas.microsoft.com/office/word/2010/wordprocessingInk" xmlns:wne="http://schemas.microsoft.com/office/word/2006/wordml" xmlns:wps="http://schemas.microsoft.com/office/word/2010/wordprocessingShape" mc:Ignorable="w14 w15 w16se w16cid w16 w16cex w16sdtdh wp14">
   <w:p>
     <w:pPr>
-      <w:pStyle w:val="Corpsdetexte"/>
-      <w:spacing w:line="14" w:lineRule="auto"/>
-      <w:rPr>
-        <w:sz w:val="20"/>
-      </w:rPr>
+      <w:pStyle w:val="En-tte"/>
     </w:pPr>
     <w:r>
       <w:rPr>
         <w:noProof/>
-        <w:sz w:val="20"/>
+        <w:lang w:val="en-US"/>
       </w:rPr>
       <w:drawing>
-        <wp:anchor distT="0" distB="0" distL="0" distR="0" simplePos="0" relativeHeight="487144960" behindDoc="1" locked="0" layoutInCell="1" allowOverlap="1" wp14:anchorId="0787074A" wp14:editId="622F47CB">
+        <wp:anchor distT="0" distB="0" distL="114300" distR="114300" simplePos="0" relativeHeight="251674624" behindDoc="1" locked="0" layoutInCell="1" allowOverlap="1" wp14:anchorId="1335632D" wp14:editId="67A27B58">
           <wp:simplePos x="0" y="0"/>
           <wp:positionH relativeFrom="page">
-            <wp:posOffset>5631815</wp:posOffset>
+            <wp:posOffset>0</wp:posOffset>
           </wp:positionH>
           <wp:positionV relativeFrom="page">
-            <wp:posOffset>76836</wp:posOffset>
+            <wp:posOffset>-9525</wp:posOffset>
           </wp:positionV>
-          <wp:extent cx="1028700" cy="716278"/>
-          <wp:effectExtent l="0" t="0" r="0" b="0"/>
+          <wp:extent cx="7555698" cy="10679883"/>
+          <wp:effectExtent l="0" t="0" r="7620" b="7620"/>
           <wp:wrapNone/>
-          <wp:docPr id="17" name="Image 17"/>
+          <wp:docPr id="32" name="Picture 16"/>
           <wp:cNvGraphicFramePr>
-            <a:graphicFrameLocks xmlns:a="http://schemas.openxmlformats.org/drawingml/2006/main"/>
+            <a:graphicFrameLocks xmlns:a="http://schemas.openxmlformats.org/drawingml/2006/main" noChangeAspect="1"/>
           </wp:cNvGraphicFramePr>
           <a:graphic xmlns:a="http://schemas.openxmlformats.org/drawingml/2006/main">
             <a:graphicData uri="http://schemas.openxmlformats.org/drawingml/2006/picture">
               <pic:pic xmlns:pic="http://schemas.openxmlformats.org/drawingml/2006/picture">
                 <pic:nvPicPr>
-                  <pic:cNvPr id="17" name="Image 17"/>
+                  <pic:cNvPr id="1" name="ginutech-letterhead.png"/>
                   <pic:cNvPicPr/>
                 </pic:nvPicPr>
                 <pic:blipFill>
-                  <a:blip r:embed="rId1" cstate="print"/>
+                  <a:blip r:embed="rId1" cstate="print">
+                    <a:extLst>
+                      <a:ext uri="{28A0092B-C50C-407E-A947-70E740481C1C}">
+                        <a14:useLocalDpi xmlns:a14="http://schemas.microsoft.com/office/drawing/2010/main" val="0"/>
+                      </a:ext>
+                    </a:extLst>
+                  </a:blip>
                   <a:stretch>
                     <a:fillRect/>
                   </a:stretch>
@@ -12387,7 +11187,7 @@
                 <pic:spPr>
                   <a:xfrm>
                     <a:off x="0" y="0"/>
-                    <a:ext cx="1028700" cy="716278"/>
+                    <a:ext cx="7555698" cy="10679883"/>
                   </a:xfrm>
                   <a:prstGeom prst="rect">
                     <a:avLst/>
@@ -12396,39 +11196,58 @@
               </pic:pic>
             </a:graphicData>
           </a:graphic>
+          <wp14:sizeRelH relativeFrom="margin">
+            <wp14:pctWidth>0</wp14:pctWidth>
+          </wp14:sizeRelH>
+          <wp14:sizeRelV relativeFrom="margin">
+            <wp14:pctHeight>0</wp14:pctHeight>
+          </wp14:sizeRelV>
         </wp:anchor>
       </w:drawing>
     </w:r>
+  </w:p>
+</w:hdr>
+</file>
+
+<file path=word/header4.xml><?xml version="1.0" encoding="utf-8"?>
+<w:hdr xmlns:wpc="http://schemas.microsoft.com/office/word/2010/wordprocessingCanvas" xmlns:cx="http://schemas.microsoft.com/office/drawing/2014/chartex" xmlns:cx1="http://schemas.microsoft.com/office/drawing/2015/9/8/chartex" xmlns:cx2="http://schemas.microsoft.com/office/drawing/2015/10/21/chartex" xmlns:cx3="http://schemas.microsoft.com/office/drawing/2016/5/9/chartex" xmlns:cx4="http://schemas.microsoft.com/office/drawing/2016/5/10/chartex" xmlns:cx5="http://schemas.microsoft.com/office/drawing/2016/5/11/chartex" xmlns:cx6="http://schemas.microsoft.com/office/drawing/2016/5/12/chartex" xmlns:cx7="http://schemas.microsoft.com/office/drawing/2016/5/13/chartex" xmlns:cx8="http://schemas.microsoft.com/office/drawing/2016/5/14/chartex" xmlns:mc="http://schemas.openxmlformats.org/markup-compatibility/2006" xmlns:aink="http://schemas.microsoft.com/office/drawing/2016/ink" xmlns:am3d="http://schemas.microsoft.com/office/drawing/2017/model3d" xmlns:o="urn:schemas-microsoft-com:office:office" xmlns:r="http://schemas.openxmlformats.org/officeDocument/2006/relationships" xmlns:m="http://schemas.openxmlformats.org/officeDocument/2006/math" xmlns:v="urn:schemas-microsoft-com:vml" xmlns:wp14="http://schemas.microsoft.com/office/word/2010/wordprocessingDrawing" xmlns:wp="http://schemas.openxmlformats.org/drawingml/2006/wordprocessingDrawing" xmlns:w10="urn:schemas-microsoft-com:office:word" xmlns:w="http://schemas.openxmlformats.org/wordprocessingml/2006/main" xmlns:w14="http://schemas.microsoft.com/office/word/2010/wordml" xmlns:w15="http://schemas.microsoft.com/office/word/2012/wordml" xmlns:w16cex="http://schemas.microsoft.com/office/word/2018/wordml/cex" xmlns:w16cid="http://schemas.microsoft.com/office/word/2016/wordml/cid" xmlns:w16="http://schemas.microsoft.com/office/word/2018/wordml" xmlns:w16sdtdh="http://schemas.microsoft.com/office/word/2020/wordml/sdtdatahash" xmlns:w16se="http://schemas.microsoft.com/office/word/2015/wordml/symex" xmlns:wpg="http://schemas.microsoft.com/office/word/2010/wordprocessingGroup" xmlns:wpi="http://schemas.microsoft.com/office/word/2010/wordprocessingInk" xmlns:wne="http://schemas.microsoft.com/office/word/2006/wordml" xmlns:wps="http://schemas.microsoft.com/office/word/2010/wordprocessingShape" mc:Ignorable="w14 w15 w16se w16cid w16 w16cex w16sdtdh wp14">
+  <w:p>
     <w:r>
       <w:rPr>
         <w:noProof/>
-        <w:sz w:val="20"/>
+        <w:lang w:val="en-US"/>
       </w:rPr>
       <w:drawing>
-        <wp:anchor distT="0" distB="0" distL="0" distR="0" simplePos="0" relativeHeight="487145472" behindDoc="1" locked="0" layoutInCell="1" allowOverlap="1" wp14:anchorId="4AE23380" wp14:editId="62DE9FE5">
+        <wp:anchor distT="0" distB="0" distL="114300" distR="114300" simplePos="0" relativeHeight="251645952" behindDoc="1" locked="0" layoutInCell="1" allowOverlap="1" wp14:anchorId="401B86EA" wp14:editId="7B13880F">
           <wp:simplePos x="0" y="0"/>
           <wp:positionH relativeFrom="page">
-            <wp:posOffset>1183564</wp:posOffset>
+            <wp:posOffset>0</wp:posOffset>
           </wp:positionH>
           <wp:positionV relativeFrom="page">
-            <wp:posOffset>130237</wp:posOffset>
+            <wp:posOffset>5496</wp:posOffset>
           </wp:positionV>
-          <wp:extent cx="713886" cy="609175"/>
-          <wp:effectExtent l="0" t="0" r="0" b="0"/>
+          <wp:extent cx="7555698" cy="10679883"/>
+          <wp:effectExtent l="0" t="0" r="7620" b="7620"/>
           <wp:wrapNone/>
-          <wp:docPr id="18" name="Image 18"/>
+          <wp:docPr id="5" name="Picture 16"/>
           <wp:cNvGraphicFramePr>
-            <a:graphicFrameLocks xmlns:a="http://schemas.openxmlformats.org/drawingml/2006/main"/>
+            <a:graphicFrameLocks xmlns:a="http://schemas.openxmlformats.org/drawingml/2006/main" noChangeAspect="1"/>
           </wp:cNvGraphicFramePr>
           <a:graphic xmlns:a="http://schemas.openxmlformats.org/drawingml/2006/main">
             <a:graphicData uri="http://schemas.openxmlformats.org/drawingml/2006/picture">
               <pic:pic xmlns:pic="http://schemas.openxmlformats.org/drawingml/2006/picture">
                 <pic:nvPicPr>
-                  <pic:cNvPr id="18" name="Image 18"/>
+                  <pic:cNvPr id="1" name="ginutech-letterhead.png"/>
                   <pic:cNvPicPr/>
                 </pic:nvPicPr>
                 <pic:blipFill>
-                  <a:blip r:embed="rId2" cstate="print"/>
+                  <a:blip r:embed="rId1" cstate="print">
+                    <a:extLst>
+                      <a:ext uri="{28A0092B-C50C-407E-A947-70E740481C1C}">
+                        <a14:useLocalDpi xmlns:a14="http://schemas.microsoft.com/office/drawing/2010/main" val="0"/>
+                      </a:ext>
+                    </a:extLst>
+                  </a:blip>
                   <a:stretch>
                     <a:fillRect/>
                   </a:stretch>
@@ -12436,7 +11255,7 @@
                 <pic:spPr>
                   <a:xfrm>
                     <a:off x="0" y="0"/>
-                    <a:ext cx="713886" cy="609175"/>
+                    <a:ext cx="7555698" cy="10679883"/>
                   </a:xfrm>
                   <a:prstGeom prst="rect">
                     <a:avLst/>
@@ -12445,6 +11264,352 @@
               </pic:pic>
             </a:graphicData>
           </a:graphic>
+          <wp14:sizeRelH relativeFrom="margin">
+            <wp14:pctWidth>0</wp14:pctWidth>
+          </wp14:sizeRelH>
+          <wp14:sizeRelV relativeFrom="margin">
+            <wp14:pctHeight>0</wp14:pctHeight>
+          </wp14:sizeRelV>
+        </wp:anchor>
+      </w:drawing>
+    </w:r>
+  </w:p>
+</w:hdr>
+</file>
+
+<file path=word/header5.xml><?xml version="1.0" encoding="utf-8"?>
+<w:hdr xmlns:wpc="http://schemas.microsoft.com/office/word/2010/wordprocessingCanvas" xmlns:cx="http://schemas.microsoft.com/office/drawing/2014/chartex" xmlns:cx1="http://schemas.microsoft.com/office/drawing/2015/9/8/chartex" xmlns:cx2="http://schemas.microsoft.com/office/drawing/2015/10/21/chartex" xmlns:cx3="http://schemas.microsoft.com/office/drawing/2016/5/9/chartex" xmlns:cx4="http://schemas.microsoft.com/office/drawing/2016/5/10/chartex" xmlns:cx5="http://schemas.microsoft.com/office/drawing/2016/5/11/chartex" xmlns:cx6="http://schemas.microsoft.com/office/drawing/2016/5/12/chartex" xmlns:cx7="http://schemas.microsoft.com/office/drawing/2016/5/13/chartex" xmlns:cx8="http://schemas.microsoft.com/office/drawing/2016/5/14/chartex" xmlns:mc="http://schemas.openxmlformats.org/markup-compatibility/2006" xmlns:aink="http://schemas.microsoft.com/office/drawing/2016/ink" xmlns:am3d="http://schemas.microsoft.com/office/drawing/2017/model3d" xmlns:o="urn:schemas-microsoft-com:office:office" xmlns:r="http://schemas.openxmlformats.org/officeDocument/2006/relationships" xmlns:m="http://schemas.openxmlformats.org/officeDocument/2006/math" xmlns:v="urn:schemas-microsoft-com:vml" xmlns:wp14="http://schemas.microsoft.com/office/word/2010/wordprocessingDrawing" xmlns:wp="http://schemas.openxmlformats.org/drawingml/2006/wordprocessingDrawing" xmlns:w10="urn:schemas-microsoft-com:office:word" xmlns:w="http://schemas.openxmlformats.org/wordprocessingml/2006/main" xmlns:w14="http://schemas.microsoft.com/office/word/2010/wordml" xmlns:w15="http://schemas.microsoft.com/office/word/2012/wordml" xmlns:w16cex="http://schemas.microsoft.com/office/word/2018/wordml/cex" xmlns:w16cid="http://schemas.microsoft.com/office/word/2016/wordml/cid" xmlns:w16="http://schemas.microsoft.com/office/word/2018/wordml" xmlns:w16sdtdh="http://schemas.microsoft.com/office/word/2020/wordml/sdtdatahash" xmlns:w16se="http://schemas.microsoft.com/office/word/2015/wordml/symex" xmlns:wpg="http://schemas.microsoft.com/office/word/2010/wordprocessingGroup" xmlns:wpi="http://schemas.microsoft.com/office/word/2010/wordprocessingInk" xmlns:wne="http://schemas.microsoft.com/office/word/2006/wordml" xmlns:wps="http://schemas.microsoft.com/office/word/2010/wordprocessingShape" mc:Ignorable="w14 w15 w16se w16cid w16 w16cex w16sdtdh wp14">
+  <w:p>
+    <w:r>
+      <w:rPr>
+        <w:noProof/>
+        <w:lang w:val="en-US"/>
+      </w:rPr>
+      <w:drawing>
+        <wp:anchor distT="0" distB="0" distL="114300" distR="114300" simplePos="0" relativeHeight="251646976" behindDoc="1" locked="0" layoutInCell="1" allowOverlap="1" wp14:anchorId="3757AB79" wp14:editId="395A1CE5">
+          <wp:simplePos x="0" y="0"/>
+          <wp:positionH relativeFrom="page">
+            <wp:posOffset>0</wp:posOffset>
+          </wp:positionH>
+          <wp:positionV relativeFrom="page">
+            <wp:posOffset>5496</wp:posOffset>
+          </wp:positionV>
+          <wp:extent cx="7555698" cy="10679883"/>
+          <wp:effectExtent l="0" t="0" r="7620" b="7620"/>
+          <wp:wrapNone/>
+          <wp:docPr id="3" name="Picture 16"/>
+          <wp:cNvGraphicFramePr>
+            <a:graphicFrameLocks xmlns:a="http://schemas.openxmlformats.org/drawingml/2006/main" noChangeAspect="1"/>
+          </wp:cNvGraphicFramePr>
+          <a:graphic xmlns:a="http://schemas.openxmlformats.org/drawingml/2006/main">
+            <a:graphicData uri="http://schemas.openxmlformats.org/drawingml/2006/picture">
+              <pic:pic xmlns:pic="http://schemas.openxmlformats.org/drawingml/2006/picture">
+                <pic:nvPicPr>
+                  <pic:cNvPr id="1" name="ginutech-letterhead.png"/>
+                  <pic:cNvPicPr/>
+                </pic:nvPicPr>
+                <pic:blipFill>
+                  <a:blip r:embed="rId1" cstate="print">
+                    <a:extLst>
+                      <a:ext uri="{28A0092B-C50C-407E-A947-70E740481C1C}">
+                        <a14:useLocalDpi xmlns:a14="http://schemas.microsoft.com/office/drawing/2010/main" val="0"/>
+                      </a:ext>
+                    </a:extLst>
+                  </a:blip>
+                  <a:stretch>
+                    <a:fillRect/>
+                  </a:stretch>
+                </pic:blipFill>
+                <pic:spPr>
+                  <a:xfrm>
+                    <a:off x="0" y="0"/>
+                    <a:ext cx="7555698" cy="10679883"/>
+                  </a:xfrm>
+                  <a:prstGeom prst="rect">
+                    <a:avLst/>
+                  </a:prstGeom>
+                </pic:spPr>
+              </pic:pic>
+            </a:graphicData>
+          </a:graphic>
+          <wp14:sizeRelH relativeFrom="margin">
+            <wp14:pctWidth>0</wp14:pctWidth>
+          </wp14:sizeRelH>
+          <wp14:sizeRelV relativeFrom="margin">
+            <wp14:pctHeight>0</wp14:pctHeight>
+          </wp14:sizeRelV>
+        </wp:anchor>
+      </w:drawing>
+    </w:r>
+  </w:p>
+</w:hdr>
+</file>
+
+<file path=word/header6.xml><?xml version="1.0" encoding="utf-8"?>
+<w:hdr xmlns:wpc="http://schemas.microsoft.com/office/word/2010/wordprocessingCanvas" xmlns:cx="http://schemas.microsoft.com/office/drawing/2014/chartex" xmlns:cx1="http://schemas.microsoft.com/office/drawing/2015/9/8/chartex" xmlns:cx2="http://schemas.microsoft.com/office/drawing/2015/10/21/chartex" xmlns:cx3="http://schemas.microsoft.com/office/drawing/2016/5/9/chartex" xmlns:cx4="http://schemas.microsoft.com/office/drawing/2016/5/10/chartex" xmlns:cx5="http://schemas.microsoft.com/office/drawing/2016/5/11/chartex" xmlns:cx6="http://schemas.microsoft.com/office/drawing/2016/5/12/chartex" xmlns:cx7="http://schemas.microsoft.com/office/drawing/2016/5/13/chartex" xmlns:cx8="http://schemas.microsoft.com/office/drawing/2016/5/14/chartex" xmlns:mc="http://schemas.openxmlformats.org/markup-compatibility/2006" xmlns:aink="http://schemas.microsoft.com/office/drawing/2016/ink" xmlns:am3d="http://schemas.microsoft.com/office/drawing/2017/model3d" xmlns:o="urn:schemas-microsoft-com:office:office" xmlns:r="http://schemas.openxmlformats.org/officeDocument/2006/relationships" xmlns:m="http://schemas.openxmlformats.org/officeDocument/2006/math" xmlns:v="urn:schemas-microsoft-com:vml" xmlns:wp14="http://schemas.microsoft.com/office/word/2010/wordprocessingDrawing" xmlns:wp="http://schemas.openxmlformats.org/drawingml/2006/wordprocessingDrawing" xmlns:w10="urn:schemas-microsoft-com:office:word" xmlns:w="http://schemas.openxmlformats.org/wordprocessingml/2006/main" xmlns:w14="http://schemas.microsoft.com/office/word/2010/wordml" xmlns:w15="http://schemas.microsoft.com/office/word/2012/wordml" xmlns:w16cex="http://schemas.microsoft.com/office/word/2018/wordml/cex" xmlns:w16cid="http://schemas.microsoft.com/office/word/2016/wordml/cid" xmlns:w16="http://schemas.microsoft.com/office/word/2018/wordml" xmlns:w16sdtdh="http://schemas.microsoft.com/office/word/2020/wordml/sdtdatahash" xmlns:w16se="http://schemas.microsoft.com/office/word/2015/wordml/symex" xmlns:wpg="http://schemas.microsoft.com/office/word/2010/wordprocessingGroup" xmlns:wpi="http://schemas.microsoft.com/office/word/2010/wordprocessingInk" xmlns:wne="http://schemas.microsoft.com/office/word/2006/wordml" xmlns:wps="http://schemas.microsoft.com/office/word/2010/wordprocessingShape" mc:Ignorable="w14 w15 w16se w16cid w16 w16cex w16sdtdh wp14">
+  <w:p>
+    <w:r>
+      <w:rPr>
+        <w:noProof/>
+        <w:lang w:val="en-US"/>
+      </w:rPr>
+      <w:drawing>
+        <wp:anchor distT="0" distB="0" distL="114300" distR="114300" simplePos="0" relativeHeight="251648000" behindDoc="1" locked="0" layoutInCell="1" allowOverlap="1" wp14:anchorId="51135229" wp14:editId="6D43C7FB">
+          <wp:simplePos x="0" y="0"/>
+          <wp:positionH relativeFrom="page">
+            <wp:posOffset>0</wp:posOffset>
+          </wp:positionH>
+          <wp:positionV relativeFrom="page">
+            <wp:posOffset>5496</wp:posOffset>
+          </wp:positionV>
+          <wp:extent cx="7555698" cy="10679883"/>
+          <wp:effectExtent l="0" t="0" r="7620" b="7620"/>
+          <wp:wrapNone/>
+          <wp:docPr id="4" name="Picture 16"/>
+          <wp:cNvGraphicFramePr>
+            <a:graphicFrameLocks xmlns:a="http://schemas.openxmlformats.org/drawingml/2006/main" noChangeAspect="1"/>
+          </wp:cNvGraphicFramePr>
+          <a:graphic xmlns:a="http://schemas.openxmlformats.org/drawingml/2006/main">
+            <a:graphicData uri="http://schemas.openxmlformats.org/drawingml/2006/picture">
+              <pic:pic xmlns:pic="http://schemas.openxmlformats.org/drawingml/2006/picture">
+                <pic:nvPicPr>
+                  <pic:cNvPr id="1" name="ginutech-letterhead.png"/>
+                  <pic:cNvPicPr/>
+                </pic:nvPicPr>
+                <pic:blipFill>
+                  <a:blip r:embed="rId1" cstate="print">
+                    <a:extLst>
+                      <a:ext uri="{28A0092B-C50C-407E-A947-70E740481C1C}">
+                        <a14:useLocalDpi xmlns:a14="http://schemas.microsoft.com/office/drawing/2010/main" val="0"/>
+                      </a:ext>
+                    </a:extLst>
+                  </a:blip>
+                  <a:stretch>
+                    <a:fillRect/>
+                  </a:stretch>
+                </pic:blipFill>
+                <pic:spPr>
+                  <a:xfrm>
+                    <a:off x="0" y="0"/>
+                    <a:ext cx="7555698" cy="10679883"/>
+                  </a:xfrm>
+                  <a:prstGeom prst="rect">
+                    <a:avLst/>
+                  </a:prstGeom>
+                </pic:spPr>
+              </pic:pic>
+            </a:graphicData>
+          </a:graphic>
+          <wp14:sizeRelH relativeFrom="margin">
+            <wp14:pctWidth>0</wp14:pctWidth>
+          </wp14:sizeRelH>
+          <wp14:sizeRelV relativeFrom="margin">
+            <wp14:pctHeight>0</wp14:pctHeight>
+          </wp14:sizeRelV>
+        </wp:anchor>
+      </w:drawing>
+    </w:r>
+  </w:p>
+</w:hdr>
+</file>
+
+<file path=word/header7.xml><?xml version="1.0" encoding="utf-8"?>
+<w:hdr xmlns:wpc="http://schemas.microsoft.com/office/word/2010/wordprocessingCanvas" xmlns:cx="http://schemas.microsoft.com/office/drawing/2014/chartex" xmlns:cx1="http://schemas.microsoft.com/office/drawing/2015/9/8/chartex" xmlns:cx2="http://schemas.microsoft.com/office/drawing/2015/10/21/chartex" xmlns:cx3="http://schemas.microsoft.com/office/drawing/2016/5/9/chartex" xmlns:cx4="http://schemas.microsoft.com/office/drawing/2016/5/10/chartex" xmlns:cx5="http://schemas.microsoft.com/office/drawing/2016/5/11/chartex" xmlns:cx6="http://schemas.microsoft.com/office/drawing/2016/5/12/chartex" xmlns:cx7="http://schemas.microsoft.com/office/drawing/2016/5/13/chartex" xmlns:cx8="http://schemas.microsoft.com/office/drawing/2016/5/14/chartex" xmlns:mc="http://schemas.openxmlformats.org/markup-compatibility/2006" xmlns:aink="http://schemas.microsoft.com/office/drawing/2016/ink" xmlns:am3d="http://schemas.microsoft.com/office/drawing/2017/model3d" xmlns:o="urn:schemas-microsoft-com:office:office" xmlns:r="http://schemas.openxmlformats.org/officeDocument/2006/relationships" xmlns:m="http://schemas.openxmlformats.org/officeDocument/2006/math" xmlns:v="urn:schemas-microsoft-com:vml" xmlns:wp14="http://schemas.microsoft.com/office/word/2010/wordprocessingDrawing" xmlns:wp="http://schemas.openxmlformats.org/drawingml/2006/wordprocessingDrawing" xmlns:w10="urn:schemas-microsoft-com:office:word" xmlns:w="http://schemas.openxmlformats.org/wordprocessingml/2006/main" xmlns:w14="http://schemas.microsoft.com/office/word/2010/wordml" xmlns:w15="http://schemas.microsoft.com/office/word/2012/wordml" xmlns:w16cex="http://schemas.microsoft.com/office/word/2018/wordml/cex" xmlns:w16cid="http://schemas.microsoft.com/office/word/2016/wordml/cid" xmlns:w16="http://schemas.microsoft.com/office/word/2018/wordml" xmlns:w16sdtdh="http://schemas.microsoft.com/office/word/2020/wordml/sdtdatahash" xmlns:w16se="http://schemas.microsoft.com/office/word/2015/wordml/symex" xmlns:wpg="http://schemas.microsoft.com/office/word/2010/wordprocessingGroup" xmlns:wpi="http://schemas.microsoft.com/office/word/2010/wordprocessingInk" xmlns:wne="http://schemas.microsoft.com/office/word/2006/wordml" xmlns:wps="http://schemas.microsoft.com/office/word/2010/wordprocessingShape" mc:Ignorable="w14 w15 w16se w16cid w16 w16cex w16sdtdh wp14">
+  <w:p>
+    <w:r>
+      <w:rPr>
+        <w:noProof/>
+        <w:lang w:val="en-US"/>
+      </w:rPr>
+      <w:drawing>
+        <wp:anchor distT="0" distB="0" distL="114300" distR="114300" simplePos="0" relativeHeight="251649024" behindDoc="1" locked="0" layoutInCell="1" allowOverlap="1" wp14:anchorId="5C5BE743" wp14:editId="4CC3D193">
+          <wp:simplePos x="0" y="0"/>
+          <wp:positionH relativeFrom="page">
+            <wp:posOffset>0</wp:posOffset>
+          </wp:positionH>
+          <wp:positionV relativeFrom="page">
+            <wp:posOffset>5496</wp:posOffset>
+          </wp:positionV>
+          <wp:extent cx="7555698" cy="10679883"/>
+          <wp:effectExtent l="0" t="0" r="7620" b="7620"/>
+          <wp:wrapNone/>
+          <wp:docPr id="8" name="Picture 16"/>
+          <wp:cNvGraphicFramePr>
+            <a:graphicFrameLocks xmlns:a="http://schemas.openxmlformats.org/drawingml/2006/main" noChangeAspect="1"/>
+          </wp:cNvGraphicFramePr>
+          <a:graphic xmlns:a="http://schemas.openxmlformats.org/drawingml/2006/main">
+            <a:graphicData uri="http://schemas.openxmlformats.org/drawingml/2006/picture">
+              <pic:pic xmlns:pic="http://schemas.openxmlformats.org/drawingml/2006/picture">
+                <pic:nvPicPr>
+                  <pic:cNvPr id="1" name="ginutech-letterhead.png"/>
+                  <pic:cNvPicPr/>
+                </pic:nvPicPr>
+                <pic:blipFill>
+                  <a:blip r:embed="rId1" cstate="print">
+                    <a:extLst>
+                      <a:ext uri="{28A0092B-C50C-407E-A947-70E740481C1C}">
+                        <a14:useLocalDpi xmlns:a14="http://schemas.microsoft.com/office/drawing/2010/main" val="0"/>
+                      </a:ext>
+                    </a:extLst>
+                  </a:blip>
+                  <a:stretch>
+                    <a:fillRect/>
+                  </a:stretch>
+                </pic:blipFill>
+                <pic:spPr>
+                  <a:xfrm>
+                    <a:off x="0" y="0"/>
+                    <a:ext cx="7555698" cy="10679883"/>
+                  </a:xfrm>
+                  <a:prstGeom prst="rect">
+                    <a:avLst/>
+                  </a:prstGeom>
+                </pic:spPr>
+              </pic:pic>
+            </a:graphicData>
+          </a:graphic>
+          <wp14:sizeRelH relativeFrom="margin">
+            <wp14:pctWidth>0</wp14:pctWidth>
+          </wp14:sizeRelH>
+          <wp14:sizeRelV relativeFrom="margin">
+            <wp14:pctHeight>0</wp14:pctHeight>
+          </wp14:sizeRelV>
+        </wp:anchor>
+      </w:drawing>
+    </w:r>
+  </w:p>
+</w:hdr>
+</file>
+
+<file path=word/header8.xml><?xml version="1.0" encoding="utf-8"?>
+<w:hdr xmlns:wpc="http://schemas.microsoft.com/office/word/2010/wordprocessingCanvas" xmlns:cx="http://schemas.microsoft.com/office/drawing/2014/chartex" xmlns:cx1="http://schemas.microsoft.com/office/drawing/2015/9/8/chartex" xmlns:cx2="http://schemas.microsoft.com/office/drawing/2015/10/21/chartex" xmlns:cx3="http://schemas.microsoft.com/office/drawing/2016/5/9/chartex" xmlns:cx4="http://schemas.microsoft.com/office/drawing/2016/5/10/chartex" xmlns:cx5="http://schemas.microsoft.com/office/drawing/2016/5/11/chartex" xmlns:cx6="http://schemas.microsoft.com/office/drawing/2016/5/12/chartex" xmlns:cx7="http://schemas.microsoft.com/office/drawing/2016/5/13/chartex" xmlns:cx8="http://schemas.microsoft.com/office/drawing/2016/5/14/chartex" xmlns:mc="http://schemas.openxmlformats.org/markup-compatibility/2006" xmlns:aink="http://schemas.microsoft.com/office/drawing/2016/ink" xmlns:am3d="http://schemas.microsoft.com/office/drawing/2017/model3d" xmlns:o="urn:schemas-microsoft-com:office:office" xmlns:r="http://schemas.openxmlformats.org/officeDocument/2006/relationships" xmlns:m="http://schemas.openxmlformats.org/officeDocument/2006/math" xmlns:v="urn:schemas-microsoft-com:vml" xmlns:wp14="http://schemas.microsoft.com/office/word/2010/wordprocessingDrawing" xmlns:wp="http://schemas.openxmlformats.org/drawingml/2006/wordprocessingDrawing" xmlns:w10="urn:schemas-microsoft-com:office:word" xmlns:w="http://schemas.openxmlformats.org/wordprocessingml/2006/main" xmlns:w14="http://schemas.microsoft.com/office/word/2010/wordml" xmlns:w15="http://schemas.microsoft.com/office/word/2012/wordml" xmlns:w16cex="http://schemas.microsoft.com/office/word/2018/wordml/cex" xmlns:w16cid="http://schemas.microsoft.com/office/word/2016/wordml/cid" xmlns:w16="http://schemas.microsoft.com/office/word/2018/wordml" xmlns:w16sdtdh="http://schemas.microsoft.com/office/word/2020/wordml/sdtdatahash" xmlns:w16se="http://schemas.microsoft.com/office/word/2015/wordml/symex" xmlns:wpg="http://schemas.microsoft.com/office/word/2010/wordprocessingGroup" xmlns:wpi="http://schemas.microsoft.com/office/word/2010/wordprocessingInk" xmlns:wne="http://schemas.microsoft.com/office/word/2006/wordml" xmlns:wps="http://schemas.microsoft.com/office/word/2010/wordprocessingShape" mc:Ignorable="w14 w15 w16se w16cid w16 w16cex w16sdtdh wp14">
+  <w:p>
+    <w:r>
+      <w:rPr>
+        <w:noProof/>
+        <w:lang w:val="en-US"/>
+      </w:rPr>
+      <w:drawing>
+        <wp:anchor distT="0" distB="0" distL="114300" distR="114300" simplePos="0" relativeHeight="251650048" behindDoc="1" locked="0" layoutInCell="1" allowOverlap="1" wp14:anchorId="0F4BE53F" wp14:editId="6DA66A7D">
+          <wp:simplePos x="0" y="0"/>
+          <wp:positionH relativeFrom="page">
+            <wp:posOffset>0</wp:posOffset>
+          </wp:positionH>
+          <wp:positionV relativeFrom="page">
+            <wp:posOffset>5496</wp:posOffset>
+          </wp:positionV>
+          <wp:extent cx="7555698" cy="10679883"/>
+          <wp:effectExtent l="0" t="0" r="7620" b="7620"/>
+          <wp:wrapNone/>
+          <wp:docPr id="6" name="Picture 16"/>
+          <wp:cNvGraphicFramePr>
+            <a:graphicFrameLocks xmlns:a="http://schemas.openxmlformats.org/drawingml/2006/main" noChangeAspect="1"/>
+          </wp:cNvGraphicFramePr>
+          <a:graphic xmlns:a="http://schemas.openxmlformats.org/drawingml/2006/main">
+            <a:graphicData uri="http://schemas.openxmlformats.org/drawingml/2006/picture">
+              <pic:pic xmlns:pic="http://schemas.openxmlformats.org/drawingml/2006/picture">
+                <pic:nvPicPr>
+                  <pic:cNvPr id="1" name="ginutech-letterhead.png"/>
+                  <pic:cNvPicPr/>
+                </pic:nvPicPr>
+                <pic:blipFill>
+                  <a:blip r:embed="rId1" cstate="print">
+                    <a:extLst>
+                      <a:ext uri="{28A0092B-C50C-407E-A947-70E740481C1C}">
+                        <a14:useLocalDpi xmlns:a14="http://schemas.microsoft.com/office/drawing/2010/main" val="0"/>
+                      </a:ext>
+                    </a:extLst>
+                  </a:blip>
+                  <a:stretch>
+                    <a:fillRect/>
+                  </a:stretch>
+                </pic:blipFill>
+                <pic:spPr>
+                  <a:xfrm>
+                    <a:off x="0" y="0"/>
+                    <a:ext cx="7555698" cy="10679883"/>
+                  </a:xfrm>
+                  <a:prstGeom prst="rect">
+                    <a:avLst/>
+                  </a:prstGeom>
+                </pic:spPr>
+              </pic:pic>
+            </a:graphicData>
+          </a:graphic>
+          <wp14:sizeRelH relativeFrom="margin">
+            <wp14:pctWidth>0</wp14:pctWidth>
+          </wp14:sizeRelH>
+          <wp14:sizeRelV relativeFrom="margin">
+            <wp14:pctHeight>0</wp14:pctHeight>
+          </wp14:sizeRelV>
+        </wp:anchor>
+      </w:drawing>
+    </w:r>
+  </w:p>
+</w:hdr>
+</file>
+
+<file path=word/header9.xml><?xml version="1.0" encoding="utf-8"?>
+<w:hdr xmlns:wpc="http://schemas.microsoft.com/office/word/2010/wordprocessingCanvas" xmlns:cx="http://schemas.microsoft.com/office/drawing/2014/chartex" xmlns:cx1="http://schemas.microsoft.com/office/drawing/2015/9/8/chartex" xmlns:cx2="http://schemas.microsoft.com/office/drawing/2015/10/21/chartex" xmlns:cx3="http://schemas.microsoft.com/office/drawing/2016/5/9/chartex" xmlns:cx4="http://schemas.microsoft.com/office/drawing/2016/5/10/chartex" xmlns:cx5="http://schemas.microsoft.com/office/drawing/2016/5/11/chartex" xmlns:cx6="http://schemas.microsoft.com/office/drawing/2016/5/12/chartex" xmlns:cx7="http://schemas.microsoft.com/office/drawing/2016/5/13/chartex" xmlns:cx8="http://schemas.microsoft.com/office/drawing/2016/5/14/chartex" xmlns:mc="http://schemas.openxmlformats.org/markup-compatibility/2006" xmlns:aink="http://schemas.microsoft.com/office/drawing/2016/ink" xmlns:am3d="http://schemas.microsoft.com/office/drawing/2017/model3d" xmlns:o="urn:schemas-microsoft-com:office:office" xmlns:r="http://schemas.openxmlformats.org/officeDocument/2006/relationships" xmlns:m="http://schemas.openxmlformats.org/officeDocument/2006/math" xmlns:v="urn:schemas-microsoft-com:vml" xmlns:wp14="http://schemas.microsoft.com/office/word/2010/wordprocessingDrawing" xmlns:wp="http://schemas.openxmlformats.org/drawingml/2006/wordprocessingDrawing" xmlns:w10="urn:schemas-microsoft-com:office:word" xmlns:w="http://schemas.openxmlformats.org/wordprocessingml/2006/main" xmlns:w14="http://schemas.microsoft.com/office/word/2010/wordml" xmlns:w15="http://schemas.microsoft.com/office/word/2012/wordml" xmlns:w16cex="http://schemas.microsoft.com/office/word/2018/wordml/cex" xmlns:w16cid="http://schemas.microsoft.com/office/word/2016/wordml/cid" xmlns:w16="http://schemas.microsoft.com/office/word/2018/wordml" xmlns:w16sdtdh="http://schemas.microsoft.com/office/word/2020/wordml/sdtdatahash" xmlns:w16se="http://schemas.microsoft.com/office/word/2015/wordml/symex" xmlns:wpg="http://schemas.microsoft.com/office/word/2010/wordprocessingGroup" xmlns:wpi="http://schemas.microsoft.com/office/word/2010/wordprocessingInk" xmlns:wne="http://schemas.microsoft.com/office/word/2006/wordml" xmlns:wps="http://schemas.microsoft.com/office/word/2010/wordprocessingShape" mc:Ignorable="w14 w15 w16se w16cid w16 w16cex w16sdtdh wp14">
+  <w:p>
+    <w:r>
+      <w:rPr>
+        <w:noProof/>
+        <w:lang w:val="en-US"/>
+      </w:rPr>
+      <w:drawing>
+        <wp:anchor distT="0" distB="0" distL="114300" distR="114300" simplePos="0" relativeHeight="251651072" behindDoc="1" locked="0" layoutInCell="1" allowOverlap="1" wp14:anchorId="24503DFD" wp14:editId="3566E110">
+          <wp:simplePos x="0" y="0"/>
+          <wp:positionH relativeFrom="page">
+            <wp:posOffset>0</wp:posOffset>
+          </wp:positionH>
+          <wp:positionV relativeFrom="page">
+            <wp:posOffset>5496</wp:posOffset>
+          </wp:positionV>
+          <wp:extent cx="7555698" cy="10679883"/>
+          <wp:effectExtent l="0" t="0" r="7620" b="7620"/>
+          <wp:wrapNone/>
+          <wp:docPr id="7" name="Picture 16"/>
+          <wp:cNvGraphicFramePr>
+            <a:graphicFrameLocks xmlns:a="http://schemas.openxmlformats.org/drawingml/2006/main" noChangeAspect="1"/>
+          </wp:cNvGraphicFramePr>
+          <a:graphic xmlns:a="http://schemas.openxmlformats.org/drawingml/2006/main">
+            <a:graphicData uri="http://schemas.openxmlformats.org/drawingml/2006/picture">
+              <pic:pic xmlns:pic="http://schemas.openxmlformats.org/drawingml/2006/picture">
+                <pic:nvPicPr>
+                  <pic:cNvPr id="1" name="ginutech-letterhead.png"/>
+                  <pic:cNvPicPr/>
+                </pic:nvPicPr>
+                <pic:blipFill>
+                  <a:blip r:embed="rId1" cstate="print">
+                    <a:extLst>
+                      <a:ext uri="{28A0092B-C50C-407E-A947-70E740481C1C}">
+                        <a14:useLocalDpi xmlns:a14="http://schemas.microsoft.com/office/drawing/2010/main" val="0"/>
+                      </a:ext>
+                    </a:extLst>
+                  </a:blip>
+                  <a:stretch>
+                    <a:fillRect/>
+                  </a:stretch>
+                </pic:blipFill>
+                <pic:spPr>
+                  <a:xfrm>
+                    <a:off x="0" y="0"/>
+                    <a:ext cx="7555698" cy="10679883"/>
+                  </a:xfrm>
+                  <a:prstGeom prst="rect">
+                    <a:avLst/>
+                  </a:prstGeom>
+                </pic:spPr>
+              </pic:pic>
+            </a:graphicData>
+          </a:graphic>
+          <wp14:sizeRelH relativeFrom="margin">
+            <wp14:pctWidth>0</wp14:pctWidth>
+          </wp14:sizeRelH>
+          <wp14:sizeRelV relativeFrom="margin">
+            <wp14:pctHeight>0</wp14:pctHeight>
+          </wp14:sizeRelV>
         </wp:anchor>
       </w:drawing>
     </w:r>
@@ -14267,6 +13432,56 @@
     <w:uiPriority w:val="1"/>
     <w:qFormat/>
   </w:style>
+  <w:style w:type="paragraph" w:styleId="Pieddepage">
+    <w:name w:val="footer"/>
+    <w:basedOn w:val="Normal"/>
+    <w:link w:val="PieddepageCar"/>
+    <w:uiPriority w:val="99"/>
+    <w:unhideWhenUsed/>
+    <w:rsid w:val="002565A3"/>
+    <w:pPr>
+      <w:tabs>
+        <w:tab w:val="center" w:pos="4536"/>
+        <w:tab w:val="right" w:pos="9072"/>
+      </w:tabs>
+    </w:pPr>
+  </w:style>
+  <w:style w:type="character" w:customStyle="1" w:styleId="PieddepageCar">
+    <w:name w:val="Pied de page Car"/>
+    <w:basedOn w:val="Policepardfaut"/>
+    <w:link w:val="Pieddepage"/>
+    <w:uiPriority w:val="99"/>
+    <w:rsid w:val="002565A3"/>
+    <w:rPr>
+      <w:rFonts w:ascii="Candara" w:eastAsia="Candara" w:hAnsi="Candara" w:cs="Candara"/>
+      <w:lang w:val="fr-FR"/>
+    </w:rPr>
+  </w:style>
+  <w:style w:type="paragraph" w:styleId="En-tte">
+    <w:name w:val="header"/>
+    <w:basedOn w:val="Normal"/>
+    <w:link w:val="En-tteCar"/>
+    <w:uiPriority w:val="99"/>
+    <w:unhideWhenUsed/>
+    <w:rsid w:val="002565A3"/>
+    <w:pPr>
+      <w:tabs>
+        <w:tab w:val="center" w:pos="4536"/>
+        <w:tab w:val="right" w:pos="9072"/>
+      </w:tabs>
+    </w:pPr>
+  </w:style>
+  <w:style w:type="character" w:customStyle="1" w:styleId="En-tteCar">
+    <w:name w:val="En-tête Car"/>
+    <w:basedOn w:val="Policepardfaut"/>
+    <w:link w:val="En-tte"/>
+    <w:uiPriority w:val="99"/>
+    <w:rsid w:val="002565A3"/>
+    <w:rPr>
+      <w:rFonts w:ascii="Candara" w:eastAsia="Candara" w:hAnsi="Candara" w:cs="Candara"/>
+      <w:lang w:val="fr-FR"/>
+    </w:rPr>
+  </w:style>
 </w:styles>
 </file>
 

</xml_diff>